<commit_message>
Anchor Petra's Day 3 compound-cluster loads to real Day 1 numbers
Roster completeness sweep found two vague load fields ("Heavy DB",
"Heavy KB or DB") on Day 3's compound-cluster block where Day 1's real
tested numbers could anchor a suggested weight, per the cues' own
framing ("close to Day 1 deadlift loads", "heaviest goblet squat of
the week"). Both replaced with real Week 1 -> Week 4 progressions.

Co-Authored-By: Claude Sonnet 5 <noreply@anthropic.com>
Claude-Session: https://claude.ai/code/session_01VTRA12TAy4P16NRVKS4SK5
</commit_message>
<xml_diff>
--- a/clients/petra/Petra_3Day_Virtual_Training_Plan.docx
+++ b/clients/petra/Petra_3Day_Virtual_Training_Plan.docx
@@ -13242,7 +13242,7 @@
                 <w:sz w:val="15"/>
                 <w:szCs w:val="15"/>
               </w:rPr>
-              <w:t xml:space="preserve">Heavy DB</w:t>
+              <w:t xml:space="preserve">Wk1: 80 lbs → Wk4: 100 lbs (per hand, total)</w:t>
             </w:r>
           </w:p>
         </w:tc>
@@ -13338,7 +13338,7 @@
                 <w:sz w:val="17"/>
                 <w:szCs w:val="17"/>
               </w:rPr>
-              <w:t xml:space="preserve">Hip hinge, one DB each side like a suitcase. Heavy — close to Day 1 deadlift loads. Then 15s rest, straight into C2.</w:t>
+              <w:t xml:space="preserve">Hip hinge, one DB each side like a suitcase. Heavy — near Day 1's Hex Bar Deadlift load. Then 15s rest, straight into C2.</w:t>
             </w:r>
           </w:p>
         </w:tc>
@@ -13700,7 +13700,7 @@
                 <w:sz w:val="15"/>
                 <w:szCs w:val="15"/>
               </w:rPr>
-              <w:t xml:space="preserve">Heavy KB or DB</w:t>
+              <w:t xml:space="preserve">Wk1: 40 lbs → Wk4: 50 lbs</w:t>
             </w:r>
           </w:p>
         </w:tc>
@@ -13796,7 +13796,7 @@
                 <w:sz w:val="17"/>
                 <w:szCs w:val="17"/>
               </w:rPr>
-              <w:t xml:space="preserve">Heaviest goblet squat of the week. Push load here. Then 15s, into D2.</w:t>
+              <w:t xml:space="preserve">Heaviest goblet squat of the week — above Day 1's working load. Push load here. Then 15s, into D2.</w:t>
             </w:r>
           </w:p>
         </w:tc>

</xml_diff>

<commit_message>
Checkpoint: batch 3 Petra restructure — docx regenerated, CLIENTS.md section added (agent finalizing)
Co-Authored-By: Claude Fable 5 <noreply@anthropic.com>
Claude-Session: https://claude.ai/code/session_01VTRA12TAy4P16NRVKS4SK5
</commit_message>
<xml_diff>
--- a/clients/petra/Petra_3Day_Virtual_Training_Plan.docx
+++ b/clients/petra/Petra_3Day_Virtual_Training_Plan.docx
@@ -1825,7 +1825,7 @@
           <w:sz w:val="17"/>
           <w:szCs w:val="17"/>
         </w:rPr>
-        <w:t xml:space="preserve">For strength and muscle building at an intermediate level, primary compound lifts run at 70–85% of working weight for 3–5 sets of 5–10 reps. Last 2 reps of every work set should be hard but achievable. Reps in Reserve (RIR): always leave 1–2 reps in the tank on sets 1–3. Final set can go closer to failure.</w:t>
+        <w:t xml:space="preserve">For strength and muscle building at an intermediate level, primary compound lifts run at 70–85% of working weight for 3–5 sets of 5–10 reps. Last 2 reps of every work set should be hard but achievable. Reps in Reserve (RIR): leave 2 clean reps in reserve on primary-lift work sets — 1 RIR is reserved for hypertrophy-focused accessory work only, and training to true failure is not required on any lift in this program.</w:t>
       </w:r>
     </w:p>
     <w:p>
@@ -2012,6 +2012,81 @@
           <w:rFonts w:ascii="Arial" w:cs="Arial" w:eastAsia="Arial" w:hAnsi="Arial"/>
           <w:b/>
           <w:bCs/>
+          <w:color w:val="1565C0"/>
+          <w:sz w:val="17"/>
+          <w:szCs w:val="17"/>
+        </w:rPr>
+        <w:t xml:space="preserve">Planned Deload — Week 5, Directly After the Week 4 Strength Check:  </w:t>
+      </w:r>
+      <w:r>
+        <w:rPr>
+          <w:rFonts w:ascii="Arial" w:cs="Arial" w:eastAsia="Arial" w:hAnsi="Arial"/>
+          <w:color w:val="2C2C2C"/>
+          <w:sz w:val="17"/>
+          <w:szCs w:val="17"/>
+        </w:rPr>
+        <w:t xml:space="preserve">This program deliberately includes one lighter week, and it is planned, not a reaction to anything going wrong. Week 5 — immediately after the Week 4 strength check — is a structured deload: the same exercises and movement patterns, with sets reduced by roughly a third, every set held comfortably in the technique band (3 or more reps in reserve), and loads held at Week 3-4 levels — the usual add-weight rules (including the deadlift's per-session jumps and the weekly carry increases) pause for this one week. This program progresses aggressively — a weekly power day plus linear load jumps — and training virtually means the coach sees less of the day-to-day fatigue picture than in the studio, so the light week is built in rather than left to chance. One light week costs nothing that matters: muscle built over the previous month is not lost in a single reduced-volume week — only a small edge of peak strength dips, and it returns within days. Weeks 6-8 then rebuild from the Week 4 loads toward the 8-week targets and the force-assessment re-test.</w:t>
+      </w:r>
+    </w:p>
+    <w:p>
+      <w:pPr>
+        <w:spacing w:after="100"/>
+      </w:pPr>
+      <w:r>
+        <w:rPr>
+          <w:rFonts w:ascii="Arial" w:cs="Arial" w:eastAsia="Arial" w:hAnsi="Arial"/>
+          <w:b/>
+          <w:bCs/>
+          <w:color w:val="C9A227"/>
+          <w:sz w:val="17"/>
+          <w:szCs w:val="17"/>
+        </w:rPr>
+        <w:t xml:space="preserve">Two Reassessment Clocks:  </w:t>
+      </w:r>
+      <w:r>
+        <w:rPr>
+          <w:rFonts w:ascii="Arial" w:cs="Arial" w:eastAsia="Arial" w:hAnsi="Arial"/>
+          <w:color w:val="2C2C2C"/>
+          <w:sz w:val="17"/>
+          <w:szCs w:val="17"/>
+        </w:rPr>
+        <w:t xml:space="preserve">Strength is re-checked every 4 weeks — the Week 4 targets in the weekly summary are that first check, and the Week 8 targets close the block. The force-assessment protocol (grip squeeze, floor pull, hip extension) is re-tested around the Week 8 window to confirm whether the left-grip/right-hip asymmetry pattern is closing — plus the early hip-extension re-test at Session 3 or 4 noted above.</w:t>
+      </w:r>
+    </w:p>
+    <w:p>
+      <w:pPr>
+        <w:spacing w:after="100"/>
+      </w:pPr>
+      <w:r>
+        <w:rPr>
+          <w:rFonts w:ascii="Arial" w:cs="Arial" w:eastAsia="Arial" w:hAnsi="Arial"/>
+          <w:b/>
+          <w:bCs/>
+          <w:color w:val="C9A227"/>
+          <w:sz w:val="17"/>
+          <w:szCs w:val="17"/>
+        </w:rPr>
+        <w:t xml:space="preserve">Session Architecture — ICONS Block Method Restructure (8/19/2026):  </w:t>
+      </w:r>
+      <w:r>
+        <w:rPr>
+          <w:rFonts w:ascii="Arial" w:cs="Arial" w:eastAsia="Arial" w:hAnsi="Arial"/>
+          <w:color w:val="2C2C2C"/>
+          <w:sz w:val="17"/>
+          <w:szCs w:val="17"/>
+        </w:rPr>
+        <w:t xml:space="preserve">Restructured to the ICONS Block Method six-slot session architecture (Corrective → Primary Compound → Accessory → Jason's Exercise → Secondary Compound → Third Compound/Integration; see CLAUDE.md). VIRTUAL client — all menus/substitutions drawn from her own equipment list only (DBs, one KB 20-35, bench, bands, med ball); no Kieser renames (no cable machine exists in her setup — the studio inventory does not apply, per CLAUDE.md's scope note). Slot 4 omitted all days — no Jason Bethea relationship on file, re-verified. Slot 1 on every day is her force-assessment corrective work PROMOTED out of warmUp prose into tracked blocks (left-hip activation, right-hand neural-delay squeeze, and the two light KB dead-hinge ramps — the ramps are loaded, rep-prescribed movements per the warm-up drift rule; the med ball chest passes deliberately stay in warmUp as implement activation primers, the band-pull-apart category). Block-internal corrective ordering deliberately keeps each hinge ramp separated from the hinge work that follows (Day 1: ramp → band walk → Hex DL; Day 3: ramp → glute bridge → KB swings) so no 3-consecutive-hinge run is created; the 8/12 KB Power fix order (2H Swing → 1A Swing → Goblet → Clean) survives verbatim. Day 1's Lateral Band Walk moved from the squat block into the corrective slot; Day 1's unilateral force-data block keeps its own position/purpose; Day 1's KB complex and Day 2's carries+core retitled as the integration closers (content unchanged). Day 3 documented deviation (Elizabeth Poyner Saturday precedent): power block runs first as the day's primary expression; the Compound Strength Clusters — literally hinge-to-press and squat-to-press complexes — serve the secondary-compound and integration functions together, AMRAP finisher after. RIR alignment to the corrected model: "1-2 RIR / final set closer to failure" language updated to the 2-RIR primary default (loads/sets/reps untouched); milestones4wk's "(1-2 RIR)" aligned to "(2 RIR)". Deload: proactive Week 5 (aggressive 8+-week continuous progression + virtual monitoring limits). No Styku clock exists for this client — reassessment cadence stated on her actual data sources (4-week strength, ~8-week force-assessment re-test), nothing invented.</w:t>
+      </w:r>
+    </w:p>
+    <w:p>
+      <w:pPr>
+        <w:spacing w:after="100"/>
+      </w:pPr>
+      <w:r>
+        <w:rPr>
+          <w:rFonts w:ascii="Arial" w:cs="Arial" w:eastAsia="Arial" w:hAnsi="Arial"/>
+          <w:b/>
+          <w:bCs/>
           <w:color w:val="E65100"/>
           <w:sz w:val="17"/>
           <w:szCs w:val="17"/>
@@ -2225,8 +2300,1250 @@
           <w:sz w:val="17"/>
           <w:szCs w:val="17"/>
         </w:rPr>
-        <w:t xml:space="preserve">3 min treadmill incline walk (5–8% grade, posterior chain + hip flexor activation before loading). Then: LEFT HIP ACTIVATION: single-leg glute bridge LEFT side 2×12 + clamshell LEFT side 2×15. Bilateral glute bridge 2×10, KB deadhinge 2×10 light, leg swings 10 each, hip circles, deep squat hold 3×30s, ankle circles 10 each. Camera side-on.</w:t>
+        <w:t xml:space="preserve">3 min treadmill incline walk (5–8% grade, posterior chain + hip flexor activation before loading). Then: bilateral glute bridge 2×10, leg swings 10 each, hip circles, deep squat hold 3×30s, ankle circles 10 each. Camera side-on. Left-hip activation and the light hinge ramp open Block A below.</w:t>
       </w:r>
+    </w:p>
+    <w:p>
+      <w:pPr>
+        <w:spacing w:after="60" w:before="120"/>
+      </w:pPr>
+      <w:r>
+        <w:rPr>
+          <w:rFonts w:ascii="Arial" w:cs="Arial" w:eastAsia="Arial" w:hAnsi="Arial"/>
+          <w:b/>
+          <w:bCs/>
+          <w:color w:val="E53935"/>
+          <w:sz w:val="17"/>
+          <w:szCs w:val="17"/>
+        </w:rPr>
+        <w:t xml:space="preserve">A — CORRECTIVE — LEFT-HIP ACTIVATION &amp; HINGE PRIMING</w:t>
+      </w:r>
+    </w:p>
+    <w:p>
+      <w:pPr>
+        <w:spacing w:after="80"/>
+      </w:pPr>
+      <w:r>
+        <w:rPr>
+          <w:rFonts w:ascii="Arial" w:cs="Arial" w:eastAsia="Arial" w:hAnsi="Arial"/>
+          <w:b/>
+          <w:bCs/>
+          <w:color w:val="E53935"/>
+          <w:sz w:val="17"/>
+          <w:szCs w:val="17"/>
+        </w:rPr>
+        <w:t xml:space="preserve">Why:  </w:t>
+      </w:r>
+      <w:r>
+        <w:rPr>
+          <w:rFonts w:ascii="Arial" w:cs="Arial" w:eastAsia="Arial" w:hAnsi="Arial"/>
+          <w:color w:val="2C2C2C"/>
+          <w:sz w:val="17"/>
+          <w:szCs w:val="17"/>
+        </w:rPr>
+        <w:t xml:space="preserve">The force assessment shows the right hip dominating extension — the left glute is the priority side, so it gets woken up deliberately before anything is loaded. The light hinge ramp rehearses the deadlift pattern without spending strength, and the band walk fires the glute med that keeps knees tracking under load.</w:t>
+      </w:r>
+    </w:p>
+    <w:tbl>
+      <w:tblPr>
+        <w:tblW w:type="dxa" w:w="10440"/>
+        <w:tblBorders>
+          <w:top w:val="none" w:color="FFFFFF" w:sz="0"/>
+          <w:left w:val="none" w:color="FFFFFF" w:sz="0"/>
+          <w:bottom w:val="none" w:color="FFFFFF" w:sz="0"/>
+          <w:right w:val="none" w:color="FFFFFF" w:sz="0"/>
+          <w:insideH w:val="single" w:color="auto" w:sz="4"/>
+          <w:insideV w:val="single" w:color="auto" w:sz="4"/>
+        </w:tblBorders>
+      </w:tblPr>
+      <w:tblGrid>
+        <w:gridCol w:w="2400"/>
+        <w:gridCol w:w="380"/>
+        <w:gridCol w:w="420"/>
+        <w:gridCol w:w="680"/>
+        <w:gridCol w:w="540"/>
+        <w:gridCol w:w="440"/>
+        <w:gridCol w:w="5580"/>
+      </w:tblGrid>
+      <w:tr>
+        <w:tc>
+          <w:tcPr>
+            <w:tcW w:type="dxa" w:w="2400"/>
+            <w:tcBorders>
+              <w:top w:val="none" w:color="FFFFFF" w:sz="0"/>
+              <w:left w:val="none" w:color="FFFFFF" w:sz="0"/>
+              <w:bottom w:val="none" w:color="FFFFFF" w:sz="0"/>
+              <w:right w:val="none" w:color="FFFFFF" w:sz="0"/>
+            </w:tcBorders>
+            <w:shd w:fill="FFEBEE" w:color="auto" w:val="clear"/>
+            <w:tcMar>
+              <w:top w:type="dxa" w:w="40"/>
+              <w:left w:type="dxa" w:w="80"/>
+              <w:bottom w:type="dxa" w:w="40"/>
+              <w:right w:type="dxa" w:w="80"/>
+            </w:tcMar>
+            <w:vAlign w:val="center"/>
+          </w:tcPr>
+          <w:p>
+            <w:pPr>
+              <w:jc w:val="left"/>
+            </w:pPr>
+            <w:r>
+              <w:rPr>
+                <w:rFonts w:ascii="Arial" w:cs="Arial" w:eastAsia="Arial" w:hAnsi="Arial"/>
+                <w:b/>
+                <w:bCs/>
+                <w:color w:val="E53935"/>
+                <w:sz w:val="15"/>
+                <w:szCs w:val="15"/>
+              </w:rPr>
+              <w:t xml:space="preserve">EXERCISE</w:t>
+            </w:r>
+          </w:p>
+        </w:tc>
+        <w:tc>
+          <w:tcPr>
+            <w:tcW w:type="dxa" w:w="380"/>
+            <w:tcBorders>
+              <w:top w:val="none" w:color="FFFFFF" w:sz="0"/>
+              <w:left w:val="none" w:color="FFFFFF" w:sz="0"/>
+              <w:bottom w:val="none" w:color="FFFFFF" w:sz="0"/>
+              <w:right w:val="none" w:color="FFFFFF" w:sz="0"/>
+            </w:tcBorders>
+            <w:shd w:fill="FFEBEE" w:color="auto" w:val="clear"/>
+            <w:tcMar>
+              <w:top w:type="dxa" w:w="40"/>
+              <w:left w:type="dxa" w:w="80"/>
+              <w:bottom w:type="dxa" w:w="40"/>
+              <w:right w:type="dxa" w:w="80"/>
+            </w:tcMar>
+            <w:vAlign w:val="center"/>
+          </w:tcPr>
+          <w:p>
+            <w:pPr>
+              <w:jc w:val="center"/>
+            </w:pPr>
+            <w:r>
+              <w:rPr>
+                <w:rFonts w:ascii="Arial" w:cs="Arial" w:eastAsia="Arial" w:hAnsi="Arial"/>
+                <w:b/>
+                <w:bCs/>
+                <w:color w:val="E53935"/>
+                <w:sz w:val="13"/>
+                <w:szCs w:val="13"/>
+              </w:rPr>
+              <w:t xml:space="preserve">SETS</w:t>
+            </w:r>
+          </w:p>
+        </w:tc>
+        <w:tc>
+          <w:tcPr>
+            <w:tcW w:type="dxa" w:w="420"/>
+            <w:tcBorders>
+              <w:top w:val="none" w:color="FFFFFF" w:sz="0"/>
+              <w:left w:val="none" w:color="FFFFFF" w:sz="0"/>
+              <w:bottom w:val="none" w:color="FFFFFF" w:sz="0"/>
+              <w:right w:val="none" w:color="FFFFFF" w:sz="0"/>
+            </w:tcBorders>
+            <w:shd w:fill="FFEBEE" w:color="auto" w:val="clear"/>
+            <w:tcMar>
+              <w:top w:type="dxa" w:w="40"/>
+              <w:left w:type="dxa" w:w="80"/>
+              <w:bottom w:type="dxa" w:w="40"/>
+              <w:right w:type="dxa" w:w="80"/>
+            </w:tcMar>
+            <w:vAlign w:val="center"/>
+          </w:tcPr>
+          <w:p>
+            <w:pPr>
+              <w:jc w:val="center"/>
+            </w:pPr>
+            <w:r>
+              <w:rPr>
+                <w:rFonts w:ascii="Arial" w:cs="Arial" w:eastAsia="Arial" w:hAnsi="Arial"/>
+                <w:b/>
+                <w:bCs/>
+                <w:color w:val="E53935"/>
+                <w:sz w:val="13"/>
+                <w:szCs w:val="13"/>
+              </w:rPr>
+              <w:t xml:space="preserve">REPS</w:t>
+            </w:r>
+          </w:p>
+        </w:tc>
+        <w:tc>
+          <w:tcPr>
+            <w:tcW w:type="dxa" w:w="680"/>
+            <w:tcBorders>
+              <w:top w:val="none" w:color="FFFFFF" w:sz="0"/>
+              <w:left w:val="none" w:color="FFFFFF" w:sz="0"/>
+              <w:bottom w:val="none" w:color="FFFFFF" w:sz="0"/>
+              <w:right w:val="none" w:color="FFFFFF" w:sz="0"/>
+            </w:tcBorders>
+            <w:shd w:fill="FFEBEE" w:color="auto" w:val="clear"/>
+            <w:tcMar>
+              <w:top w:type="dxa" w:w="40"/>
+              <w:left w:type="dxa" w:w="80"/>
+              <w:bottom w:type="dxa" w:w="40"/>
+              <w:right w:type="dxa" w:w="80"/>
+            </w:tcMar>
+            <w:vAlign w:val="center"/>
+          </w:tcPr>
+          <w:p>
+            <w:pPr>
+              <w:jc w:val="center"/>
+            </w:pPr>
+            <w:r>
+              <w:rPr>
+                <w:rFonts w:ascii="Arial" w:cs="Arial" w:eastAsia="Arial" w:hAnsi="Arial"/>
+                <w:b/>
+                <w:bCs/>
+                <w:color w:val="E53935"/>
+                <w:sz w:val="13"/>
+                <w:szCs w:val="13"/>
+              </w:rPr>
+              <w:t xml:space="preserve">LOAD</w:t>
+            </w:r>
+          </w:p>
+        </w:tc>
+        <w:tc>
+          <w:tcPr>
+            <w:tcW w:type="dxa" w:w="540"/>
+            <w:tcBorders>
+              <w:top w:val="none" w:color="FFFFFF" w:sz="0"/>
+              <w:left w:val="none" w:color="FFFFFF" w:sz="0"/>
+              <w:bottom w:val="none" w:color="FFFFFF" w:sz="0"/>
+              <w:right w:val="none" w:color="FFFFFF" w:sz="0"/>
+            </w:tcBorders>
+            <w:shd w:fill="FFEBEE" w:color="auto" w:val="clear"/>
+            <w:tcMar>
+              <w:top w:type="dxa" w:w="40"/>
+              <w:left w:type="dxa" w:w="80"/>
+              <w:bottom w:type="dxa" w:w="40"/>
+              <w:right w:type="dxa" w:w="80"/>
+            </w:tcMar>
+            <w:vAlign w:val="center"/>
+          </w:tcPr>
+          <w:p>
+            <w:pPr>
+              <w:jc w:val="center"/>
+            </w:pPr>
+            <w:r>
+              <w:rPr>
+                <w:rFonts w:ascii="Arial" w:cs="Arial" w:eastAsia="Arial" w:hAnsi="Arial"/>
+                <w:b/>
+                <w:bCs/>
+                <w:color w:val="E53935"/>
+                <w:sz w:val="13"/>
+                <w:szCs w:val="13"/>
+              </w:rPr>
+              <w:t xml:space="preserve">TEMPO</w:t>
+            </w:r>
+          </w:p>
+        </w:tc>
+        <w:tc>
+          <w:tcPr>
+            <w:tcW w:type="dxa" w:w="440"/>
+            <w:tcBorders>
+              <w:top w:val="none" w:color="FFFFFF" w:sz="0"/>
+              <w:left w:val="none" w:color="FFFFFF" w:sz="0"/>
+              <w:bottom w:val="none" w:color="FFFFFF" w:sz="0"/>
+              <w:right w:val="none" w:color="FFFFFF" w:sz="0"/>
+            </w:tcBorders>
+            <w:shd w:fill="FFEBEE" w:color="auto" w:val="clear"/>
+            <w:tcMar>
+              <w:top w:type="dxa" w:w="40"/>
+              <w:left w:type="dxa" w:w="80"/>
+              <w:bottom w:type="dxa" w:w="40"/>
+              <w:right w:type="dxa" w:w="80"/>
+            </w:tcMar>
+            <w:vAlign w:val="center"/>
+          </w:tcPr>
+          <w:p>
+            <w:pPr>
+              <w:jc w:val="center"/>
+            </w:pPr>
+            <w:r>
+              <w:rPr>
+                <w:rFonts w:ascii="Arial" w:cs="Arial" w:eastAsia="Arial" w:hAnsi="Arial"/>
+                <w:b/>
+                <w:bCs/>
+                <w:color w:val="E53935"/>
+                <w:sz w:val="13"/>
+                <w:szCs w:val="13"/>
+              </w:rPr>
+              <w:t xml:space="preserve">REST</w:t>
+            </w:r>
+          </w:p>
+        </w:tc>
+        <w:tc>
+          <w:tcPr>
+            <w:tcW w:type="dxa" w:w="5580"/>
+            <w:tcBorders>
+              <w:top w:val="none" w:color="FFFFFF" w:sz="0"/>
+              <w:left w:val="none" w:color="FFFFFF" w:sz="0"/>
+              <w:bottom w:val="none" w:color="FFFFFF" w:sz="0"/>
+              <w:right w:val="none" w:color="FFFFFF" w:sz="0"/>
+            </w:tcBorders>
+            <w:shd w:fill="FFEBEE" w:color="auto" w:val="clear"/>
+            <w:tcMar>
+              <w:top w:type="dxa" w:w="40"/>
+              <w:left w:type="dxa" w:w="80"/>
+              <w:bottom w:type="dxa" w:w="40"/>
+              <w:right w:type="dxa" w:w="80"/>
+            </w:tcMar>
+            <w:vAlign w:val="center"/>
+          </w:tcPr>
+          <w:p>
+            <w:pPr>
+              <w:jc w:val="left"/>
+            </w:pPr>
+            <w:r>
+              <w:rPr>
+                <w:rFonts w:ascii="Arial" w:cs="Arial" w:eastAsia="Arial" w:hAnsi="Arial"/>
+                <w:b/>
+                <w:bCs/>
+                <w:color w:val="E53935"/>
+                <w:sz w:val="15"/>
+                <w:szCs w:val="15"/>
+              </w:rPr>
+              <w:t xml:space="preserve">COACHING CUE</w:t>
+            </w:r>
+          </w:p>
+        </w:tc>
+      </w:tr>
+      <w:tr>
+        <w:tc>
+          <w:tcPr>
+            <w:tcW w:type="dxa" w:w="2400"/>
+            <w:tcBorders>
+              <w:top w:val="none" w:color="FFFFFF" w:sz="0"/>
+              <w:left w:val="none" w:color="FFFFFF" w:sz="0"/>
+              <w:bottom w:val="none" w:color="FFFFFF" w:sz="0"/>
+              <w:right w:val="none" w:color="FFFFFF" w:sz="0"/>
+            </w:tcBorders>
+            <w:shd w:fill="FFF5F5" w:color="auto" w:val="clear"/>
+            <w:tcMar>
+              <w:top w:type="dxa" w:w="40"/>
+              <w:left w:type="dxa" w:w="80"/>
+              <w:bottom w:type="dxa" w:w="40"/>
+              <w:right w:type="dxa" w:w="80"/>
+            </w:tcMar>
+            <w:vAlign w:val="center"/>
+          </w:tcPr>
+          <w:p>
+            <w:r>
+              <w:rPr>
+                <w:rFonts w:ascii="Arial" w:cs="Arial" w:eastAsia="Arial" w:hAnsi="Arial"/>
+                <w:b/>
+                <w:bCs/>
+                <w:color w:val="2C2C2C"/>
+                <w:sz w:val="18"/>
+                <w:szCs w:val="18"/>
+              </w:rPr>
+              <w:t xml:space="preserve">Single-Leg Glute Bridge (Left Side)</w:t>
+            </w:r>
+          </w:p>
+        </w:tc>
+        <w:tc>
+          <w:tcPr>
+            <w:tcW w:type="dxa" w:w="380"/>
+            <w:tcBorders>
+              <w:top w:val="none" w:color="FFFFFF" w:sz="0"/>
+              <w:left w:val="none" w:color="FFFFFF" w:sz="0"/>
+              <w:bottom w:val="none" w:color="FFFFFF" w:sz="0"/>
+              <w:right w:val="none" w:color="FFFFFF" w:sz="0"/>
+            </w:tcBorders>
+            <w:shd w:fill="FFF5F5" w:color="auto" w:val="clear"/>
+            <w:tcMar>
+              <w:top w:type="dxa" w:w="40"/>
+              <w:left w:type="dxa" w:w="80"/>
+              <w:bottom w:type="dxa" w:w="40"/>
+              <w:right w:type="dxa" w:w="80"/>
+            </w:tcMar>
+            <w:vAlign w:val="center"/>
+          </w:tcPr>
+          <w:p>
+            <w:pPr>
+              <w:jc w:val="center"/>
+            </w:pPr>
+            <w:r>
+              <w:rPr>
+                <w:rFonts w:ascii="Arial" w:cs="Arial" w:eastAsia="Arial" w:hAnsi="Arial"/>
+                <w:color w:val="6B6B6B"/>
+                <w:sz w:val="15"/>
+                <w:szCs w:val="15"/>
+              </w:rPr>
+              <w:t xml:space="preserve">2</w:t>
+            </w:r>
+          </w:p>
+        </w:tc>
+        <w:tc>
+          <w:tcPr>
+            <w:tcW w:type="dxa" w:w="420"/>
+            <w:tcBorders>
+              <w:top w:val="none" w:color="FFFFFF" w:sz="0"/>
+              <w:left w:val="none" w:color="FFFFFF" w:sz="0"/>
+              <w:bottom w:val="none" w:color="FFFFFF" w:sz="0"/>
+              <w:right w:val="none" w:color="FFFFFF" w:sz="0"/>
+            </w:tcBorders>
+            <w:shd w:fill="FFF5F5" w:color="auto" w:val="clear"/>
+            <w:tcMar>
+              <w:top w:type="dxa" w:w="40"/>
+              <w:left w:type="dxa" w:w="80"/>
+              <w:bottom w:type="dxa" w:w="40"/>
+              <w:right w:type="dxa" w:w="80"/>
+            </w:tcMar>
+            <w:vAlign w:val="center"/>
+          </w:tcPr>
+          <w:p>
+            <w:pPr>
+              <w:jc w:val="center"/>
+            </w:pPr>
+            <w:r>
+              <w:rPr>
+                <w:rFonts w:ascii="Arial" w:cs="Arial" w:eastAsia="Arial" w:hAnsi="Arial"/>
+                <w:color w:val="6B6B6B"/>
+                <w:sz w:val="15"/>
+                <w:szCs w:val="15"/>
+              </w:rPr>
+              <w:t xml:space="preserve">12</w:t>
+            </w:r>
+          </w:p>
+        </w:tc>
+        <w:tc>
+          <w:tcPr>
+            <w:tcW w:type="dxa" w:w="680"/>
+            <w:tcBorders>
+              <w:top w:val="none" w:color="FFFFFF" w:sz="0"/>
+              <w:left w:val="none" w:color="FFFFFF" w:sz="0"/>
+              <w:bottom w:val="none" w:color="FFFFFF" w:sz="0"/>
+              <w:right w:val="none" w:color="FFFFFF" w:sz="0"/>
+            </w:tcBorders>
+            <w:shd w:fill="FFF5F5" w:color="auto" w:val="clear"/>
+            <w:tcMar>
+              <w:top w:type="dxa" w:w="40"/>
+              <w:left w:type="dxa" w:w="80"/>
+              <w:bottom w:type="dxa" w:w="40"/>
+              <w:right w:type="dxa" w:w="80"/>
+            </w:tcMar>
+            <w:vAlign w:val="center"/>
+          </w:tcPr>
+          <w:p>
+            <w:pPr>
+              <w:jc w:val="center"/>
+            </w:pPr>
+            <w:r>
+              <w:rPr>
+                <w:rFonts w:ascii="Arial" w:cs="Arial" w:eastAsia="Arial" w:hAnsi="Arial"/>
+                <w:color w:val="6B6B6B"/>
+                <w:sz w:val="15"/>
+                <w:szCs w:val="15"/>
+              </w:rPr>
+              <w:t xml:space="preserve">Bodyweight</w:t>
+            </w:r>
+          </w:p>
+        </w:tc>
+        <w:tc>
+          <w:tcPr>
+            <w:tcW w:type="dxa" w:w="540"/>
+            <w:tcBorders>
+              <w:top w:val="none" w:color="FFFFFF" w:sz="0"/>
+              <w:left w:val="none" w:color="FFFFFF" w:sz="0"/>
+              <w:bottom w:val="none" w:color="FFFFFF" w:sz="0"/>
+              <w:right w:val="none" w:color="FFFFFF" w:sz="0"/>
+            </w:tcBorders>
+            <w:shd w:fill="FFF5F5" w:color="auto" w:val="clear"/>
+            <w:tcMar>
+              <w:top w:type="dxa" w:w="40"/>
+              <w:left w:type="dxa" w:w="80"/>
+              <w:bottom w:type="dxa" w:w="40"/>
+              <w:right w:type="dxa" w:w="80"/>
+            </w:tcMar>
+            <w:vAlign w:val="center"/>
+          </w:tcPr>
+          <w:p>
+            <w:pPr>
+              <w:jc w:val="center"/>
+            </w:pPr>
+            <w:r>
+              <w:rPr>
+                <w:rFonts w:ascii="Arial" w:cs="Arial" w:eastAsia="Arial" w:hAnsi="Arial"/>
+                <w:color w:val="6B6B6B"/>
+                <w:sz w:val="15"/>
+                <w:szCs w:val="15"/>
+              </w:rPr>
+              <w:t xml:space="preserve">2-1-1</w:t>
+            </w:r>
+          </w:p>
+        </w:tc>
+        <w:tc>
+          <w:tcPr>
+            <w:tcW w:type="dxa" w:w="440"/>
+            <w:tcBorders>
+              <w:top w:val="none" w:color="FFFFFF" w:sz="0"/>
+              <w:left w:val="none" w:color="FFFFFF" w:sz="0"/>
+              <w:bottom w:val="none" w:color="FFFFFF" w:sz="0"/>
+              <w:right w:val="none" w:color="FFFFFF" w:sz="0"/>
+            </w:tcBorders>
+            <w:shd w:fill="FFF5F5" w:color="auto" w:val="clear"/>
+            <w:tcMar>
+              <w:top w:type="dxa" w:w="40"/>
+              <w:left w:type="dxa" w:w="80"/>
+              <w:bottom w:type="dxa" w:w="40"/>
+              <w:right w:type="dxa" w:w="80"/>
+            </w:tcMar>
+            <w:vAlign w:val="center"/>
+          </w:tcPr>
+          <w:p>
+            <w:pPr>
+              <w:jc w:val="center"/>
+            </w:pPr>
+            <w:r>
+              <w:rPr>
+                <w:rFonts w:ascii="Arial" w:cs="Arial" w:eastAsia="Arial" w:hAnsi="Arial"/>
+                <w:color w:val="6B6B6B"/>
+                <w:sz w:val="15"/>
+                <w:szCs w:val="15"/>
+              </w:rPr>
+              <w:t xml:space="preserve">30s</w:t>
+            </w:r>
+          </w:p>
+        </w:tc>
+        <w:tc>
+          <w:tcPr>
+            <w:tcW w:type="dxa" w:w="5580"/>
+            <w:tcBorders>
+              <w:top w:val="none" w:color="FFFFFF" w:sz="0"/>
+              <w:left w:val="none" w:color="FFFFFF" w:sz="0"/>
+              <w:bottom w:val="none" w:color="FFFFFF" w:sz="0"/>
+              <w:right w:val="none" w:color="FFFFFF" w:sz="0"/>
+            </w:tcBorders>
+            <w:shd w:fill="FFF5F5" w:color="auto" w:val="clear"/>
+            <w:tcMar>
+              <w:top w:type="dxa" w:w="40"/>
+              <w:left w:type="dxa" w:w="80"/>
+              <w:bottom w:type="dxa" w:w="40"/>
+              <w:right w:type="dxa" w:w="80"/>
+            </w:tcMar>
+            <w:vAlign w:val="center"/>
+          </w:tcPr>
+          <w:p>
+            <w:r>
+              <w:rPr>
+                <w:rFonts w:ascii="Arial" w:cs="Arial" w:eastAsia="Arial" w:hAnsi="Arial"/>
+                <w:color w:val="6B6B6B"/>
+                <w:sz w:val="17"/>
+                <w:szCs w:val="17"/>
+              </w:rPr>
+              <w:t xml:space="preserve">Left glute drives, hips level — the priority side per the force assessment.</w:t>
+            </w:r>
+          </w:p>
+        </w:tc>
+      </w:tr>
+      <w:tr>
+        <w:tc>
+          <w:tcPr>
+            <w:tcW w:type="dxa" w:w="2400"/>
+            <w:tcBorders>
+              <w:top w:val="none" w:color="FFFFFF" w:sz="0"/>
+              <w:left w:val="none" w:color="FFFFFF" w:sz="0"/>
+              <w:bottom w:val="none" w:color="FFFFFF" w:sz="0"/>
+              <w:right w:val="none" w:color="FFFFFF" w:sz="0"/>
+            </w:tcBorders>
+            <w:shd w:fill="FFFFFF" w:color="auto" w:val="clear"/>
+            <w:tcMar>
+              <w:top w:type="dxa" w:w="40"/>
+              <w:left w:type="dxa" w:w="80"/>
+              <w:bottom w:type="dxa" w:w="40"/>
+              <w:right w:type="dxa" w:w="80"/>
+            </w:tcMar>
+            <w:vAlign w:val="center"/>
+          </w:tcPr>
+          <w:p>
+            <w:r>
+              <w:rPr>
+                <w:rFonts w:ascii="Arial" w:cs="Arial" w:eastAsia="Arial" w:hAnsi="Arial"/>
+                <w:b/>
+                <w:bCs/>
+                <w:color w:val="2C2C2C"/>
+                <w:sz w:val="18"/>
+                <w:szCs w:val="18"/>
+              </w:rPr>
+              <w:t xml:space="preserve">Clamshell (Left Side)</w:t>
+            </w:r>
+          </w:p>
+        </w:tc>
+        <w:tc>
+          <w:tcPr>
+            <w:tcW w:type="dxa" w:w="380"/>
+            <w:tcBorders>
+              <w:top w:val="none" w:color="FFFFFF" w:sz="0"/>
+              <w:left w:val="none" w:color="FFFFFF" w:sz="0"/>
+              <w:bottom w:val="none" w:color="FFFFFF" w:sz="0"/>
+              <w:right w:val="none" w:color="FFFFFF" w:sz="0"/>
+            </w:tcBorders>
+            <w:shd w:fill="FFFFFF" w:color="auto" w:val="clear"/>
+            <w:tcMar>
+              <w:top w:type="dxa" w:w="40"/>
+              <w:left w:type="dxa" w:w="80"/>
+              <w:bottom w:type="dxa" w:w="40"/>
+              <w:right w:type="dxa" w:w="80"/>
+            </w:tcMar>
+            <w:vAlign w:val="center"/>
+          </w:tcPr>
+          <w:p>
+            <w:pPr>
+              <w:jc w:val="center"/>
+            </w:pPr>
+            <w:r>
+              <w:rPr>
+                <w:rFonts w:ascii="Arial" w:cs="Arial" w:eastAsia="Arial" w:hAnsi="Arial"/>
+                <w:color w:val="6B6B6B"/>
+                <w:sz w:val="15"/>
+                <w:szCs w:val="15"/>
+              </w:rPr>
+              <w:t xml:space="preserve">2</w:t>
+            </w:r>
+          </w:p>
+        </w:tc>
+        <w:tc>
+          <w:tcPr>
+            <w:tcW w:type="dxa" w:w="420"/>
+            <w:tcBorders>
+              <w:top w:val="none" w:color="FFFFFF" w:sz="0"/>
+              <w:left w:val="none" w:color="FFFFFF" w:sz="0"/>
+              <w:bottom w:val="none" w:color="FFFFFF" w:sz="0"/>
+              <w:right w:val="none" w:color="FFFFFF" w:sz="0"/>
+            </w:tcBorders>
+            <w:shd w:fill="FFFFFF" w:color="auto" w:val="clear"/>
+            <w:tcMar>
+              <w:top w:type="dxa" w:w="40"/>
+              <w:left w:type="dxa" w:w="80"/>
+              <w:bottom w:type="dxa" w:w="40"/>
+              <w:right w:type="dxa" w:w="80"/>
+            </w:tcMar>
+            <w:vAlign w:val="center"/>
+          </w:tcPr>
+          <w:p>
+            <w:pPr>
+              <w:jc w:val="center"/>
+            </w:pPr>
+            <w:r>
+              <w:rPr>
+                <w:rFonts w:ascii="Arial" w:cs="Arial" w:eastAsia="Arial" w:hAnsi="Arial"/>
+                <w:color w:val="6B6B6B"/>
+                <w:sz w:val="15"/>
+                <w:szCs w:val="15"/>
+              </w:rPr>
+              <w:t xml:space="preserve">15</w:t>
+            </w:r>
+          </w:p>
+        </w:tc>
+        <w:tc>
+          <w:tcPr>
+            <w:tcW w:type="dxa" w:w="680"/>
+            <w:tcBorders>
+              <w:top w:val="none" w:color="FFFFFF" w:sz="0"/>
+              <w:left w:val="none" w:color="FFFFFF" w:sz="0"/>
+              <w:bottom w:val="none" w:color="FFFFFF" w:sz="0"/>
+              <w:right w:val="none" w:color="FFFFFF" w:sz="0"/>
+            </w:tcBorders>
+            <w:shd w:fill="FFFFFF" w:color="auto" w:val="clear"/>
+            <w:tcMar>
+              <w:top w:type="dxa" w:w="40"/>
+              <w:left w:type="dxa" w:w="80"/>
+              <w:bottom w:type="dxa" w:w="40"/>
+              <w:right w:type="dxa" w:w="80"/>
+            </w:tcMar>
+            <w:vAlign w:val="center"/>
+          </w:tcPr>
+          <w:p>
+            <w:pPr>
+              <w:jc w:val="center"/>
+            </w:pPr>
+            <w:r>
+              <w:rPr>
+                <w:rFonts w:ascii="Arial" w:cs="Arial" w:eastAsia="Arial" w:hAnsi="Arial"/>
+                <w:color w:val="6B6B6B"/>
+                <w:sz w:val="15"/>
+                <w:szCs w:val="15"/>
+              </w:rPr>
+              <w:t xml:space="preserve">Bodyweight or light band</w:t>
+            </w:r>
+          </w:p>
+        </w:tc>
+        <w:tc>
+          <w:tcPr>
+            <w:tcW w:type="dxa" w:w="540"/>
+            <w:tcBorders>
+              <w:top w:val="none" w:color="FFFFFF" w:sz="0"/>
+              <w:left w:val="none" w:color="FFFFFF" w:sz="0"/>
+              <w:bottom w:val="none" w:color="FFFFFF" w:sz="0"/>
+              <w:right w:val="none" w:color="FFFFFF" w:sz="0"/>
+            </w:tcBorders>
+            <w:shd w:fill="FFFFFF" w:color="auto" w:val="clear"/>
+            <w:tcMar>
+              <w:top w:type="dxa" w:w="40"/>
+              <w:left w:type="dxa" w:w="80"/>
+              <w:bottom w:type="dxa" w:w="40"/>
+              <w:right w:type="dxa" w:w="80"/>
+            </w:tcMar>
+            <w:vAlign w:val="center"/>
+          </w:tcPr>
+          <w:p>
+            <w:pPr>
+              <w:jc w:val="center"/>
+            </w:pPr>
+            <w:r>
+              <w:rPr>
+                <w:rFonts w:ascii="Arial" w:cs="Arial" w:eastAsia="Arial" w:hAnsi="Arial"/>
+                <w:color w:val="6B6B6B"/>
+                <w:sz w:val="15"/>
+                <w:szCs w:val="15"/>
+              </w:rPr>
+              <w:t xml:space="preserve">2-1-1</w:t>
+            </w:r>
+          </w:p>
+        </w:tc>
+        <w:tc>
+          <w:tcPr>
+            <w:tcW w:type="dxa" w:w="440"/>
+            <w:tcBorders>
+              <w:top w:val="none" w:color="FFFFFF" w:sz="0"/>
+              <w:left w:val="none" w:color="FFFFFF" w:sz="0"/>
+              <w:bottom w:val="none" w:color="FFFFFF" w:sz="0"/>
+              <w:right w:val="none" w:color="FFFFFF" w:sz="0"/>
+            </w:tcBorders>
+            <w:shd w:fill="FFFFFF" w:color="auto" w:val="clear"/>
+            <w:tcMar>
+              <w:top w:type="dxa" w:w="40"/>
+              <w:left w:type="dxa" w:w="80"/>
+              <w:bottom w:type="dxa" w:w="40"/>
+              <w:right w:type="dxa" w:w="80"/>
+            </w:tcMar>
+            <w:vAlign w:val="center"/>
+          </w:tcPr>
+          <w:p>
+            <w:pPr>
+              <w:jc w:val="center"/>
+            </w:pPr>
+            <w:r>
+              <w:rPr>
+                <w:rFonts w:ascii="Arial" w:cs="Arial" w:eastAsia="Arial" w:hAnsi="Arial"/>
+                <w:color w:val="6B6B6B"/>
+                <w:sz w:val="15"/>
+                <w:szCs w:val="15"/>
+              </w:rPr>
+              <w:t xml:space="preserve">30s</w:t>
+            </w:r>
+          </w:p>
+        </w:tc>
+        <w:tc>
+          <w:tcPr>
+            <w:tcW w:type="dxa" w:w="5580"/>
+            <w:tcBorders>
+              <w:top w:val="none" w:color="FFFFFF" w:sz="0"/>
+              <w:left w:val="none" w:color="FFFFFF" w:sz="0"/>
+              <w:bottom w:val="none" w:color="FFFFFF" w:sz="0"/>
+              <w:right w:val="none" w:color="FFFFFF" w:sz="0"/>
+            </w:tcBorders>
+            <w:shd w:fill="FFFFFF" w:color="auto" w:val="clear"/>
+            <w:tcMar>
+              <w:top w:type="dxa" w:w="40"/>
+              <w:left w:type="dxa" w:w="80"/>
+              <w:bottom w:type="dxa" w:w="40"/>
+              <w:right w:type="dxa" w:w="80"/>
+            </w:tcMar>
+            <w:vAlign w:val="center"/>
+          </w:tcPr>
+          <w:p>
+            <w:r>
+              <w:rPr>
+                <w:rFonts w:ascii="Arial" w:cs="Arial" w:eastAsia="Arial" w:hAnsi="Arial"/>
+                <w:color w:val="6B6B6B"/>
+                <w:sz w:val="17"/>
+                <w:szCs w:val="17"/>
+              </w:rPr>
+              <w:t xml:space="preserve">Hips stacked, heels together, squeeze the left glute med at top.</w:t>
+            </w:r>
+          </w:p>
+        </w:tc>
+      </w:tr>
+      <w:tr>
+        <w:tc>
+          <w:tcPr>
+            <w:tcW w:type="dxa" w:w="2400"/>
+            <w:tcBorders>
+              <w:top w:val="none" w:color="FFFFFF" w:sz="0"/>
+              <w:left w:val="none" w:color="FFFFFF" w:sz="0"/>
+              <w:bottom w:val="none" w:color="FFFFFF" w:sz="0"/>
+              <w:right w:val="none" w:color="FFFFFF" w:sz="0"/>
+            </w:tcBorders>
+            <w:shd w:fill="FFF5F5" w:color="auto" w:val="clear"/>
+            <w:tcMar>
+              <w:top w:type="dxa" w:w="40"/>
+              <w:left w:type="dxa" w:w="80"/>
+              <w:bottom w:type="dxa" w:w="40"/>
+              <w:right w:type="dxa" w:w="80"/>
+            </w:tcMar>
+            <w:vAlign w:val="center"/>
+          </w:tcPr>
+          <w:p>
+            <w:r>
+              <w:rPr>
+                <w:rFonts w:ascii="Arial" w:cs="Arial" w:eastAsia="Arial" w:hAnsi="Arial"/>
+                <w:b/>
+                <w:bCs/>
+                <w:color w:val="2C2C2C"/>
+                <w:sz w:val="18"/>
+                <w:szCs w:val="18"/>
+              </w:rPr>
+              <w:t xml:space="preserve">KB Dead-Hinge (Light Ramp)</w:t>
+            </w:r>
+          </w:p>
+        </w:tc>
+        <w:tc>
+          <w:tcPr>
+            <w:tcW w:type="dxa" w:w="380"/>
+            <w:tcBorders>
+              <w:top w:val="none" w:color="FFFFFF" w:sz="0"/>
+              <w:left w:val="none" w:color="FFFFFF" w:sz="0"/>
+              <w:bottom w:val="none" w:color="FFFFFF" w:sz="0"/>
+              <w:right w:val="none" w:color="FFFFFF" w:sz="0"/>
+            </w:tcBorders>
+            <w:shd w:fill="FFF5F5" w:color="auto" w:val="clear"/>
+            <w:tcMar>
+              <w:top w:type="dxa" w:w="40"/>
+              <w:left w:type="dxa" w:w="80"/>
+              <w:bottom w:type="dxa" w:w="40"/>
+              <w:right w:type="dxa" w:w="80"/>
+            </w:tcMar>
+            <w:vAlign w:val="center"/>
+          </w:tcPr>
+          <w:p>
+            <w:pPr>
+              <w:jc w:val="center"/>
+            </w:pPr>
+            <w:r>
+              <w:rPr>
+                <w:rFonts w:ascii="Arial" w:cs="Arial" w:eastAsia="Arial" w:hAnsi="Arial"/>
+                <w:color w:val="6B6B6B"/>
+                <w:sz w:val="15"/>
+                <w:szCs w:val="15"/>
+              </w:rPr>
+              <w:t xml:space="preserve">2</w:t>
+            </w:r>
+          </w:p>
+        </w:tc>
+        <w:tc>
+          <w:tcPr>
+            <w:tcW w:type="dxa" w:w="420"/>
+            <w:tcBorders>
+              <w:top w:val="none" w:color="FFFFFF" w:sz="0"/>
+              <w:left w:val="none" w:color="FFFFFF" w:sz="0"/>
+              <w:bottom w:val="none" w:color="FFFFFF" w:sz="0"/>
+              <w:right w:val="none" w:color="FFFFFF" w:sz="0"/>
+            </w:tcBorders>
+            <w:shd w:fill="FFF5F5" w:color="auto" w:val="clear"/>
+            <w:tcMar>
+              <w:top w:type="dxa" w:w="40"/>
+              <w:left w:type="dxa" w:w="80"/>
+              <w:bottom w:type="dxa" w:w="40"/>
+              <w:right w:type="dxa" w:w="80"/>
+            </w:tcMar>
+            <w:vAlign w:val="center"/>
+          </w:tcPr>
+          <w:p>
+            <w:pPr>
+              <w:jc w:val="center"/>
+            </w:pPr>
+            <w:r>
+              <w:rPr>
+                <w:rFonts w:ascii="Arial" w:cs="Arial" w:eastAsia="Arial" w:hAnsi="Arial"/>
+                <w:color w:val="6B6B6B"/>
+                <w:sz w:val="15"/>
+                <w:szCs w:val="15"/>
+              </w:rPr>
+              <w:t xml:space="preserve">10</w:t>
+            </w:r>
+          </w:p>
+        </w:tc>
+        <w:tc>
+          <w:tcPr>
+            <w:tcW w:type="dxa" w:w="680"/>
+            <w:tcBorders>
+              <w:top w:val="none" w:color="FFFFFF" w:sz="0"/>
+              <w:left w:val="none" w:color="FFFFFF" w:sz="0"/>
+              <w:bottom w:val="none" w:color="FFFFFF" w:sz="0"/>
+              <w:right w:val="none" w:color="FFFFFF" w:sz="0"/>
+            </w:tcBorders>
+            <w:shd w:fill="FFF5F5" w:color="auto" w:val="clear"/>
+            <w:tcMar>
+              <w:top w:type="dxa" w:w="40"/>
+              <w:left w:type="dxa" w:w="80"/>
+              <w:bottom w:type="dxa" w:w="40"/>
+              <w:right w:type="dxa" w:w="80"/>
+            </w:tcMar>
+            <w:vAlign w:val="center"/>
+          </w:tcPr>
+          <w:p>
+            <w:pPr>
+              <w:jc w:val="center"/>
+            </w:pPr>
+            <w:r>
+              <w:rPr>
+                <w:rFonts w:ascii="Arial" w:cs="Arial" w:eastAsia="Arial" w:hAnsi="Arial"/>
+                <w:color w:val="6B6B6B"/>
+                <w:sz w:val="15"/>
+                <w:szCs w:val="15"/>
+              </w:rPr>
+              <w:t xml:space="preserve">Light KB</w:t>
+            </w:r>
+          </w:p>
+        </w:tc>
+        <w:tc>
+          <w:tcPr>
+            <w:tcW w:type="dxa" w:w="540"/>
+            <w:tcBorders>
+              <w:top w:val="none" w:color="FFFFFF" w:sz="0"/>
+              <w:left w:val="none" w:color="FFFFFF" w:sz="0"/>
+              <w:bottom w:val="none" w:color="FFFFFF" w:sz="0"/>
+              <w:right w:val="none" w:color="FFFFFF" w:sz="0"/>
+            </w:tcBorders>
+            <w:shd w:fill="FFF5F5" w:color="auto" w:val="clear"/>
+            <w:tcMar>
+              <w:top w:type="dxa" w:w="40"/>
+              <w:left w:type="dxa" w:w="80"/>
+              <w:bottom w:type="dxa" w:w="40"/>
+              <w:right w:type="dxa" w:w="80"/>
+            </w:tcMar>
+            <w:vAlign w:val="center"/>
+          </w:tcPr>
+          <w:p>
+            <w:pPr>
+              <w:jc w:val="center"/>
+            </w:pPr>
+            <w:r>
+              <w:rPr>
+                <w:rFonts w:ascii="Arial" w:cs="Arial" w:eastAsia="Arial" w:hAnsi="Arial"/>
+                <w:color w:val="6B6B6B"/>
+                <w:sz w:val="15"/>
+                <w:szCs w:val="15"/>
+              </w:rPr>
+              <w:t xml:space="preserve">2-1-1</w:t>
+            </w:r>
+          </w:p>
+        </w:tc>
+        <w:tc>
+          <w:tcPr>
+            <w:tcW w:type="dxa" w:w="440"/>
+            <w:tcBorders>
+              <w:top w:val="none" w:color="FFFFFF" w:sz="0"/>
+              <w:left w:val="none" w:color="FFFFFF" w:sz="0"/>
+              <w:bottom w:val="none" w:color="FFFFFF" w:sz="0"/>
+              <w:right w:val="none" w:color="FFFFFF" w:sz="0"/>
+            </w:tcBorders>
+            <w:shd w:fill="FFF5F5" w:color="auto" w:val="clear"/>
+            <w:tcMar>
+              <w:top w:type="dxa" w:w="40"/>
+              <w:left w:type="dxa" w:w="80"/>
+              <w:bottom w:type="dxa" w:w="40"/>
+              <w:right w:type="dxa" w:w="80"/>
+            </w:tcMar>
+            <w:vAlign w:val="center"/>
+          </w:tcPr>
+          <w:p>
+            <w:pPr>
+              <w:jc w:val="center"/>
+            </w:pPr>
+            <w:r>
+              <w:rPr>
+                <w:rFonts w:ascii="Arial" w:cs="Arial" w:eastAsia="Arial" w:hAnsi="Arial"/>
+                <w:color w:val="6B6B6B"/>
+                <w:sz w:val="15"/>
+                <w:szCs w:val="15"/>
+              </w:rPr>
+              <w:t xml:space="preserve">30s</w:t>
+            </w:r>
+          </w:p>
+        </w:tc>
+        <w:tc>
+          <w:tcPr>
+            <w:tcW w:type="dxa" w:w="5580"/>
+            <w:tcBorders>
+              <w:top w:val="none" w:color="FFFFFF" w:sz="0"/>
+              <w:left w:val="none" w:color="FFFFFF" w:sz="0"/>
+              <w:bottom w:val="none" w:color="FFFFFF" w:sz="0"/>
+              <w:right w:val="none" w:color="FFFFFF" w:sz="0"/>
+            </w:tcBorders>
+            <w:shd w:fill="FFF5F5" w:color="auto" w:val="clear"/>
+            <w:tcMar>
+              <w:top w:type="dxa" w:w="40"/>
+              <w:left w:type="dxa" w:w="80"/>
+              <w:bottom w:type="dxa" w:w="40"/>
+              <w:right w:type="dxa" w:w="80"/>
+            </w:tcMar>
+            <w:vAlign w:val="center"/>
+          </w:tcPr>
+          <w:p>
+            <w:r>
+              <w:rPr>
+                <w:rFonts w:ascii="Arial" w:cs="Arial" w:eastAsia="Arial" w:hAnsi="Arial"/>
+                <w:color w:val="6B6B6B"/>
+                <w:sz w:val="17"/>
+                <w:szCs w:val="17"/>
+              </w:rPr>
+              <w:t xml:space="preserve">Crisp hinge rehearsal, KB stays close — prime the pattern, no grind.</w:t>
+            </w:r>
+            <w:r>
+              <w:rPr>
+                <w:rFonts w:ascii="Arial" w:cs="Arial" w:eastAsia="Arial" w:hAnsi="Arial"/>
+                <w:i/>
+                <w:iCs/>
+                <w:color w:val="00695C"/>
+                <w:sz w:val="14"/>
+                <w:szCs w:val="14"/>
+              </w:rPr>
+              <w:t xml:space="preserve">  3+ RIR — technique/submaximal</w:t>
+            </w:r>
+          </w:p>
+        </w:tc>
+      </w:tr>
+      <w:tr>
+        <w:tc>
+          <w:tcPr>
+            <w:tcW w:type="dxa" w:w="2400"/>
+            <w:tcBorders>
+              <w:top w:val="none" w:color="FFFFFF" w:sz="0"/>
+              <w:left w:val="none" w:color="FFFFFF" w:sz="0"/>
+              <w:bottom w:val="none" w:color="FFFFFF" w:sz="0"/>
+              <w:right w:val="none" w:color="FFFFFF" w:sz="0"/>
+            </w:tcBorders>
+            <w:shd w:fill="FFFFFF" w:color="auto" w:val="clear"/>
+            <w:tcMar>
+              <w:top w:type="dxa" w:w="40"/>
+              <w:left w:type="dxa" w:w="80"/>
+              <w:bottom w:type="dxa" w:w="40"/>
+              <w:right w:type="dxa" w:w="80"/>
+            </w:tcMar>
+            <w:vAlign w:val="center"/>
+          </w:tcPr>
+          <w:p>
+            <w:r>
+              <w:rPr>
+                <w:rFonts w:ascii="Arial" w:cs="Arial" w:eastAsia="Arial" w:hAnsi="Arial"/>
+                <w:b/>
+                <w:bCs/>
+                <w:color w:val="2C2C2C"/>
+                <w:sz w:val="18"/>
+                <w:szCs w:val="18"/>
+              </w:rPr>
+              <w:t xml:space="preserve">Lateral Band Walk (Mini-band if available)</w:t>
+            </w:r>
+          </w:p>
+        </w:tc>
+        <w:tc>
+          <w:tcPr>
+            <w:tcW w:type="dxa" w:w="380"/>
+            <w:tcBorders>
+              <w:top w:val="none" w:color="FFFFFF" w:sz="0"/>
+              <w:left w:val="none" w:color="FFFFFF" w:sz="0"/>
+              <w:bottom w:val="none" w:color="FFFFFF" w:sz="0"/>
+              <w:right w:val="none" w:color="FFFFFF" w:sz="0"/>
+            </w:tcBorders>
+            <w:shd w:fill="FFFFFF" w:color="auto" w:val="clear"/>
+            <w:tcMar>
+              <w:top w:type="dxa" w:w="40"/>
+              <w:left w:type="dxa" w:w="80"/>
+              <w:bottom w:type="dxa" w:w="40"/>
+              <w:right w:type="dxa" w:w="80"/>
+            </w:tcMar>
+            <w:vAlign w:val="center"/>
+          </w:tcPr>
+          <w:p>
+            <w:pPr>
+              <w:jc w:val="center"/>
+            </w:pPr>
+            <w:r>
+              <w:rPr>
+                <w:rFonts w:ascii="Arial" w:cs="Arial" w:eastAsia="Arial" w:hAnsi="Arial"/>
+                <w:color w:val="6B6B6B"/>
+                <w:sz w:val="15"/>
+                <w:szCs w:val="15"/>
+              </w:rPr>
+              <w:t xml:space="preserve">2</w:t>
+            </w:r>
+          </w:p>
+        </w:tc>
+        <w:tc>
+          <w:tcPr>
+            <w:tcW w:type="dxa" w:w="420"/>
+            <w:tcBorders>
+              <w:top w:val="none" w:color="FFFFFF" w:sz="0"/>
+              <w:left w:val="none" w:color="FFFFFF" w:sz="0"/>
+              <w:bottom w:val="none" w:color="FFFFFF" w:sz="0"/>
+              <w:right w:val="none" w:color="FFFFFF" w:sz="0"/>
+            </w:tcBorders>
+            <w:shd w:fill="FFFFFF" w:color="auto" w:val="clear"/>
+            <w:tcMar>
+              <w:top w:type="dxa" w:w="40"/>
+              <w:left w:type="dxa" w:w="80"/>
+              <w:bottom w:type="dxa" w:w="40"/>
+              <w:right w:type="dxa" w:w="80"/>
+            </w:tcMar>
+            <w:vAlign w:val="center"/>
+          </w:tcPr>
+          <w:p>
+            <w:pPr>
+              <w:jc w:val="center"/>
+            </w:pPr>
+            <w:r>
+              <w:rPr>
+                <w:rFonts w:ascii="Arial" w:cs="Arial" w:eastAsia="Arial" w:hAnsi="Arial"/>
+                <w:color w:val="6B6B6B"/>
+                <w:sz w:val="15"/>
+                <w:szCs w:val="15"/>
+              </w:rPr>
+              <w:t xml:space="preserve">15 ea way</w:t>
+            </w:r>
+          </w:p>
+        </w:tc>
+        <w:tc>
+          <w:tcPr>
+            <w:tcW w:type="dxa" w:w="680"/>
+            <w:tcBorders>
+              <w:top w:val="none" w:color="FFFFFF" w:sz="0"/>
+              <w:left w:val="none" w:color="FFFFFF" w:sz="0"/>
+              <w:bottom w:val="none" w:color="FFFFFF" w:sz="0"/>
+              <w:right w:val="none" w:color="FFFFFF" w:sz="0"/>
+            </w:tcBorders>
+            <w:shd w:fill="FFFFFF" w:color="auto" w:val="clear"/>
+            <w:tcMar>
+              <w:top w:type="dxa" w:w="40"/>
+              <w:left w:type="dxa" w:w="80"/>
+              <w:bottom w:type="dxa" w:w="40"/>
+              <w:right w:type="dxa" w:w="80"/>
+            </w:tcMar>
+            <w:vAlign w:val="center"/>
+          </w:tcPr>
+          <w:p>
+            <w:pPr>
+              <w:jc w:val="center"/>
+            </w:pPr>
+            <w:r>
+              <w:rPr>
+                <w:rFonts w:ascii="Arial" w:cs="Arial" w:eastAsia="Arial" w:hAnsi="Arial"/>
+                <w:color w:val="6B6B6B"/>
+                <w:sz w:val="15"/>
+                <w:szCs w:val="15"/>
+              </w:rPr>
+              <w:t xml:space="preserve">Band</w:t>
+            </w:r>
+          </w:p>
+        </w:tc>
+        <w:tc>
+          <w:tcPr>
+            <w:tcW w:type="dxa" w:w="540"/>
+            <w:tcBorders>
+              <w:top w:val="none" w:color="FFFFFF" w:sz="0"/>
+              <w:left w:val="none" w:color="FFFFFF" w:sz="0"/>
+              <w:bottom w:val="none" w:color="FFFFFF" w:sz="0"/>
+              <w:right w:val="none" w:color="FFFFFF" w:sz="0"/>
+            </w:tcBorders>
+            <w:shd w:fill="FFFFFF" w:color="auto" w:val="clear"/>
+            <w:tcMar>
+              <w:top w:type="dxa" w:w="40"/>
+              <w:left w:type="dxa" w:w="80"/>
+              <w:bottom w:type="dxa" w:w="40"/>
+              <w:right w:type="dxa" w:w="80"/>
+            </w:tcMar>
+            <w:vAlign w:val="center"/>
+          </w:tcPr>
+          <w:p>
+            <w:pPr>
+              <w:jc w:val="center"/>
+            </w:pPr>
+            <w:r>
+              <w:rPr>
+                <w:rFonts w:ascii="Arial" w:cs="Arial" w:eastAsia="Arial" w:hAnsi="Arial"/>
+                <w:color w:val="6B6B6B"/>
+                <w:sz w:val="15"/>
+                <w:szCs w:val="15"/>
+              </w:rPr>
+              <w:t xml:space="preserve">Controlled</w:t>
+            </w:r>
+          </w:p>
+        </w:tc>
+        <w:tc>
+          <w:tcPr>
+            <w:tcW w:type="dxa" w:w="440"/>
+            <w:tcBorders>
+              <w:top w:val="none" w:color="FFFFFF" w:sz="0"/>
+              <w:left w:val="none" w:color="FFFFFF" w:sz="0"/>
+              <w:bottom w:val="none" w:color="FFFFFF" w:sz="0"/>
+              <w:right w:val="none" w:color="FFFFFF" w:sz="0"/>
+            </w:tcBorders>
+            <w:shd w:fill="FFFFFF" w:color="auto" w:val="clear"/>
+            <w:tcMar>
+              <w:top w:type="dxa" w:w="40"/>
+              <w:left w:type="dxa" w:w="80"/>
+              <w:bottom w:type="dxa" w:w="40"/>
+              <w:right w:type="dxa" w:w="80"/>
+            </w:tcMar>
+            <w:vAlign w:val="center"/>
+          </w:tcPr>
+          <w:p>
+            <w:pPr>
+              <w:jc w:val="center"/>
+            </w:pPr>
+            <w:r>
+              <w:rPr>
+                <w:rFonts w:ascii="Arial" w:cs="Arial" w:eastAsia="Arial" w:hAnsi="Arial"/>
+                <w:color w:val="6B6B6B"/>
+                <w:sz w:val="15"/>
+                <w:szCs w:val="15"/>
+              </w:rPr>
+              <w:t xml:space="preserve">30s</w:t>
+            </w:r>
+          </w:p>
+        </w:tc>
+        <w:tc>
+          <w:tcPr>
+            <w:tcW w:type="dxa" w:w="5580"/>
+            <w:tcBorders>
+              <w:top w:val="none" w:color="FFFFFF" w:sz="0"/>
+              <w:left w:val="none" w:color="FFFFFF" w:sz="0"/>
+              <w:bottom w:val="none" w:color="FFFFFF" w:sz="0"/>
+              <w:right w:val="none" w:color="FFFFFF" w:sz="0"/>
+            </w:tcBorders>
+            <w:shd w:fill="FFFFFF" w:color="auto" w:val="clear"/>
+            <w:tcMar>
+              <w:top w:type="dxa" w:w="40"/>
+              <w:left w:type="dxa" w:w="80"/>
+              <w:bottom w:type="dxa" w:w="40"/>
+              <w:right w:type="dxa" w:w="80"/>
+            </w:tcMar>
+            <w:vAlign w:val="center"/>
+          </w:tcPr>
+          <w:p>
+            <w:r>
+              <w:rPr>
+                <w:rFonts w:ascii="Arial" w:cs="Arial" w:eastAsia="Arial" w:hAnsi="Arial"/>
+                <w:color w:val="6B6B6B"/>
+                <w:sz w:val="17"/>
+                <w:szCs w:val="17"/>
+              </w:rPr>
+              <w:t xml:space="preserve">Band above knees. Slight squat, step lateral. Glute medius activation — prevents knee cave under load.</w:t>
+            </w:r>
+          </w:p>
+        </w:tc>
+      </w:tr>
+    </w:tbl>
+    <w:p>
+      <w:pPr>
+        <w:spacing w:after="100"/>
+      </w:pPr>
     </w:p>
     <w:p>
       <w:pPr>
@@ -2241,7 +3558,7 @@
           <w:sz w:val="17"/>
           <w:szCs w:val="17"/>
         </w:rPr>
-        <w:t xml:space="preserve">A — PRIMARY HINGE STRENGTH (HEX DEADLIFT)</w:t>
+        <w:t xml:space="preserve">B — PRIMARY COMPOUND — HEX DEADLIFT</w:t>
       </w:r>
     </w:p>
     <w:p>
@@ -2266,7 +3583,7 @@
           <w:sz w:val="17"/>
           <w:szCs w:val="17"/>
         </w:rPr>
-        <w:t xml:space="preserve">95 lbs. Week 1 starts at 85 lbs ×4×5 to groove the pattern. Add 5 lbs per session — linear progression is still available here. 130 lbs ×5 is the 4-week target. Camera side-on during deadlift sets so coach can check hip height, spine, and knee tracking.</w:t>
+        <w:t xml:space="preserve">95 lbs. Week 1 starts at 85 lbs ×4×5 to groove the pattern. Add 5 lbs per session — linear progression is still available here. 130 lbs ×5 is the 4-week target. Camera side-on during deadlift sets so coach can check hip height, spine, and knee tracking. If the day calls for a variation, rotate between: a DB deadlift (one DB at each side — already the built-in alternate), a B-stance DB deadlift (left leg takes the working share), or a KB deadlift with her bell. The hex bar/DB deadlift stays the lift we track — its Week 1 → Week 4 line is what gets retested.</w:t>
       </w:r>
     </w:p>
     <w:tbl>
@@ -2766,6 +4083,74 @@
           </w:p>
         </w:tc>
       </w:tr>
+    </w:tbl>
+    <w:p>
+      <w:pPr>
+        <w:spacing w:after="100"/>
+      </w:pPr>
+    </w:p>
+    <w:p>
+      <w:pPr>
+        <w:spacing w:after="60" w:before="120"/>
+      </w:pPr>
+      <w:r>
+        <w:rPr>
+          <w:rFonts w:ascii="Arial" w:cs="Arial" w:eastAsia="Arial" w:hAnsi="Arial"/>
+          <w:b/>
+          <w:bCs/>
+          <w:color w:val="C9A227"/>
+          <w:sz w:val="17"/>
+          <w:szCs w:val="17"/>
+        </w:rPr>
+        <w:t xml:space="preserve">C — ACCESSORY — ROMANIAN DEADLIFT</w:t>
+      </w:r>
+    </w:p>
+    <w:p>
+      <w:pPr>
+        <w:spacing w:after="80"/>
+      </w:pPr>
+      <w:r>
+        <w:rPr>
+          <w:rFonts w:ascii="Arial" w:cs="Arial" w:eastAsia="Arial" w:hAnsi="Arial"/>
+          <w:b/>
+          <w:bCs/>
+          <w:color w:val="C9A227"/>
+          <w:sz w:val="17"/>
+          <w:szCs w:val="17"/>
+        </w:rPr>
+        <w:t xml:space="preserve">Why:  </w:t>
+      </w:r>
+      <w:r>
+        <w:rPr>
+          <w:rFonts w:ascii="Arial" w:cs="Arial" w:eastAsia="Arial" w:hAnsi="Arial"/>
+          <w:color w:val="2C2C2C"/>
+          <w:sz w:val="17"/>
+          <w:szCs w:val="17"/>
+        </w:rPr>
+        <w:t xml:space="preserve">The hamstring-volume accessory directly behind the deadlift — same hinge pattern, lighter and longer, building the posterior chain that supports every lift in the program.</w:t>
+      </w:r>
+    </w:p>
+    <w:tbl>
+      <w:tblPr>
+        <w:tblW w:type="dxa" w:w="10440"/>
+        <w:tblBorders>
+          <w:top w:val="none" w:color="FFFFFF" w:sz="0"/>
+          <w:left w:val="none" w:color="FFFFFF" w:sz="0"/>
+          <w:bottom w:val="none" w:color="FFFFFF" w:sz="0"/>
+          <w:right w:val="none" w:color="FFFFFF" w:sz="0"/>
+          <w:insideH w:val="single" w:color="auto" w:sz="4"/>
+          <w:insideV w:val="single" w:color="auto" w:sz="4"/>
+        </w:tblBorders>
+      </w:tblPr>
+      <w:tblGrid>
+        <w:gridCol w:w="2400"/>
+        <w:gridCol w:w="380"/>
+        <w:gridCol w:w="420"/>
+        <w:gridCol w:w="680"/>
+        <w:gridCol w:w="540"/>
+        <w:gridCol w:w="440"/>
+        <w:gridCol w:w="5580"/>
+      </w:tblGrid>
       <w:tr>
         <w:tc>
           <w:tcPr>
@@ -2776,7 +4161,254 @@
               <w:bottom w:val="none" w:color="FFFFFF" w:sz="0"/>
               <w:right w:val="none" w:color="FFFFFF" w:sz="0"/>
             </w:tcBorders>
-            <w:shd w:fill="FFFFFF" w:color="auto" w:val="clear"/>
+            <w:shd w:fill="F5E8C0" w:color="auto" w:val="clear"/>
+            <w:tcMar>
+              <w:top w:type="dxa" w:w="40"/>
+              <w:left w:type="dxa" w:w="80"/>
+              <w:bottom w:type="dxa" w:w="40"/>
+              <w:right w:type="dxa" w:w="80"/>
+            </w:tcMar>
+            <w:vAlign w:val="center"/>
+          </w:tcPr>
+          <w:p>
+            <w:pPr>
+              <w:jc w:val="left"/>
+            </w:pPr>
+            <w:r>
+              <w:rPr>
+                <w:rFonts w:ascii="Arial" w:cs="Arial" w:eastAsia="Arial" w:hAnsi="Arial"/>
+                <w:b/>
+                <w:bCs/>
+                <w:color w:val="C9A227"/>
+                <w:sz w:val="15"/>
+                <w:szCs w:val="15"/>
+              </w:rPr>
+              <w:t xml:space="preserve">EXERCISE</w:t>
+            </w:r>
+          </w:p>
+        </w:tc>
+        <w:tc>
+          <w:tcPr>
+            <w:tcW w:type="dxa" w:w="380"/>
+            <w:tcBorders>
+              <w:top w:val="none" w:color="FFFFFF" w:sz="0"/>
+              <w:left w:val="none" w:color="FFFFFF" w:sz="0"/>
+              <w:bottom w:val="none" w:color="FFFFFF" w:sz="0"/>
+              <w:right w:val="none" w:color="FFFFFF" w:sz="0"/>
+            </w:tcBorders>
+            <w:shd w:fill="F5E8C0" w:color="auto" w:val="clear"/>
+            <w:tcMar>
+              <w:top w:type="dxa" w:w="40"/>
+              <w:left w:type="dxa" w:w="80"/>
+              <w:bottom w:type="dxa" w:w="40"/>
+              <w:right w:type="dxa" w:w="80"/>
+            </w:tcMar>
+            <w:vAlign w:val="center"/>
+          </w:tcPr>
+          <w:p>
+            <w:pPr>
+              <w:jc w:val="center"/>
+            </w:pPr>
+            <w:r>
+              <w:rPr>
+                <w:rFonts w:ascii="Arial" w:cs="Arial" w:eastAsia="Arial" w:hAnsi="Arial"/>
+                <w:b/>
+                <w:bCs/>
+                <w:color w:val="C9A227"/>
+                <w:sz w:val="13"/>
+                <w:szCs w:val="13"/>
+              </w:rPr>
+              <w:t xml:space="preserve">SETS</w:t>
+            </w:r>
+          </w:p>
+        </w:tc>
+        <w:tc>
+          <w:tcPr>
+            <w:tcW w:type="dxa" w:w="420"/>
+            <w:tcBorders>
+              <w:top w:val="none" w:color="FFFFFF" w:sz="0"/>
+              <w:left w:val="none" w:color="FFFFFF" w:sz="0"/>
+              <w:bottom w:val="none" w:color="FFFFFF" w:sz="0"/>
+              <w:right w:val="none" w:color="FFFFFF" w:sz="0"/>
+            </w:tcBorders>
+            <w:shd w:fill="F5E8C0" w:color="auto" w:val="clear"/>
+            <w:tcMar>
+              <w:top w:type="dxa" w:w="40"/>
+              <w:left w:type="dxa" w:w="80"/>
+              <w:bottom w:type="dxa" w:w="40"/>
+              <w:right w:type="dxa" w:w="80"/>
+            </w:tcMar>
+            <w:vAlign w:val="center"/>
+          </w:tcPr>
+          <w:p>
+            <w:pPr>
+              <w:jc w:val="center"/>
+            </w:pPr>
+            <w:r>
+              <w:rPr>
+                <w:rFonts w:ascii="Arial" w:cs="Arial" w:eastAsia="Arial" w:hAnsi="Arial"/>
+                <w:b/>
+                <w:bCs/>
+                <w:color w:val="C9A227"/>
+                <w:sz w:val="13"/>
+                <w:szCs w:val="13"/>
+              </w:rPr>
+              <w:t xml:space="preserve">REPS</w:t>
+            </w:r>
+          </w:p>
+        </w:tc>
+        <w:tc>
+          <w:tcPr>
+            <w:tcW w:type="dxa" w:w="680"/>
+            <w:tcBorders>
+              <w:top w:val="none" w:color="FFFFFF" w:sz="0"/>
+              <w:left w:val="none" w:color="FFFFFF" w:sz="0"/>
+              <w:bottom w:val="none" w:color="FFFFFF" w:sz="0"/>
+              <w:right w:val="none" w:color="FFFFFF" w:sz="0"/>
+            </w:tcBorders>
+            <w:shd w:fill="F5E8C0" w:color="auto" w:val="clear"/>
+            <w:tcMar>
+              <w:top w:type="dxa" w:w="40"/>
+              <w:left w:type="dxa" w:w="80"/>
+              <w:bottom w:type="dxa" w:w="40"/>
+              <w:right w:type="dxa" w:w="80"/>
+            </w:tcMar>
+            <w:vAlign w:val="center"/>
+          </w:tcPr>
+          <w:p>
+            <w:pPr>
+              <w:jc w:val="center"/>
+            </w:pPr>
+            <w:r>
+              <w:rPr>
+                <w:rFonts w:ascii="Arial" w:cs="Arial" w:eastAsia="Arial" w:hAnsi="Arial"/>
+                <w:b/>
+                <w:bCs/>
+                <w:color w:val="C9A227"/>
+                <w:sz w:val="13"/>
+                <w:szCs w:val="13"/>
+              </w:rPr>
+              <w:t xml:space="preserve">LOAD</w:t>
+            </w:r>
+          </w:p>
+        </w:tc>
+        <w:tc>
+          <w:tcPr>
+            <w:tcW w:type="dxa" w:w="540"/>
+            <w:tcBorders>
+              <w:top w:val="none" w:color="FFFFFF" w:sz="0"/>
+              <w:left w:val="none" w:color="FFFFFF" w:sz="0"/>
+              <w:bottom w:val="none" w:color="FFFFFF" w:sz="0"/>
+              <w:right w:val="none" w:color="FFFFFF" w:sz="0"/>
+            </w:tcBorders>
+            <w:shd w:fill="F5E8C0" w:color="auto" w:val="clear"/>
+            <w:tcMar>
+              <w:top w:type="dxa" w:w="40"/>
+              <w:left w:type="dxa" w:w="80"/>
+              <w:bottom w:type="dxa" w:w="40"/>
+              <w:right w:type="dxa" w:w="80"/>
+            </w:tcMar>
+            <w:vAlign w:val="center"/>
+          </w:tcPr>
+          <w:p>
+            <w:pPr>
+              <w:jc w:val="center"/>
+            </w:pPr>
+            <w:r>
+              <w:rPr>
+                <w:rFonts w:ascii="Arial" w:cs="Arial" w:eastAsia="Arial" w:hAnsi="Arial"/>
+                <w:b/>
+                <w:bCs/>
+                <w:color w:val="C9A227"/>
+                <w:sz w:val="13"/>
+                <w:szCs w:val="13"/>
+              </w:rPr>
+              <w:t xml:space="preserve">TEMPO</w:t>
+            </w:r>
+          </w:p>
+        </w:tc>
+        <w:tc>
+          <w:tcPr>
+            <w:tcW w:type="dxa" w:w="440"/>
+            <w:tcBorders>
+              <w:top w:val="none" w:color="FFFFFF" w:sz="0"/>
+              <w:left w:val="none" w:color="FFFFFF" w:sz="0"/>
+              <w:bottom w:val="none" w:color="FFFFFF" w:sz="0"/>
+              <w:right w:val="none" w:color="FFFFFF" w:sz="0"/>
+            </w:tcBorders>
+            <w:shd w:fill="F5E8C0" w:color="auto" w:val="clear"/>
+            <w:tcMar>
+              <w:top w:type="dxa" w:w="40"/>
+              <w:left w:type="dxa" w:w="80"/>
+              <w:bottom w:type="dxa" w:w="40"/>
+              <w:right w:type="dxa" w:w="80"/>
+            </w:tcMar>
+            <w:vAlign w:val="center"/>
+          </w:tcPr>
+          <w:p>
+            <w:pPr>
+              <w:jc w:val="center"/>
+            </w:pPr>
+            <w:r>
+              <w:rPr>
+                <w:rFonts w:ascii="Arial" w:cs="Arial" w:eastAsia="Arial" w:hAnsi="Arial"/>
+                <w:b/>
+                <w:bCs/>
+                <w:color w:val="C9A227"/>
+                <w:sz w:val="13"/>
+                <w:szCs w:val="13"/>
+              </w:rPr>
+              <w:t xml:space="preserve">REST</w:t>
+            </w:r>
+          </w:p>
+        </w:tc>
+        <w:tc>
+          <w:tcPr>
+            <w:tcW w:type="dxa" w:w="5580"/>
+            <w:tcBorders>
+              <w:top w:val="none" w:color="FFFFFF" w:sz="0"/>
+              <w:left w:val="none" w:color="FFFFFF" w:sz="0"/>
+              <w:bottom w:val="none" w:color="FFFFFF" w:sz="0"/>
+              <w:right w:val="none" w:color="FFFFFF" w:sz="0"/>
+            </w:tcBorders>
+            <w:shd w:fill="F5E8C0" w:color="auto" w:val="clear"/>
+            <w:tcMar>
+              <w:top w:type="dxa" w:w="40"/>
+              <w:left w:type="dxa" w:w="80"/>
+              <w:bottom w:type="dxa" w:w="40"/>
+              <w:right w:type="dxa" w:w="80"/>
+            </w:tcMar>
+            <w:vAlign w:val="center"/>
+          </w:tcPr>
+          <w:p>
+            <w:pPr>
+              <w:jc w:val="left"/>
+            </w:pPr>
+            <w:r>
+              <w:rPr>
+                <w:rFonts w:ascii="Arial" w:cs="Arial" w:eastAsia="Arial" w:hAnsi="Arial"/>
+                <w:b/>
+                <w:bCs/>
+                <w:color w:val="C9A227"/>
+                <w:sz w:val="15"/>
+                <w:szCs w:val="15"/>
+              </w:rPr>
+              <w:t xml:space="preserve">COACHING CUE</w:t>
+            </w:r>
+          </w:p>
+        </w:tc>
+      </w:tr>
+      <w:tr>
+        <w:tc>
+          <w:tcPr>
+            <w:tcW w:type="dxa" w:w="2400"/>
+            <w:tcBorders>
+              <w:top w:val="none" w:color="FFFFFF" w:sz="0"/>
+              <w:left w:val="none" w:color="FFFFFF" w:sz="0"/>
+              <w:bottom w:val="none" w:color="FFFFFF" w:sz="0"/>
+              <w:right w:val="none" w:color="FFFFFF" w:sz="0"/>
+            </w:tcBorders>
+            <w:shd w:fill="FAF3E0" w:color="auto" w:val="clear"/>
             <w:tcMar>
               <w:top w:type="dxa" w:w="40"/>
               <w:left w:type="dxa" w:w="80"/>
@@ -2808,7 +4440,7 @@
               <w:bottom w:val="none" w:color="FFFFFF" w:sz="0"/>
               <w:right w:val="none" w:color="FFFFFF" w:sz="0"/>
             </w:tcBorders>
-            <w:shd w:fill="FFFFFF" w:color="auto" w:val="clear"/>
+            <w:shd w:fill="FAF3E0" w:color="auto" w:val="clear"/>
             <w:tcMar>
               <w:top w:type="dxa" w:w="40"/>
               <w:left w:type="dxa" w:w="80"/>
@@ -2841,7 +4473,7 @@
               <w:bottom w:val="none" w:color="FFFFFF" w:sz="0"/>
               <w:right w:val="none" w:color="FFFFFF" w:sz="0"/>
             </w:tcBorders>
-            <w:shd w:fill="FFFFFF" w:color="auto" w:val="clear"/>
+            <w:shd w:fill="FAF3E0" w:color="auto" w:val="clear"/>
             <w:tcMar>
               <w:top w:type="dxa" w:w="40"/>
               <w:left w:type="dxa" w:w="80"/>
@@ -2874,7 +4506,7 @@
               <w:bottom w:val="none" w:color="FFFFFF" w:sz="0"/>
               <w:right w:val="none" w:color="FFFFFF" w:sz="0"/>
             </w:tcBorders>
-            <w:shd w:fill="FFFFFF" w:color="auto" w:val="clear"/>
+            <w:shd w:fill="FAF3E0" w:color="auto" w:val="clear"/>
             <w:tcMar>
               <w:top w:type="dxa" w:w="40"/>
               <w:left w:type="dxa" w:w="80"/>
@@ -2907,7 +4539,7 @@
               <w:bottom w:val="none" w:color="FFFFFF" w:sz="0"/>
               <w:right w:val="none" w:color="FFFFFF" w:sz="0"/>
             </w:tcBorders>
-            <w:shd w:fill="FFFFFF" w:color="auto" w:val="clear"/>
+            <w:shd w:fill="FAF3E0" w:color="auto" w:val="clear"/>
             <w:tcMar>
               <w:top w:type="dxa" w:w="40"/>
               <w:left w:type="dxa" w:w="80"/>
@@ -2940,7 +4572,7 @@
               <w:bottom w:val="none" w:color="FFFFFF" w:sz="0"/>
               <w:right w:val="none" w:color="FFFFFF" w:sz="0"/>
             </w:tcBorders>
-            <w:shd w:fill="FFFFFF" w:color="auto" w:val="clear"/>
+            <w:shd w:fill="FAF3E0" w:color="auto" w:val="clear"/>
             <w:tcMar>
               <w:top w:type="dxa" w:w="40"/>
               <w:left w:type="dxa" w:w="80"/>
@@ -2973,7 +4605,7 @@
               <w:bottom w:val="none" w:color="FFFFFF" w:sz="0"/>
               <w:right w:val="none" w:color="FFFFFF" w:sz="0"/>
             </w:tcBorders>
-            <w:shd w:fill="FFFFFF" w:color="auto" w:val="clear"/>
+            <w:shd w:fill="FAF3E0" w:color="auto" w:val="clear"/>
             <w:tcMar>
               <w:top w:type="dxa" w:w="40"/>
               <w:left w:type="dxa" w:w="80"/>
@@ -3014,7 +4646,7 @@
           <w:sz w:val="17"/>
           <w:szCs w:val="17"/>
         </w:rPr>
-        <w:t xml:space="preserve">B — PRIMARY SQUAT STRENGTH</w:t>
+        <w:t xml:space="preserve">D — SECONDARY COMPOUND — SQUAT STRENGTH</w:t>
       </w:r>
     </w:p>
     <w:p>
@@ -3039,7 +4671,7 @@
           <w:sz w:val="17"/>
           <w:szCs w:val="17"/>
         </w:rPr>
-        <w:t xml:space="preserve">Camera facing front for goblet squat. Knees should track over the second toe. No inward collapse. Coach will cue depth — aim for thighs parallel or below.</w:t>
+        <w:t xml:space="preserve">The day's second compound pattern — knee-dominant squatting, rotating off the hinge work above. Camera facing front for goblet squat. Knees should track over the second toe. No inward collapse. Coach will cue depth — aim for thighs parallel or below. If the day calls for a variation, rotate between: a KB goblet squat (her bell, on a lighter day), a DB front squat (two DBs racked at the shoulders), or a box/bench squat to depth. The goblet squat stays the movement we track; on every unilateral option the left leg leads.</w:t>
       </w:r>
     </w:p>
     <w:tbl>
@@ -3768,235 +5400,6 @@
           </w:p>
         </w:tc>
       </w:tr>
-      <w:tr>
-        <w:tc>
-          <w:tcPr>
-            <w:tcW w:type="dxa" w:w="2400"/>
-            <w:tcBorders>
-              <w:top w:val="none" w:color="FFFFFF" w:sz="0"/>
-              <w:left w:val="none" w:color="FFFFFF" w:sz="0"/>
-              <w:bottom w:val="none" w:color="FFFFFF" w:sz="0"/>
-              <w:right w:val="none" w:color="FFFFFF" w:sz="0"/>
-            </w:tcBorders>
-            <w:shd w:fill="FAF3E0" w:color="auto" w:val="clear"/>
-            <w:tcMar>
-              <w:top w:type="dxa" w:w="40"/>
-              <w:left w:type="dxa" w:w="80"/>
-              <w:bottom w:type="dxa" w:w="40"/>
-              <w:right w:type="dxa" w:w="80"/>
-            </w:tcMar>
-            <w:vAlign w:val="center"/>
-          </w:tcPr>
-          <w:p>
-            <w:r>
-              <w:rPr>
-                <w:rFonts w:ascii="Arial" w:cs="Arial" w:eastAsia="Arial" w:hAnsi="Arial"/>
-                <w:b/>
-                <w:bCs/>
-                <w:color w:val="2C2C2C"/>
-                <w:sz w:val="18"/>
-                <w:szCs w:val="18"/>
-              </w:rPr>
-              <w:t xml:space="preserve">Lateral Band Walk (Mini-band if available)</w:t>
-            </w:r>
-          </w:p>
-        </w:tc>
-        <w:tc>
-          <w:tcPr>
-            <w:tcW w:type="dxa" w:w="380"/>
-            <w:tcBorders>
-              <w:top w:val="none" w:color="FFFFFF" w:sz="0"/>
-              <w:left w:val="none" w:color="FFFFFF" w:sz="0"/>
-              <w:bottom w:val="none" w:color="FFFFFF" w:sz="0"/>
-              <w:right w:val="none" w:color="FFFFFF" w:sz="0"/>
-            </w:tcBorders>
-            <w:shd w:fill="FAF3E0" w:color="auto" w:val="clear"/>
-            <w:tcMar>
-              <w:top w:type="dxa" w:w="40"/>
-              <w:left w:type="dxa" w:w="80"/>
-              <w:bottom w:type="dxa" w:w="40"/>
-              <w:right w:type="dxa" w:w="80"/>
-            </w:tcMar>
-            <w:vAlign w:val="center"/>
-          </w:tcPr>
-          <w:p>
-            <w:pPr>
-              <w:jc w:val="center"/>
-            </w:pPr>
-            <w:r>
-              <w:rPr>
-                <w:rFonts w:ascii="Arial" w:cs="Arial" w:eastAsia="Arial" w:hAnsi="Arial"/>
-                <w:color w:val="6B6B6B"/>
-                <w:sz w:val="15"/>
-                <w:szCs w:val="15"/>
-              </w:rPr>
-              <w:t xml:space="preserve">2</w:t>
-            </w:r>
-          </w:p>
-        </w:tc>
-        <w:tc>
-          <w:tcPr>
-            <w:tcW w:type="dxa" w:w="420"/>
-            <w:tcBorders>
-              <w:top w:val="none" w:color="FFFFFF" w:sz="0"/>
-              <w:left w:val="none" w:color="FFFFFF" w:sz="0"/>
-              <w:bottom w:val="none" w:color="FFFFFF" w:sz="0"/>
-              <w:right w:val="none" w:color="FFFFFF" w:sz="0"/>
-            </w:tcBorders>
-            <w:shd w:fill="FAF3E0" w:color="auto" w:val="clear"/>
-            <w:tcMar>
-              <w:top w:type="dxa" w:w="40"/>
-              <w:left w:type="dxa" w:w="80"/>
-              <w:bottom w:type="dxa" w:w="40"/>
-              <w:right w:type="dxa" w:w="80"/>
-            </w:tcMar>
-            <w:vAlign w:val="center"/>
-          </w:tcPr>
-          <w:p>
-            <w:pPr>
-              <w:jc w:val="center"/>
-            </w:pPr>
-            <w:r>
-              <w:rPr>
-                <w:rFonts w:ascii="Arial" w:cs="Arial" w:eastAsia="Arial" w:hAnsi="Arial"/>
-                <w:color w:val="6B6B6B"/>
-                <w:sz w:val="15"/>
-                <w:szCs w:val="15"/>
-              </w:rPr>
-              <w:t xml:space="preserve">15 ea way</w:t>
-            </w:r>
-          </w:p>
-        </w:tc>
-        <w:tc>
-          <w:tcPr>
-            <w:tcW w:type="dxa" w:w="680"/>
-            <w:tcBorders>
-              <w:top w:val="none" w:color="FFFFFF" w:sz="0"/>
-              <w:left w:val="none" w:color="FFFFFF" w:sz="0"/>
-              <w:bottom w:val="none" w:color="FFFFFF" w:sz="0"/>
-              <w:right w:val="none" w:color="FFFFFF" w:sz="0"/>
-            </w:tcBorders>
-            <w:shd w:fill="FAF3E0" w:color="auto" w:val="clear"/>
-            <w:tcMar>
-              <w:top w:type="dxa" w:w="40"/>
-              <w:left w:type="dxa" w:w="80"/>
-              <w:bottom w:type="dxa" w:w="40"/>
-              <w:right w:type="dxa" w:w="80"/>
-            </w:tcMar>
-            <w:vAlign w:val="center"/>
-          </w:tcPr>
-          <w:p>
-            <w:pPr>
-              <w:jc w:val="center"/>
-            </w:pPr>
-            <w:r>
-              <w:rPr>
-                <w:rFonts w:ascii="Arial" w:cs="Arial" w:eastAsia="Arial" w:hAnsi="Arial"/>
-                <w:color w:val="6B6B6B"/>
-                <w:sz w:val="15"/>
-                <w:szCs w:val="15"/>
-              </w:rPr>
-              <w:t xml:space="preserve">Band</w:t>
-            </w:r>
-          </w:p>
-        </w:tc>
-        <w:tc>
-          <w:tcPr>
-            <w:tcW w:type="dxa" w:w="540"/>
-            <w:tcBorders>
-              <w:top w:val="none" w:color="FFFFFF" w:sz="0"/>
-              <w:left w:val="none" w:color="FFFFFF" w:sz="0"/>
-              <w:bottom w:val="none" w:color="FFFFFF" w:sz="0"/>
-              <w:right w:val="none" w:color="FFFFFF" w:sz="0"/>
-            </w:tcBorders>
-            <w:shd w:fill="FAF3E0" w:color="auto" w:val="clear"/>
-            <w:tcMar>
-              <w:top w:type="dxa" w:w="40"/>
-              <w:left w:type="dxa" w:w="80"/>
-              <w:bottom w:type="dxa" w:w="40"/>
-              <w:right w:type="dxa" w:w="80"/>
-            </w:tcMar>
-            <w:vAlign w:val="center"/>
-          </w:tcPr>
-          <w:p>
-            <w:pPr>
-              <w:jc w:val="center"/>
-            </w:pPr>
-            <w:r>
-              <w:rPr>
-                <w:rFonts w:ascii="Arial" w:cs="Arial" w:eastAsia="Arial" w:hAnsi="Arial"/>
-                <w:color w:val="6B6B6B"/>
-                <w:sz w:val="15"/>
-                <w:szCs w:val="15"/>
-              </w:rPr>
-              <w:t xml:space="preserve">Controlled</w:t>
-            </w:r>
-          </w:p>
-        </w:tc>
-        <w:tc>
-          <w:tcPr>
-            <w:tcW w:type="dxa" w:w="440"/>
-            <w:tcBorders>
-              <w:top w:val="none" w:color="FFFFFF" w:sz="0"/>
-              <w:left w:val="none" w:color="FFFFFF" w:sz="0"/>
-              <w:bottom w:val="none" w:color="FFFFFF" w:sz="0"/>
-              <w:right w:val="none" w:color="FFFFFF" w:sz="0"/>
-            </w:tcBorders>
-            <w:shd w:fill="FAF3E0" w:color="auto" w:val="clear"/>
-            <w:tcMar>
-              <w:top w:type="dxa" w:w="40"/>
-              <w:left w:type="dxa" w:w="80"/>
-              <w:bottom w:type="dxa" w:w="40"/>
-              <w:right w:type="dxa" w:w="80"/>
-            </w:tcMar>
-            <w:vAlign w:val="center"/>
-          </w:tcPr>
-          <w:p>
-            <w:pPr>
-              <w:jc w:val="center"/>
-            </w:pPr>
-            <w:r>
-              <w:rPr>
-                <w:rFonts w:ascii="Arial" w:cs="Arial" w:eastAsia="Arial" w:hAnsi="Arial"/>
-                <w:color w:val="6B6B6B"/>
-                <w:sz w:val="15"/>
-                <w:szCs w:val="15"/>
-              </w:rPr>
-              <w:t xml:space="preserve">30s</w:t>
-            </w:r>
-          </w:p>
-        </w:tc>
-        <w:tc>
-          <w:tcPr>
-            <w:tcW w:type="dxa" w:w="5580"/>
-            <w:tcBorders>
-              <w:top w:val="none" w:color="FFFFFF" w:sz="0"/>
-              <w:left w:val="none" w:color="FFFFFF" w:sz="0"/>
-              <w:bottom w:val="none" w:color="FFFFFF" w:sz="0"/>
-              <w:right w:val="none" w:color="FFFFFF" w:sz="0"/>
-            </w:tcBorders>
-            <w:shd w:fill="FAF3E0" w:color="auto" w:val="clear"/>
-            <w:tcMar>
-              <w:top w:type="dxa" w:w="40"/>
-              <w:left w:type="dxa" w:w="80"/>
-              <w:bottom w:type="dxa" w:w="40"/>
-              <w:right w:type="dxa" w:w="80"/>
-            </w:tcMar>
-            <w:vAlign w:val="center"/>
-          </w:tcPr>
-          <w:p>
-            <w:r>
-              <w:rPr>
-                <w:rFonts w:ascii="Arial" w:cs="Arial" w:eastAsia="Arial" w:hAnsi="Arial"/>
-                <w:color w:val="6B6B6B"/>
-                <w:sz w:val="17"/>
-                <w:szCs w:val="17"/>
-              </w:rPr>
-              <w:t xml:space="preserve">Band above knees. Slight squat, step lateral. Glute medius activation — prevents knee cave under load.</w:t>
-            </w:r>
-          </w:p>
-        </w:tc>
-      </w:tr>
     </w:tbl>
     <w:p>
       <w:pPr>
@@ -4016,7 +5419,7 @@
           <w:sz w:val="17"/>
           <w:szCs w:val="17"/>
         </w:rPr>
-        <w:t xml:space="preserve">C — UNILATERAL LOWER BODY</w:t>
+        <w:t xml:space="preserve">E — UNILATERAL LOWER BODY</w:t>
       </w:r>
     </w:p>
     <w:p>
@@ -5018,7 +6421,7 @@
           <w:sz w:val="17"/>
           <w:szCs w:val="17"/>
         </w:rPr>
-        <w:t xml:space="preserve">D — KB COMPLEX FINISHER + CORE</w:t>
+        <w:t xml:space="preserve">F — FULL-BODY INTEGRATION — KB COMPLEX + CORE</w:t>
       </w:r>
     </w:p>
     <w:p>
@@ -5034,7 +6437,7 @@
           <w:sz w:val="17"/>
           <w:szCs w:val="17"/>
         </w:rPr>
-        <w:t xml:space="preserve">Finisher:  </w:t>
+        <w:t xml:space="preserve">Why:  </w:t>
       </w:r>
       <w:r>
         <w:rPr>
@@ -5043,7 +6446,7 @@
           <w:sz w:val="17"/>
           <w:szCs w:val="17"/>
         </w:rPr>
-        <w:t xml:space="preserve">KB Complex — 3 rounds, rest 90s between: 8 KB Swings (hip hinge power) + 8 KB Goblet Squat + 8 KB Romanian Deadlift + 30s Plank Hold (baseline :45 → build to 1:20). Use a KB you can swing explosively — not too heavy. Record load and rounds.</w:t>
+        <w:t xml:space="preserve">The session's closing compound complex — the day's hinge and squat patterns pulled together into one continuous flow, then core under fatigue. KB Complex — 3 rounds, rest 90s between: 8 KB Swings (hip hinge power) + 8 KB Goblet Squat + 8 KB Romanian Deadlift + 30s Plank Hold (baseline :45 → build to 1:20). Use a KB you can swing explosively — not too heavy. Record load and rounds. If a variation suits the day, run the same complex goblet-style with a single DB, or swap the swings for KB deadlifts on a day the low back is tired.</w:t>
       </w:r>
     </w:p>
     <w:tbl>
@@ -6325,8 +7728,552 @@
           <w:sz w:val="17"/>
           <w:szCs w:val="17"/>
         </w:rPr>
-        <w:t xml:space="preserve">3 min treadmill walk or light jog (elevate HR before upper work). Then: RIGHT ARM NEURAL ACTIVATION: right hand isometric squeeze 10s ×3 (neural delay protocol). Arm circles 2×10, scapular push-ups 2×10, cat-cow 10 reps, thoracic rotation 10 each side, med ball chest pass to wall 2×8 light (shoulder warm-up). Camera: posture check before loading.</w:t>
+        <w:t xml:space="preserve">3 min treadmill walk or light jog (elevate HR before upper work). Then: arm circles 2×10, scapular push-ups 2×10, cat-cow 10 reps, thoracic rotation 10 each side, med ball chest pass to wall 2×8 light (shoulder warm-up). Camera: posture check before loading. The right-arm neural activation opens Block A below.</w:t>
       </w:r>
+    </w:p>
+    <w:p>
+      <w:pPr>
+        <w:spacing w:after="60" w:before="120"/>
+      </w:pPr>
+      <w:r>
+        <w:rPr>
+          <w:rFonts w:ascii="Arial" w:cs="Arial" w:eastAsia="Arial" w:hAnsi="Arial"/>
+          <w:b/>
+          <w:bCs/>
+          <w:color w:val="E53935"/>
+          <w:sz w:val="17"/>
+          <w:szCs w:val="17"/>
+        </w:rPr>
+        <w:t xml:space="preserve">A — CORRECTIVE — RIGHT-ARM NEURAL ACTIVATION</w:t>
+      </w:r>
+    </w:p>
+    <w:p>
+      <w:pPr>
+        <w:spacing w:after="80"/>
+      </w:pPr>
+      <w:r>
+        <w:rPr>
+          <w:rFonts w:ascii="Arial" w:cs="Arial" w:eastAsia="Arial" w:hAnsi="Arial"/>
+          <w:b/>
+          <w:bCs/>
+          <w:color w:val="E53935"/>
+          <w:sz w:val="17"/>
+          <w:szCs w:val="17"/>
+        </w:rPr>
+        <w:t xml:space="preserve">Why:  </w:t>
+      </w:r>
+      <w:r>
+        <w:rPr>
+          <w:rFonts w:ascii="Arial" w:cs="Arial" w:eastAsia="Arial" w:hAnsi="Arial"/>
+          <w:color w:val="2C2C2C"/>
+          <w:sz w:val="17"/>
+          <w:szCs w:val="17"/>
+        </w:rPr>
+        <w:t xml:space="preserve">The grip test shows the right arm firing 14.8% slower to peak force — this short isometric protocol fires that neural pathway before every loaded pulling session, priming the right grip for the rows and carries below.</w:t>
+      </w:r>
+    </w:p>
+    <w:tbl>
+      <w:tblPr>
+        <w:tblW w:type="dxa" w:w="10440"/>
+        <w:tblBorders>
+          <w:top w:val="none" w:color="FFFFFF" w:sz="0"/>
+          <w:left w:val="none" w:color="FFFFFF" w:sz="0"/>
+          <w:bottom w:val="none" w:color="FFFFFF" w:sz="0"/>
+          <w:right w:val="none" w:color="FFFFFF" w:sz="0"/>
+          <w:insideH w:val="single" w:color="auto" w:sz="4"/>
+          <w:insideV w:val="single" w:color="auto" w:sz="4"/>
+        </w:tblBorders>
+      </w:tblPr>
+      <w:tblGrid>
+        <w:gridCol w:w="2400"/>
+        <w:gridCol w:w="380"/>
+        <w:gridCol w:w="420"/>
+        <w:gridCol w:w="680"/>
+        <w:gridCol w:w="540"/>
+        <w:gridCol w:w="440"/>
+        <w:gridCol w:w="5580"/>
+      </w:tblGrid>
+      <w:tr>
+        <w:tc>
+          <w:tcPr>
+            <w:tcW w:type="dxa" w:w="2400"/>
+            <w:tcBorders>
+              <w:top w:val="none" w:color="FFFFFF" w:sz="0"/>
+              <w:left w:val="none" w:color="FFFFFF" w:sz="0"/>
+              <w:bottom w:val="none" w:color="FFFFFF" w:sz="0"/>
+              <w:right w:val="none" w:color="FFFFFF" w:sz="0"/>
+            </w:tcBorders>
+            <w:shd w:fill="FFEBEE" w:color="auto" w:val="clear"/>
+            <w:tcMar>
+              <w:top w:type="dxa" w:w="40"/>
+              <w:left w:type="dxa" w:w="80"/>
+              <w:bottom w:type="dxa" w:w="40"/>
+              <w:right w:type="dxa" w:w="80"/>
+            </w:tcMar>
+            <w:vAlign w:val="center"/>
+          </w:tcPr>
+          <w:p>
+            <w:pPr>
+              <w:jc w:val="left"/>
+            </w:pPr>
+            <w:r>
+              <w:rPr>
+                <w:rFonts w:ascii="Arial" w:cs="Arial" w:eastAsia="Arial" w:hAnsi="Arial"/>
+                <w:b/>
+                <w:bCs/>
+                <w:color w:val="E53935"/>
+                <w:sz w:val="15"/>
+                <w:szCs w:val="15"/>
+              </w:rPr>
+              <w:t xml:space="preserve">EXERCISE</w:t>
+            </w:r>
+          </w:p>
+        </w:tc>
+        <w:tc>
+          <w:tcPr>
+            <w:tcW w:type="dxa" w:w="380"/>
+            <w:tcBorders>
+              <w:top w:val="none" w:color="FFFFFF" w:sz="0"/>
+              <w:left w:val="none" w:color="FFFFFF" w:sz="0"/>
+              <w:bottom w:val="none" w:color="FFFFFF" w:sz="0"/>
+              <w:right w:val="none" w:color="FFFFFF" w:sz="0"/>
+            </w:tcBorders>
+            <w:shd w:fill="FFEBEE" w:color="auto" w:val="clear"/>
+            <w:tcMar>
+              <w:top w:type="dxa" w:w="40"/>
+              <w:left w:type="dxa" w:w="80"/>
+              <w:bottom w:type="dxa" w:w="40"/>
+              <w:right w:type="dxa" w:w="80"/>
+            </w:tcMar>
+            <w:vAlign w:val="center"/>
+          </w:tcPr>
+          <w:p>
+            <w:pPr>
+              <w:jc w:val="center"/>
+            </w:pPr>
+            <w:r>
+              <w:rPr>
+                <w:rFonts w:ascii="Arial" w:cs="Arial" w:eastAsia="Arial" w:hAnsi="Arial"/>
+                <w:b/>
+                <w:bCs/>
+                <w:color w:val="E53935"/>
+                <w:sz w:val="13"/>
+                <w:szCs w:val="13"/>
+              </w:rPr>
+              <w:t xml:space="preserve">SETS</w:t>
+            </w:r>
+          </w:p>
+        </w:tc>
+        <w:tc>
+          <w:tcPr>
+            <w:tcW w:type="dxa" w:w="420"/>
+            <w:tcBorders>
+              <w:top w:val="none" w:color="FFFFFF" w:sz="0"/>
+              <w:left w:val="none" w:color="FFFFFF" w:sz="0"/>
+              <w:bottom w:val="none" w:color="FFFFFF" w:sz="0"/>
+              <w:right w:val="none" w:color="FFFFFF" w:sz="0"/>
+            </w:tcBorders>
+            <w:shd w:fill="FFEBEE" w:color="auto" w:val="clear"/>
+            <w:tcMar>
+              <w:top w:type="dxa" w:w="40"/>
+              <w:left w:type="dxa" w:w="80"/>
+              <w:bottom w:type="dxa" w:w="40"/>
+              <w:right w:type="dxa" w:w="80"/>
+            </w:tcMar>
+            <w:vAlign w:val="center"/>
+          </w:tcPr>
+          <w:p>
+            <w:pPr>
+              <w:jc w:val="center"/>
+            </w:pPr>
+            <w:r>
+              <w:rPr>
+                <w:rFonts w:ascii="Arial" w:cs="Arial" w:eastAsia="Arial" w:hAnsi="Arial"/>
+                <w:b/>
+                <w:bCs/>
+                <w:color w:val="E53935"/>
+                <w:sz w:val="13"/>
+                <w:szCs w:val="13"/>
+              </w:rPr>
+              <w:t xml:space="preserve">REPS</w:t>
+            </w:r>
+          </w:p>
+        </w:tc>
+        <w:tc>
+          <w:tcPr>
+            <w:tcW w:type="dxa" w:w="680"/>
+            <w:tcBorders>
+              <w:top w:val="none" w:color="FFFFFF" w:sz="0"/>
+              <w:left w:val="none" w:color="FFFFFF" w:sz="0"/>
+              <w:bottom w:val="none" w:color="FFFFFF" w:sz="0"/>
+              <w:right w:val="none" w:color="FFFFFF" w:sz="0"/>
+            </w:tcBorders>
+            <w:shd w:fill="FFEBEE" w:color="auto" w:val="clear"/>
+            <w:tcMar>
+              <w:top w:type="dxa" w:w="40"/>
+              <w:left w:type="dxa" w:w="80"/>
+              <w:bottom w:type="dxa" w:w="40"/>
+              <w:right w:type="dxa" w:w="80"/>
+            </w:tcMar>
+            <w:vAlign w:val="center"/>
+          </w:tcPr>
+          <w:p>
+            <w:pPr>
+              <w:jc w:val="center"/>
+            </w:pPr>
+            <w:r>
+              <w:rPr>
+                <w:rFonts w:ascii="Arial" w:cs="Arial" w:eastAsia="Arial" w:hAnsi="Arial"/>
+                <w:b/>
+                <w:bCs/>
+                <w:color w:val="E53935"/>
+                <w:sz w:val="13"/>
+                <w:szCs w:val="13"/>
+              </w:rPr>
+              <w:t xml:space="preserve">LOAD</w:t>
+            </w:r>
+          </w:p>
+        </w:tc>
+        <w:tc>
+          <w:tcPr>
+            <w:tcW w:type="dxa" w:w="540"/>
+            <w:tcBorders>
+              <w:top w:val="none" w:color="FFFFFF" w:sz="0"/>
+              <w:left w:val="none" w:color="FFFFFF" w:sz="0"/>
+              <w:bottom w:val="none" w:color="FFFFFF" w:sz="0"/>
+              <w:right w:val="none" w:color="FFFFFF" w:sz="0"/>
+            </w:tcBorders>
+            <w:shd w:fill="FFEBEE" w:color="auto" w:val="clear"/>
+            <w:tcMar>
+              <w:top w:type="dxa" w:w="40"/>
+              <w:left w:type="dxa" w:w="80"/>
+              <w:bottom w:type="dxa" w:w="40"/>
+              <w:right w:type="dxa" w:w="80"/>
+            </w:tcMar>
+            <w:vAlign w:val="center"/>
+          </w:tcPr>
+          <w:p>
+            <w:pPr>
+              <w:jc w:val="center"/>
+            </w:pPr>
+            <w:r>
+              <w:rPr>
+                <w:rFonts w:ascii="Arial" w:cs="Arial" w:eastAsia="Arial" w:hAnsi="Arial"/>
+                <w:b/>
+                <w:bCs/>
+                <w:color w:val="E53935"/>
+                <w:sz w:val="13"/>
+                <w:szCs w:val="13"/>
+              </w:rPr>
+              <w:t xml:space="preserve">TEMPO</w:t>
+            </w:r>
+          </w:p>
+        </w:tc>
+        <w:tc>
+          <w:tcPr>
+            <w:tcW w:type="dxa" w:w="440"/>
+            <w:tcBorders>
+              <w:top w:val="none" w:color="FFFFFF" w:sz="0"/>
+              <w:left w:val="none" w:color="FFFFFF" w:sz="0"/>
+              <w:bottom w:val="none" w:color="FFFFFF" w:sz="0"/>
+              <w:right w:val="none" w:color="FFFFFF" w:sz="0"/>
+            </w:tcBorders>
+            <w:shd w:fill="FFEBEE" w:color="auto" w:val="clear"/>
+            <w:tcMar>
+              <w:top w:type="dxa" w:w="40"/>
+              <w:left w:type="dxa" w:w="80"/>
+              <w:bottom w:type="dxa" w:w="40"/>
+              <w:right w:type="dxa" w:w="80"/>
+            </w:tcMar>
+            <w:vAlign w:val="center"/>
+          </w:tcPr>
+          <w:p>
+            <w:pPr>
+              <w:jc w:val="center"/>
+            </w:pPr>
+            <w:r>
+              <w:rPr>
+                <w:rFonts w:ascii="Arial" w:cs="Arial" w:eastAsia="Arial" w:hAnsi="Arial"/>
+                <w:b/>
+                <w:bCs/>
+                <w:color w:val="E53935"/>
+                <w:sz w:val="13"/>
+                <w:szCs w:val="13"/>
+              </w:rPr>
+              <w:t xml:space="preserve">REST</w:t>
+            </w:r>
+          </w:p>
+        </w:tc>
+        <w:tc>
+          <w:tcPr>
+            <w:tcW w:type="dxa" w:w="5580"/>
+            <w:tcBorders>
+              <w:top w:val="none" w:color="FFFFFF" w:sz="0"/>
+              <w:left w:val="none" w:color="FFFFFF" w:sz="0"/>
+              <w:bottom w:val="none" w:color="FFFFFF" w:sz="0"/>
+              <w:right w:val="none" w:color="FFFFFF" w:sz="0"/>
+            </w:tcBorders>
+            <w:shd w:fill="FFEBEE" w:color="auto" w:val="clear"/>
+            <w:tcMar>
+              <w:top w:type="dxa" w:w="40"/>
+              <w:left w:type="dxa" w:w="80"/>
+              <w:bottom w:type="dxa" w:w="40"/>
+              <w:right w:type="dxa" w:w="80"/>
+            </w:tcMar>
+            <w:vAlign w:val="center"/>
+          </w:tcPr>
+          <w:p>
+            <w:pPr>
+              <w:jc w:val="left"/>
+            </w:pPr>
+            <w:r>
+              <w:rPr>
+                <w:rFonts w:ascii="Arial" w:cs="Arial" w:eastAsia="Arial" w:hAnsi="Arial"/>
+                <w:b/>
+                <w:bCs/>
+                <w:color w:val="E53935"/>
+                <w:sz w:val="15"/>
+                <w:szCs w:val="15"/>
+              </w:rPr>
+              <w:t xml:space="preserve">COACHING CUE</w:t>
+            </w:r>
+          </w:p>
+        </w:tc>
+      </w:tr>
+      <w:tr>
+        <w:tc>
+          <w:tcPr>
+            <w:tcW w:type="dxa" w:w="2400"/>
+            <w:tcBorders>
+              <w:top w:val="none" w:color="FFFFFF" w:sz="0"/>
+              <w:left w:val="none" w:color="FFFFFF" w:sz="0"/>
+              <w:bottom w:val="none" w:color="FFFFFF" w:sz="0"/>
+              <w:right w:val="none" w:color="FFFFFF" w:sz="0"/>
+            </w:tcBorders>
+            <w:shd w:fill="FFF5F5" w:color="auto" w:val="clear"/>
+            <w:tcMar>
+              <w:top w:type="dxa" w:w="40"/>
+              <w:left w:type="dxa" w:w="80"/>
+              <w:bottom w:type="dxa" w:w="40"/>
+              <w:right w:type="dxa" w:w="80"/>
+            </w:tcMar>
+            <w:vAlign w:val="center"/>
+          </w:tcPr>
+          <w:p>
+            <w:r>
+              <w:rPr>
+                <w:rFonts w:ascii="Arial" w:cs="Arial" w:eastAsia="Arial" w:hAnsi="Arial"/>
+                <w:b/>
+                <w:bCs/>
+                <w:color w:val="2C2C2C"/>
+                <w:sz w:val="18"/>
+                <w:szCs w:val="18"/>
+              </w:rPr>
+              <w:t xml:space="preserve">Right-Hand Isometric Squeeze</w:t>
+            </w:r>
+          </w:p>
+        </w:tc>
+        <w:tc>
+          <w:tcPr>
+            <w:tcW w:type="dxa" w:w="380"/>
+            <w:tcBorders>
+              <w:top w:val="none" w:color="FFFFFF" w:sz="0"/>
+              <w:left w:val="none" w:color="FFFFFF" w:sz="0"/>
+              <w:bottom w:val="none" w:color="FFFFFF" w:sz="0"/>
+              <w:right w:val="none" w:color="FFFFFF" w:sz="0"/>
+            </w:tcBorders>
+            <w:shd w:fill="FFF5F5" w:color="auto" w:val="clear"/>
+            <w:tcMar>
+              <w:top w:type="dxa" w:w="40"/>
+              <w:left w:type="dxa" w:w="80"/>
+              <w:bottom w:type="dxa" w:w="40"/>
+              <w:right w:type="dxa" w:w="80"/>
+            </w:tcMar>
+            <w:vAlign w:val="center"/>
+          </w:tcPr>
+          <w:p>
+            <w:pPr>
+              <w:jc w:val="center"/>
+            </w:pPr>
+            <w:r>
+              <w:rPr>
+                <w:rFonts w:ascii="Arial" w:cs="Arial" w:eastAsia="Arial" w:hAnsi="Arial"/>
+                <w:color w:val="6B6B6B"/>
+                <w:sz w:val="15"/>
+                <w:szCs w:val="15"/>
+              </w:rPr>
+              <w:t xml:space="preserve">3</w:t>
+            </w:r>
+          </w:p>
+        </w:tc>
+        <w:tc>
+          <w:tcPr>
+            <w:tcW w:type="dxa" w:w="420"/>
+            <w:tcBorders>
+              <w:top w:val="none" w:color="FFFFFF" w:sz="0"/>
+              <w:left w:val="none" w:color="FFFFFF" w:sz="0"/>
+              <w:bottom w:val="none" w:color="FFFFFF" w:sz="0"/>
+              <w:right w:val="none" w:color="FFFFFF" w:sz="0"/>
+            </w:tcBorders>
+            <w:shd w:fill="FFF5F5" w:color="auto" w:val="clear"/>
+            <w:tcMar>
+              <w:top w:type="dxa" w:w="40"/>
+              <w:left w:type="dxa" w:w="80"/>
+              <w:bottom w:type="dxa" w:w="40"/>
+              <w:right w:type="dxa" w:w="80"/>
+            </w:tcMar>
+            <w:vAlign w:val="center"/>
+          </w:tcPr>
+          <w:p>
+            <w:pPr>
+              <w:jc w:val="center"/>
+            </w:pPr>
+            <w:r>
+              <w:rPr>
+                <w:rFonts w:ascii="Arial" w:cs="Arial" w:eastAsia="Arial" w:hAnsi="Arial"/>
+                <w:color w:val="6B6B6B"/>
+                <w:sz w:val="15"/>
+                <w:szCs w:val="15"/>
+              </w:rPr>
+              <w:t xml:space="preserve">10s hold</w:t>
+            </w:r>
+          </w:p>
+        </w:tc>
+        <w:tc>
+          <w:tcPr>
+            <w:tcW w:type="dxa" w:w="680"/>
+            <w:tcBorders>
+              <w:top w:val="none" w:color="FFFFFF" w:sz="0"/>
+              <w:left w:val="none" w:color="FFFFFF" w:sz="0"/>
+              <w:bottom w:val="none" w:color="FFFFFF" w:sz="0"/>
+              <w:right w:val="none" w:color="FFFFFF" w:sz="0"/>
+            </w:tcBorders>
+            <w:shd w:fill="FFF5F5" w:color="auto" w:val="clear"/>
+            <w:tcMar>
+              <w:top w:type="dxa" w:w="40"/>
+              <w:left w:type="dxa" w:w="80"/>
+              <w:bottom w:type="dxa" w:w="40"/>
+              <w:right w:type="dxa" w:w="80"/>
+            </w:tcMar>
+            <w:vAlign w:val="center"/>
+          </w:tcPr>
+          <w:p>
+            <w:pPr>
+              <w:jc w:val="center"/>
+            </w:pPr>
+            <w:r>
+              <w:rPr>
+                <w:rFonts w:ascii="Arial" w:cs="Arial" w:eastAsia="Arial" w:hAnsi="Arial"/>
+                <w:color w:val="6B6B6B"/>
+                <w:sz w:val="15"/>
+                <w:szCs w:val="15"/>
+              </w:rPr>
+              <w:t xml:space="preserve">Ball or rolled towel — max squeeze</w:t>
+            </w:r>
+          </w:p>
+        </w:tc>
+        <w:tc>
+          <w:tcPr>
+            <w:tcW w:type="dxa" w:w="540"/>
+            <w:tcBorders>
+              <w:top w:val="none" w:color="FFFFFF" w:sz="0"/>
+              <w:left w:val="none" w:color="FFFFFF" w:sz="0"/>
+              <w:bottom w:val="none" w:color="FFFFFF" w:sz="0"/>
+              <w:right w:val="none" w:color="FFFFFF" w:sz="0"/>
+            </w:tcBorders>
+            <w:shd w:fill="FFF5F5" w:color="auto" w:val="clear"/>
+            <w:tcMar>
+              <w:top w:type="dxa" w:w="40"/>
+              <w:left w:type="dxa" w:w="80"/>
+              <w:bottom w:type="dxa" w:w="40"/>
+              <w:right w:type="dxa" w:w="80"/>
+            </w:tcMar>
+            <w:vAlign w:val="center"/>
+          </w:tcPr>
+          <w:p>
+            <w:pPr>
+              <w:jc w:val="center"/>
+            </w:pPr>
+            <w:r>
+              <w:rPr>
+                <w:rFonts w:ascii="Arial" w:cs="Arial" w:eastAsia="Arial" w:hAnsi="Arial"/>
+                <w:color w:val="6B6B6B"/>
+                <w:sz w:val="15"/>
+                <w:szCs w:val="15"/>
+              </w:rPr>
+              <w:t xml:space="preserve">Hold</w:t>
+            </w:r>
+          </w:p>
+        </w:tc>
+        <w:tc>
+          <w:tcPr>
+            <w:tcW w:type="dxa" w:w="440"/>
+            <w:tcBorders>
+              <w:top w:val="none" w:color="FFFFFF" w:sz="0"/>
+              <w:left w:val="none" w:color="FFFFFF" w:sz="0"/>
+              <w:bottom w:val="none" w:color="FFFFFF" w:sz="0"/>
+              <w:right w:val="none" w:color="FFFFFF" w:sz="0"/>
+            </w:tcBorders>
+            <w:shd w:fill="FFF5F5" w:color="auto" w:val="clear"/>
+            <w:tcMar>
+              <w:top w:type="dxa" w:w="40"/>
+              <w:left w:type="dxa" w:w="80"/>
+              <w:bottom w:type="dxa" w:w="40"/>
+              <w:right w:type="dxa" w:w="80"/>
+            </w:tcMar>
+            <w:vAlign w:val="center"/>
+          </w:tcPr>
+          <w:p>
+            <w:pPr>
+              <w:jc w:val="center"/>
+            </w:pPr>
+            <w:r>
+              <w:rPr>
+                <w:rFonts w:ascii="Arial" w:cs="Arial" w:eastAsia="Arial" w:hAnsi="Arial"/>
+                <w:color w:val="6B6B6B"/>
+                <w:sz w:val="15"/>
+                <w:szCs w:val="15"/>
+              </w:rPr>
+              <w:t xml:space="preserve">30s</w:t>
+            </w:r>
+          </w:p>
+        </w:tc>
+        <w:tc>
+          <w:tcPr>
+            <w:tcW w:type="dxa" w:w="5580"/>
+            <w:tcBorders>
+              <w:top w:val="none" w:color="FFFFFF" w:sz="0"/>
+              <w:left w:val="none" w:color="FFFFFF" w:sz="0"/>
+              <w:bottom w:val="none" w:color="FFFFFF" w:sz="0"/>
+              <w:right w:val="none" w:color="FFFFFF" w:sz="0"/>
+            </w:tcBorders>
+            <w:shd w:fill="FFF5F5" w:color="auto" w:val="clear"/>
+            <w:tcMar>
+              <w:top w:type="dxa" w:w="40"/>
+              <w:left w:type="dxa" w:w="80"/>
+              <w:bottom w:type="dxa" w:w="40"/>
+              <w:right w:type="dxa" w:w="80"/>
+            </w:tcMar>
+            <w:vAlign w:val="center"/>
+          </w:tcPr>
+          <w:p>
+            <w:r>
+              <w:rPr>
+                <w:rFonts w:ascii="Arial" w:cs="Arial" w:eastAsia="Arial" w:hAnsi="Arial"/>
+                <w:color w:val="6B6B6B"/>
+                <w:sz w:val="17"/>
+                <w:szCs w:val="17"/>
+              </w:rPr>
+              <w:t xml:space="preserve">Right hand only. Squeeze hard for 10 seconds, full rest between — wake the pathway, not fatigue it.</w:t>
+            </w:r>
+          </w:p>
+        </w:tc>
+      </w:tr>
+    </w:tbl>
+    <w:p>
+      <w:pPr>
+        <w:spacing w:after="100"/>
+      </w:pPr>
     </w:p>
     <w:p>
       <w:pPr>
@@ -6341,7 +8288,7 @@
           <w:sz w:val="17"/>
           <w:szCs w:val="17"/>
         </w:rPr>
-        <w:t xml:space="preserve">A — PRIMARY PRESS STRENGTH (PUSH)</w:t>
+        <w:t xml:space="preserve">B — PRIMARY COMPOUND — DB BENCH PRESS</w:t>
       </w:r>
     </w:p>
     <w:p>
@@ -6366,7 +8313,7 @@
           <w:sz w:val="17"/>
           <w:szCs w:val="17"/>
         </w:rPr>
-        <w:t xml:space="preserve">15 lbs/hand for the DB bench press. Wk1 keeps that load for 10–12 reps. Progress +2.5 lbs/hand every 2 weeks toward a 22.5 lbs/hand target by Week 4 — a realistic intermediary jump from a 15 lb working weight. Incline press runs slightly lighter to build the upper chest and anterior delt alongside the flat press.</w:t>
+        <w:t xml:space="preserve">15 lbs/hand for the DB bench press. Wk1 keeps that load for 10–12 reps. Progress +2.5 lbs/hand every 2 weeks toward a 22.5 lbs/hand target by Week 4 — a realistic intermediary jump from a 15 lb working weight. If the day calls for a variation, rotate between: a DB floor press (shorter range, easy on the shoulders) or a band-resisted push-up — both from her home equipment. The flat DB bench press stays the lift we track.</w:t>
       </w:r>
     </w:p>
     <w:tbl>
@@ -6866,6 +8813,74 @@
           </w:p>
         </w:tc>
       </w:tr>
+    </w:tbl>
+    <w:p>
+      <w:pPr>
+        <w:spacing w:after="100"/>
+      </w:pPr>
+    </w:p>
+    <w:p>
+      <w:pPr>
+        <w:spacing w:after="60" w:before="120"/>
+      </w:pPr>
+      <w:r>
+        <w:rPr>
+          <w:rFonts w:ascii="Arial" w:cs="Arial" w:eastAsia="Arial" w:hAnsi="Arial"/>
+          <w:b/>
+          <w:bCs/>
+          <w:color w:val="43A047"/>
+          <w:sz w:val="17"/>
+          <w:szCs w:val="17"/>
+        </w:rPr>
+        <w:t xml:space="preserve">C — ACCESSORY — PRESS &amp; PULL VOLUME</w:t>
+      </w:r>
+    </w:p>
+    <w:p>
+      <w:pPr>
+        <w:spacing w:after="80"/>
+      </w:pPr>
+      <w:r>
+        <w:rPr>
+          <w:rFonts w:ascii="Arial" w:cs="Arial" w:eastAsia="Arial" w:hAnsi="Arial"/>
+          <w:b/>
+          <w:bCs/>
+          <w:color w:val="43A047"/>
+          <w:sz w:val="17"/>
+          <w:szCs w:val="17"/>
+        </w:rPr>
+        <w:t xml:space="preserve">Why:  </w:t>
+      </w:r>
+      <w:r>
+        <w:rPr>
+          <w:rFonts w:ascii="Arial" w:cs="Arial" w:eastAsia="Arial" w:hAnsi="Arial"/>
+          <w:color w:val="2C2C2C"/>
+          <w:sz w:val="17"/>
+          <w:szCs w:val="17"/>
+        </w:rPr>
+        <w:t xml:space="preserve">The accessory volume behind the primary press: incline press runs slightly lighter to build the upper chest and anterior delt alongside the flat press, the single-arm row runs the right-arm-priority protocol, and the push-up progression builds toward full floor reps.</w:t>
+      </w:r>
+    </w:p>
+    <w:tbl>
+      <w:tblPr>
+        <w:tblW w:type="dxa" w:w="10440"/>
+        <w:tblBorders>
+          <w:top w:val="none" w:color="FFFFFF" w:sz="0"/>
+          <w:left w:val="none" w:color="FFFFFF" w:sz="0"/>
+          <w:bottom w:val="none" w:color="FFFFFF" w:sz="0"/>
+          <w:right w:val="none" w:color="FFFFFF" w:sz="0"/>
+          <w:insideH w:val="single" w:color="auto" w:sz="4"/>
+          <w:insideV w:val="single" w:color="auto" w:sz="4"/>
+        </w:tblBorders>
+      </w:tblPr>
+      <w:tblGrid>
+        <w:gridCol w:w="2400"/>
+        <w:gridCol w:w="380"/>
+        <w:gridCol w:w="420"/>
+        <w:gridCol w:w="680"/>
+        <w:gridCol w:w="540"/>
+        <w:gridCol w:w="440"/>
+        <w:gridCol w:w="5580"/>
+      </w:tblGrid>
       <w:tr>
         <w:tc>
           <w:tcPr>
@@ -6876,7 +8891,254 @@
               <w:bottom w:val="none" w:color="FFFFFF" w:sz="0"/>
               <w:right w:val="none" w:color="FFFFFF" w:sz="0"/>
             </w:tcBorders>
-            <w:shd w:fill="FFFFFF" w:color="auto" w:val="clear"/>
+            <w:shd w:fill="E8F5E9" w:color="auto" w:val="clear"/>
+            <w:tcMar>
+              <w:top w:type="dxa" w:w="40"/>
+              <w:left w:type="dxa" w:w="80"/>
+              <w:bottom w:type="dxa" w:w="40"/>
+              <w:right w:type="dxa" w:w="80"/>
+            </w:tcMar>
+            <w:vAlign w:val="center"/>
+          </w:tcPr>
+          <w:p>
+            <w:pPr>
+              <w:jc w:val="left"/>
+            </w:pPr>
+            <w:r>
+              <w:rPr>
+                <w:rFonts w:ascii="Arial" w:cs="Arial" w:eastAsia="Arial" w:hAnsi="Arial"/>
+                <w:b/>
+                <w:bCs/>
+                <w:color w:val="43A047"/>
+                <w:sz w:val="15"/>
+                <w:szCs w:val="15"/>
+              </w:rPr>
+              <w:t xml:space="preserve">EXERCISE</w:t>
+            </w:r>
+          </w:p>
+        </w:tc>
+        <w:tc>
+          <w:tcPr>
+            <w:tcW w:type="dxa" w:w="380"/>
+            <w:tcBorders>
+              <w:top w:val="none" w:color="FFFFFF" w:sz="0"/>
+              <w:left w:val="none" w:color="FFFFFF" w:sz="0"/>
+              <w:bottom w:val="none" w:color="FFFFFF" w:sz="0"/>
+              <w:right w:val="none" w:color="FFFFFF" w:sz="0"/>
+            </w:tcBorders>
+            <w:shd w:fill="E8F5E9" w:color="auto" w:val="clear"/>
+            <w:tcMar>
+              <w:top w:type="dxa" w:w="40"/>
+              <w:left w:type="dxa" w:w="80"/>
+              <w:bottom w:type="dxa" w:w="40"/>
+              <w:right w:type="dxa" w:w="80"/>
+            </w:tcMar>
+            <w:vAlign w:val="center"/>
+          </w:tcPr>
+          <w:p>
+            <w:pPr>
+              <w:jc w:val="center"/>
+            </w:pPr>
+            <w:r>
+              <w:rPr>
+                <w:rFonts w:ascii="Arial" w:cs="Arial" w:eastAsia="Arial" w:hAnsi="Arial"/>
+                <w:b/>
+                <w:bCs/>
+                <w:color w:val="43A047"/>
+                <w:sz w:val="13"/>
+                <w:szCs w:val="13"/>
+              </w:rPr>
+              <w:t xml:space="preserve">SETS</w:t>
+            </w:r>
+          </w:p>
+        </w:tc>
+        <w:tc>
+          <w:tcPr>
+            <w:tcW w:type="dxa" w:w="420"/>
+            <w:tcBorders>
+              <w:top w:val="none" w:color="FFFFFF" w:sz="0"/>
+              <w:left w:val="none" w:color="FFFFFF" w:sz="0"/>
+              <w:bottom w:val="none" w:color="FFFFFF" w:sz="0"/>
+              <w:right w:val="none" w:color="FFFFFF" w:sz="0"/>
+            </w:tcBorders>
+            <w:shd w:fill="E8F5E9" w:color="auto" w:val="clear"/>
+            <w:tcMar>
+              <w:top w:type="dxa" w:w="40"/>
+              <w:left w:type="dxa" w:w="80"/>
+              <w:bottom w:type="dxa" w:w="40"/>
+              <w:right w:type="dxa" w:w="80"/>
+            </w:tcMar>
+            <w:vAlign w:val="center"/>
+          </w:tcPr>
+          <w:p>
+            <w:pPr>
+              <w:jc w:val="center"/>
+            </w:pPr>
+            <w:r>
+              <w:rPr>
+                <w:rFonts w:ascii="Arial" w:cs="Arial" w:eastAsia="Arial" w:hAnsi="Arial"/>
+                <w:b/>
+                <w:bCs/>
+                <w:color w:val="43A047"/>
+                <w:sz w:val="13"/>
+                <w:szCs w:val="13"/>
+              </w:rPr>
+              <w:t xml:space="preserve">REPS</w:t>
+            </w:r>
+          </w:p>
+        </w:tc>
+        <w:tc>
+          <w:tcPr>
+            <w:tcW w:type="dxa" w:w="680"/>
+            <w:tcBorders>
+              <w:top w:val="none" w:color="FFFFFF" w:sz="0"/>
+              <w:left w:val="none" w:color="FFFFFF" w:sz="0"/>
+              <w:bottom w:val="none" w:color="FFFFFF" w:sz="0"/>
+              <w:right w:val="none" w:color="FFFFFF" w:sz="0"/>
+            </w:tcBorders>
+            <w:shd w:fill="E8F5E9" w:color="auto" w:val="clear"/>
+            <w:tcMar>
+              <w:top w:type="dxa" w:w="40"/>
+              <w:left w:type="dxa" w:w="80"/>
+              <w:bottom w:type="dxa" w:w="40"/>
+              <w:right w:type="dxa" w:w="80"/>
+            </w:tcMar>
+            <w:vAlign w:val="center"/>
+          </w:tcPr>
+          <w:p>
+            <w:pPr>
+              <w:jc w:val="center"/>
+            </w:pPr>
+            <w:r>
+              <w:rPr>
+                <w:rFonts w:ascii="Arial" w:cs="Arial" w:eastAsia="Arial" w:hAnsi="Arial"/>
+                <w:b/>
+                <w:bCs/>
+                <w:color w:val="43A047"/>
+                <w:sz w:val="13"/>
+                <w:szCs w:val="13"/>
+              </w:rPr>
+              <w:t xml:space="preserve">LOAD</w:t>
+            </w:r>
+          </w:p>
+        </w:tc>
+        <w:tc>
+          <w:tcPr>
+            <w:tcW w:type="dxa" w:w="540"/>
+            <w:tcBorders>
+              <w:top w:val="none" w:color="FFFFFF" w:sz="0"/>
+              <w:left w:val="none" w:color="FFFFFF" w:sz="0"/>
+              <w:bottom w:val="none" w:color="FFFFFF" w:sz="0"/>
+              <w:right w:val="none" w:color="FFFFFF" w:sz="0"/>
+            </w:tcBorders>
+            <w:shd w:fill="E8F5E9" w:color="auto" w:val="clear"/>
+            <w:tcMar>
+              <w:top w:type="dxa" w:w="40"/>
+              <w:left w:type="dxa" w:w="80"/>
+              <w:bottom w:type="dxa" w:w="40"/>
+              <w:right w:type="dxa" w:w="80"/>
+            </w:tcMar>
+            <w:vAlign w:val="center"/>
+          </w:tcPr>
+          <w:p>
+            <w:pPr>
+              <w:jc w:val="center"/>
+            </w:pPr>
+            <w:r>
+              <w:rPr>
+                <w:rFonts w:ascii="Arial" w:cs="Arial" w:eastAsia="Arial" w:hAnsi="Arial"/>
+                <w:b/>
+                <w:bCs/>
+                <w:color w:val="43A047"/>
+                <w:sz w:val="13"/>
+                <w:szCs w:val="13"/>
+              </w:rPr>
+              <w:t xml:space="preserve">TEMPO</w:t>
+            </w:r>
+          </w:p>
+        </w:tc>
+        <w:tc>
+          <w:tcPr>
+            <w:tcW w:type="dxa" w:w="440"/>
+            <w:tcBorders>
+              <w:top w:val="none" w:color="FFFFFF" w:sz="0"/>
+              <w:left w:val="none" w:color="FFFFFF" w:sz="0"/>
+              <w:bottom w:val="none" w:color="FFFFFF" w:sz="0"/>
+              <w:right w:val="none" w:color="FFFFFF" w:sz="0"/>
+            </w:tcBorders>
+            <w:shd w:fill="E8F5E9" w:color="auto" w:val="clear"/>
+            <w:tcMar>
+              <w:top w:type="dxa" w:w="40"/>
+              <w:left w:type="dxa" w:w="80"/>
+              <w:bottom w:type="dxa" w:w="40"/>
+              <w:right w:type="dxa" w:w="80"/>
+            </w:tcMar>
+            <w:vAlign w:val="center"/>
+          </w:tcPr>
+          <w:p>
+            <w:pPr>
+              <w:jc w:val="center"/>
+            </w:pPr>
+            <w:r>
+              <w:rPr>
+                <w:rFonts w:ascii="Arial" w:cs="Arial" w:eastAsia="Arial" w:hAnsi="Arial"/>
+                <w:b/>
+                <w:bCs/>
+                <w:color w:val="43A047"/>
+                <w:sz w:val="13"/>
+                <w:szCs w:val="13"/>
+              </w:rPr>
+              <w:t xml:space="preserve">REST</w:t>
+            </w:r>
+          </w:p>
+        </w:tc>
+        <w:tc>
+          <w:tcPr>
+            <w:tcW w:type="dxa" w:w="5580"/>
+            <w:tcBorders>
+              <w:top w:val="none" w:color="FFFFFF" w:sz="0"/>
+              <w:left w:val="none" w:color="FFFFFF" w:sz="0"/>
+              <w:bottom w:val="none" w:color="FFFFFF" w:sz="0"/>
+              <w:right w:val="none" w:color="FFFFFF" w:sz="0"/>
+            </w:tcBorders>
+            <w:shd w:fill="E8F5E9" w:color="auto" w:val="clear"/>
+            <w:tcMar>
+              <w:top w:type="dxa" w:w="40"/>
+              <w:left w:type="dxa" w:w="80"/>
+              <w:bottom w:type="dxa" w:w="40"/>
+              <w:right w:type="dxa" w:w="80"/>
+            </w:tcMar>
+            <w:vAlign w:val="center"/>
+          </w:tcPr>
+          <w:p>
+            <w:pPr>
+              <w:jc w:val="left"/>
+            </w:pPr>
+            <w:r>
+              <w:rPr>
+                <w:rFonts w:ascii="Arial" w:cs="Arial" w:eastAsia="Arial" w:hAnsi="Arial"/>
+                <w:b/>
+                <w:bCs/>
+                <w:color w:val="43A047"/>
+                <w:sz w:val="15"/>
+                <w:szCs w:val="15"/>
+              </w:rPr>
+              <w:t xml:space="preserve">COACHING CUE</w:t>
+            </w:r>
+          </w:p>
+        </w:tc>
+      </w:tr>
+      <w:tr>
+        <w:tc>
+          <w:tcPr>
+            <w:tcW w:type="dxa" w:w="2400"/>
+            <w:tcBorders>
+              <w:top w:val="none" w:color="FFFFFF" w:sz="0"/>
+              <w:left w:val="none" w:color="FFFFFF" w:sz="0"/>
+              <w:bottom w:val="none" w:color="FFFFFF" w:sz="0"/>
+              <w:right w:val="none" w:color="FFFFFF" w:sz="0"/>
+            </w:tcBorders>
+            <w:shd w:fill="F1F8F2" w:color="auto" w:val="clear"/>
             <w:tcMar>
               <w:top w:type="dxa" w:w="40"/>
               <w:left w:type="dxa" w:w="80"/>
@@ -6908,7 +9170,7 @@
               <w:bottom w:val="none" w:color="FFFFFF" w:sz="0"/>
               <w:right w:val="none" w:color="FFFFFF" w:sz="0"/>
             </w:tcBorders>
-            <w:shd w:fill="FFFFFF" w:color="auto" w:val="clear"/>
+            <w:shd w:fill="F1F8F2" w:color="auto" w:val="clear"/>
             <w:tcMar>
               <w:top w:type="dxa" w:w="40"/>
               <w:left w:type="dxa" w:w="80"/>
@@ -6941,7 +9203,7 @@
               <w:bottom w:val="none" w:color="FFFFFF" w:sz="0"/>
               <w:right w:val="none" w:color="FFFFFF" w:sz="0"/>
             </w:tcBorders>
-            <w:shd w:fill="FFFFFF" w:color="auto" w:val="clear"/>
+            <w:shd w:fill="F1F8F2" w:color="auto" w:val="clear"/>
             <w:tcMar>
               <w:top w:type="dxa" w:w="40"/>
               <w:left w:type="dxa" w:w="80"/>
@@ -6974,7 +9236,7 @@
               <w:bottom w:val="none" w:color="FFFFFF" w:sz="0"/>
               <w:right w:val="none" w:color="FFFFFF" w:sz="0"/>
             </w:tcBorders>
-            <w:shd w:fill="FFFFFF" w:color="auto" w:val="clear"/>
+            <w:shd w:fill="F1F8F2" w:color="auto" w:val="clear"/>
             <w:tcMar>
               <w:top w:type="dxa" w:w="40"/>
               <w:left w:type="dxa" w:w="80"/>
@@ -7007,7 +9269,7 @@
               <w:bottom w:val="none" w:color="FFFFFF" w:sz="0"/>
               <w:right w:val="none" w:color="FFFFFF" w:sz="0"/>
             </w:tcBorders>
-            <w:shd w:fill="FFFFFF" w:color="auto" w:val="clear"/>
+            <w:shd w:fill="F1F8F2" w:color="auto" w:val="clear"/>
             <w:tcMar>
               <w:top w:type="dxa" w:w="40"/>
               <w:left w:type="dxa" w:w="80"/>
@@ -7040,7 +9302,7 @@
               <w:bottom w:val="none" w:color="FFFFFF" w:sz="0"/>
               <w:right w:val="none" w:color="FFFFFF" w:sz="0"/>
             </w:tcBorders>
-            <w:shd w:fill="FFFFFF" w:color="auto" w:val="clear"/>
+            <w:shd w:fill="F1F8F2" w:color="auto" w:val="clear"/>
             <w:tcMar>
               <w:top w:type="dxa" w:w="40"/>
               <w:left w:type="dxa" w:w="80"/>
@@ -7073,7 +9335,7 @@
               <w:bottom w:val="none" w:color="FFFFFF" w:sz="0"/>
               <w:right w:val="none" w:color="FFFFFF" w:sz="0"/>
             </w:tcBorders>
-            <w:shd w:fill="FFFFFF" w:color="auto" w:val="clear"/>
+            <w:shd w:fill="F1F8F2" w:color="auto" w:val="clear"/>
             <w:tcMar>
               <w:top w:type="dxa" w:w="40"/>
               <w:left w:type="dxa" w:w="80"/>
@@ -7105,7 +9367,7 @@
               <w:bottom w:val="none" w:color="FFFFFF" w:sz="0"/>
               <w:right w:val="none" w:color="FFFFFF" w:sz="0"/>
             </w:tcBorders>
-            <w:shd w:fill="F1F8F2" w:color="auto" w:val="clear"/>
+            <w:shd w:fill="FFFFFF" w:color="auto" w:val="clear"/>
             <w:tcMar>
               <w:top w:type="dxa" w:w="40"/>
               <w:left w:type="dxa" w:w="80"/>
@@ -7150,7 +9412,7 @@
               <w:bottom w:val="none" w:color="FFFFFF" w:sz="0"/>
               <w:right w:val="none" w:color="FFFFFF" w:sz="0"/>
             </w:tcBorders>
-            <w:shd w:fill="F1F8F2" w:color="auto" w:val="clear"/>
+            <w:shd w:fill="FFFFFF" w:color="auto" w:val="clear"/>
             <w:tcMar>
               <w:top w:type="dxa" w:w="40"/>
               <w:left w:type="dxa" w:w="80"/>
@@ -7183,7 +9445,7 @@
               <w:bottom w:val="none" w:color="FFFFFF" w:sz="0"/>
               <w:right w:val="none" w:color="FFFFFF" w:sz="0"/>
             </w:tcBorders>
-            <w:shd w:fill="F1F8F2" w:color="auto" w:val="clear"/>
+            <w:shd w:fill="FFFFFF" w:color="auto" w:val="clear"/>
             <w:tcMar>
               <w:top w:type="dxa" w:w="40"/>
               <w:left w:type="dxa" w:w="80"/>
@@ -7216,7 +9478,7 @@
               <w:bottom w:val="none" w:color="FFFFFF" w:sz="0"/>
               <w:right w:val="none" w:color="FFFFFF" w:sz="0"/>
             </w:tcBorders>
-            <w:shd w:fill="F1F8F2" w:color="auto" w:val="clear"/>
+            <w:shd w:fill="FFFFFF" w:color="auto" w:val="clear"/>
             <w:tcMar>
               <w:top w:type="dxa" w:w="40"/>
               <w:left w:type="dxa" w:w="80"/>
@@ -7249,7 +9511,7 @@
               <w:bottom w:val="none" w:color="FFFFFF" w:sz="0"/>
               <w:right w:val="none" w:color="FFFFFF" w:sz="0"/>
             </w:tcBorders>
-            <w:shd w:fill="F1F8F2" w:color="auto" w:val="clear"/>
+            <w:shd w:fill="FFFFFF" w:color="auto" w:val="clear"/>
             <w:tcMar>
               <w:top w:type="dxa" w:w="40"/>
               <w:left w:type="dxa" w:w="80"/>
@@ -7282,7 +9544,7 @@
               <w:bottom w:val="none" w:color="FFFFFF" w:sz="0"/>
               <w:right w:val="none" w:color="FFFFFF" w:sz="0"/>
             </w:tcBorders>
-            <w:shd w:fill="F1F8F2" w:color="auto" w:val="clear"/>
+            <w:shd w:fill="FFFFFF" w:color="auto" w:val="clear"/>
             <w:tcMar>
               <w:top w:type="dxa" w:w="40"/>
               <w:left w:type="dxa" w:w="80"/>
@@ -7315,7 +9577,7 @@
               <w:bottom w:val="none" w:color="FFFFFF" w:sz="0"/>
               <w:right w:val="none" w:color="FFFFFF" w:sz="0"/>
             </w:tcBorders>
-            <w:shd w:fill="F1F8F2" w:color="auto" w:val="clear"/>
+            <w:shd w:fill="FFFFFF" w:color="auto" w:val="clear"/>
             <w:tcMar>
               <w:top w:type="dxa" w:w="40"/>
               <w:left w:type="dxa" w:w="80"/>
@@ -7347,7 +9609,7 @@
               <w:bottom w:val="none" w:color="FFFFFF" w:sz="0"/>
               <w:right w:val="none" w:color="FFFFFF" w:sz="0"/>
             </w:tcBorders>
-            <w:shd w:fill="FFFFFF" w:color="auto" w:val="clear"/>
+            <w:shd w:fill="F1F8F2" w:color="auto" w:val="clear"/>
             <w:tcMar>
               <w:top w:type="dxa" w:w="40"/>
               <w:left w:type="dxa" w:w="80"/>
@@ -7379,7 +9641,7 @@
               <w:bottom w:val="none" w:color="FFFFFF" w:sz="0"/>
               <w:right w:val="none" w:color="FFFFFF" w:sz="0"/>
             </w:tcBorders>
-            <w:shd w:fill="FFFFFF" w:color="auto" w:val="clear"/>
+            <w:shd w:fill="F1F8F2" w:color="auto" w:val="clear"/>
             <w:tcMar>
               <w:top w:type="dxa" w:w="40"/>
               <w:left w:type="dxa" w:w="80"/>
@@ -7412,7 +9674,7 @@
               <w:bottom w:val="none" w:color="FFFFFF" w:sz="0"/>
               <w:right w:val="none" w:color="FFFFFF" w:sz="0"/>
             </w:tcBorders>
-            <w:shd w:fill="FFFFFF" w:color="auto" w:val="clear"/>
+            <w:shd w:fill="F1F8F2" w:color="auto" w:val="clear"/>
             <w:tcMar>
               <w:top w:type="dxa" w:w="40"/>
               <w:left w:type="dxa" w:w="80"/>
@@ -7445,7 +9707,7 @@
               <w:bottom w:val="none" w:color="FFFFFF" w:sz="0"/>
               <w:right w:val="none" w:color="FFFFFF" w:sz="0"/>
             </w:tcBorders>
-            <w:shd w:fill="FFFFFF" w:color="auto" w:val="clear"/>
+            <w:shd w:fill="F1F8F2" w:color="auto" w:val="clear"/>
             <w:tcMar>
               <w:top w:type="dxa" w:w="40"/>
               <w:left w:type="dxa" w:w="80"/>
@@ -7478,7 +9740,7 @@
               <w:bottom w:val="none" w:color="FFFFFF" w:sz="0"/>
               <w:right w:val="none" w:color="FFFFFF" w:sz="0"/>
             </w:tcBorders>
-            <w:shd w:fill="FFFFFF" w:color="auto" w:val="clear"/>
+            <w:shd w:fill="F1F8F2" w:color="auto" w:val="clear"/>
             <w:tcMar>
               <w:top w:type="dxa" w:w="40"/>
               <w:left w:type="dxa" w:w="80"/>
@@ -7511,7 +9773,7 @@
               <w:bottom w:val="none" w:color="FFFFFF" w:sz="0"/>
               <w:right w:val="none" w:color="FFFFFF" w:sz="0"/>
             </w:tcBorders>
-            <w:shd w:fill="FFFFFF" w:color="auto" w:val="clear"/>
+            <w:shd w:fill="F1F8F2" w:color="auto" w:val="clear"/>
             <w:tcMar>
               <w:top w:type="dxa" w:w="40"/>
               <w:left w:type="dxa" w:w="80"/>
@@ -7544,7 +9806,7 @@
               <w:bottom w:val="none" w:color="FFFFFF" w:sz="0"/>
               <w:right w:val="none" w:color="FFFFFF" w:sz="0"/>
             </w:tcBorders>
-            <w:shd w:fill="FFFFFF" w:color="auto" w:val="clear"/>
+            <w:shd w:fill="F1F8F2" w:color="auto" w:val="clear"/>
             <w:tcMar>
               <w:top w:type="dxa" w:w="40"/>
               <w:left w:type="dxa" w:w="80"/>
@@ -7585,7 +9847,7 @@
           <w:sz w:val="17"/>
           <w:szCs w:val="17"/>
         </w:rPr>
-        <w:t xml:space="preserve">B — PRIMARY PULL STRENGTH</w:t>
+        <w:t xml:space="preserve">D — SECONDARY COMPOUND — OVERHEAD PRESS &amp; PULL</w:t>
       </w:r>
     </w:p>
     <w:p>
@@ -7610,7 +9872,7 @@
           <w:sz w:val="17"/>
           <w:szCs w:val="17"/>
         </w:rPr>
-        <w:t xml:space="preserve">OHP baseline is 15 lbs/hand, progressing +2.5 lbs/hand every 2 weeks toward 22.5 lbs/hand by Week 4 — same rate as the bench press. Force data shows right grip 29.5% weaker (55 lb vs 78 lb) and 14.8% slower time-to-peak — right arm leads sequencing on every pulling exercise below and starts each load lighter than left. Row baseline: L 35 / R 30 lbs Wk1, adding 2.5 lbs/hand every 2 weeks toward symmetry. Renegade row and rear delt fly reinforce the same pull pattern and neural-delay protocol without a cable machine.</w:t>
+        <w:t xml:space="preserve">The day's second compound pattern — the overhead press, with the pulling volume that balances it. OHP baseline is 15 lbs/hand, progressing +2.5 lbs/hand every 2 weeks toward 22.5 lbs/hand by Week 4 — same rate as the bench press. If the day calls for a press variation, rotate between: a seated DB press (bench back support), a half-kneeling single-arm DB press, or a band overhead press — all from her home equipment; the standing/seated DB press stays the lift we track. Force data shows right grip 29.5% weaker (55 lb vs 78 lb) and 14.8% slower time-to-peak — right arm leads sequencing on every pulling exercise below and starts each load lighter than left. Row baseline: L 35 / R 30 lbs Wk1, adding 2.5 lbs/hand every 2 weeks toward symmetry. Renegade row and rear delt fly reinforce the same pull pattern and neural-delay protocol without a cable machine.</w:t>
       </w:r>
     </w:p>
     <w:tbl>
@@ -8816,7 +11078,7 @@
           <w:sz w:val="17"/>
           <w:szCs w:val="17"/>
         </w:rPr>
-        <w:t xml:space="preserve">C — LOADED CARRY + CORE</w:t>
+        <w:t xml:space="preserve">E — FULL-BODY INTEGRATION — LOADED CARRY + CORE</w:t>
       </w:r>
     </w:p>
     <w:p>
@@ -8841,7 +11103,7 @@
           <w:sz w:val="17"/>
           <w:szCs w:val="17"/>
         </w:rPr>
-        <w:t xml:space="preserve">40 lbs/hand. +5 lbs/hand per week. Week 4 target: 55 lbs/hand. Farmer carry is the single most reliable strength and grip builder in this program. Shoulders packed, chest tall, neutral neck. Camera side-on to check posture drift.</w:t>
+        <w:t xml:space="preserve">The session's closing compound work — the day's pressing posture, pulling strength, and grip pulled together under gait, then core under load. 40 lbs/hand. +5 lbs/hand per week. Week 4 target: 55 lbs/hand. Farmer carry is the single most reliable strength and grip builder in this program. Shoulders packed, chest tall, neutral neck. Camera side-on to check posture drift. A goblet carry (one DB at the chest) covers the same ground as a lighter variation; the right-hand load rules below hold on every option.</w:t>
       </w:r>
     </w:p>
     <w:tbl>
@@ -10378,7 +12640,7 @@
           <w:sz w:val="17"/>
           <w:szCs w:val="17"/>
         </w:rPr>
-        <w:t xml:space="preserve">3 min treadmill moderate pace (full-body activation before power work). CORRECTIVE: Right hand isometric squeeze 10s ×3 (right grip neural delay). Left hip single-leg bridge 2×12 (left glute priority for hip extension gap). Then: leg swings 10 each, arm circles, hip circles, light KB deadhinge 2×10, med ball chest pass to wall 2×8 explosive.</w:t>
+        <w:t xml:space="preserve">3 min treadmill moderate pace (full-body activation before power work). Then: leg swings 10 each, arm circles, hip circles, med ball chest pass to wall 2×8 explosive (potentiation primer). The corrective neural priming opens Block A below.</w:t>
       </w:r>
     </w:p>
     <w:p>
@@ -10394,7 +12656,1020 @@
           <w:sz w:val="17"/>
           <w:szCs w:val="17"/>
         </w:rPr>
-        <w:t xml:space="preserve">A — KB POWER BLOCK</w:t>
+        <w:t xml:space="preserve">A — CORRECTIVE — NEURAL PRIMING (RIGHT GRIP + LEFT HIP)</w:t>
+      </w:r>
+    </w:p>
+    <w:p>
+      <w:pPr>
+        <w:spacing w:after="80"/>
+      </w:pPr>
+      <w:r>
+        <w:rPr>
+          <w:rFonts w:ascii="Arial" w:cs="Arial" w:eastAsia="Arial" w:hAnsi="Arial"/>
+          <w:b/>
+          <w:bCs/>
+          <w:color w:val="E53935"/>
+          <w:sz w:val="17"/>
+          <w:szCs w:val="17"/>
+        </w:rPr>
+        <w:t xml:space="preserve">Why:  </w:t>
+      </w:r>
+      <w:r>
+        <w:rPr>
+          <w:rFonts w:ascii="Arial" w:cs="Arial" w:eastAsia="Arial" w:hAnsi="Arial"/>
+          <w:color w:val="2C2C2C"/>
+          <w:sz w:val="17"/>
+          <w:szCs w:val="17"/>
+        </w:rPr>
+        <w:t xml:space="preserve">Both force-assessment protocols fire before the week's highest-demand session: the right-hand squeeze primes the slower-firing right grip for the KB and carry work, the light hinge ramp rehearses the swing pattern without spending power, and the left-side bridge wakes the priority glute before the hips drive everything below.</w:t>
+      </w:r>
+    </w:p>
+    <w:tbl>
+      <w:tblPr>
+        <w:tblW w:type="dxa" w:w="10440"/>
+        <w:tblBorders>
+          <w:top w:val="none" w:color="FFFFFF" w:sz="0"/>
+          <w:left w:val="none" w:color="FFFFFF" w:sz="0"/>
+          <w:bottom w:val="none" w:color="FFFFFF" w:sz="0"/>
+          <w:right w:val="none" w:color="FFFFFF" w:sz="0"/>
+          <w:insideH w:val="single" w:color="auto" w:sz="4"/>
+          <w:insideV w:val="single" w:color="auto" w:sz="4"/>
+        </w:tblBorders>
+      </w:tblPr>
+      <w:tblGrid>
+        <w:gridCol w:w="2400"/>
+        <w:gridCol w:w="380"/>
+        <w:gridCol w:w="420"/>
+        <w:gridCol w:w="680"/>
+        <w:gridCol w:w="540"/>
+        <w:gridCol w:w="440"/>
+        <w:gridCol w:w="5580"/>
+      </w:tblGrid>
+      <w:tr>
+        <w:tc>
+          <w:tcPr>
+            <w:tcW w:type="dxa" w:w="2400"/>
+            <w:tcBorders>
+              <w:top w:val="none" w:color="FFFFFF" w:sz="0"/>
+              <w:left w:val="none" w:color="FFFFFF" w:sz="0"/>
+              <w:bottom w:val="none" w:color="FFFFFF" w:sz="0"/>
+              <w:right w:val="none" w:color="FFFFFF" w:sz="0"/>
+            </w:tcBorders>
+            <w:shd w:fill="FFEBEE" w:color="auto" w:val="clear"/>
+            <w:tcMar>
+              <w:top w:type="dxa" w:w="40"/>
+              <w:left w:type="dxa" w:w="80"/>
+              <w:bottom w:type="dxa" w:w="40"/>
+              <w:right w:type="dxa" w:w="80"/>
+            </w:tcMar>
+            <w:vAlign w:val="center"/>
+          </w:tcPr>
+          <w:p>
+            <w:pPr>
+              <w:jc w:val="left"/>
+            </w:pPr>
+            <w:r>
+              <w:rPr>
+                <w:rFonts w:ascii="Arial" w:cs="Arial" w:eastAsia="Arial" w:hAnsi="Arial"/>
+                <w:b/>
+                <w:bCs/>
+                <w:color w:val="E53935"/>
+                <w:sz w:val="15"/>
+                <w:szCs w:val="15"/>
+              </w:rPr>
+              <w:t xml:space="preserve">EXERCISE</w:t>
+            </w:r>
+          </w:p>
+        </w:tc>
+        <w:tc>
+          <w:tcPr>
+            <w:tcW w:type="dxa" w:w="380"/>
+            <w:tcBorders>
+              <w:top w:val="none" w:color="FFFFFF" w:sz="0"/>
+              <w:left w:val="none" w:color="FFFFFF" w:sz="0"/>
+              <w:bottom w:val="none" w:color="FFFFFF" w:sz="0"/>
+              <w:right w:val="none" w:color="FFFFFF" w:sz="0"/>
+            </w:tcBorders>
+            <w:shd w:fill="FFEBEE" w:color="auto" w:val="clear"/>
+            <w:tcMar>
+              <w:top w:type="dxa" w:w="40"/>
+              <w:left w:type="dxa" w:w="80"/>
+              <w:bottom w:type="dxa" w:w="40"/>
+              <w:right w:type="dxa" w:w="80"/>
+            </w:tcMar>
+            <w:vAlign w:val="center"/>
+          </w:tcPr>
+          <w:p>
+            <w:pPr>
+              <w:jc w:val="center"/>
+            </w:pPr>
+            <w:r>
+              <w:rPr>
+                <w:rFonts w:ascii="Arial" w:cs="Arial" w:eastAsia="Arial" w:hAnsi="Arial"/>
+                <w:b/>
+                <w:bCs/>
+                <w:color w:val="E53935"/>
+                <w:sz w:val="13"/>
+                <w:szCs w:val="13"/>
+              </w:rPr>
+              <w:t xml:space="preserve">SETS</w:t>
+            </w:r>
+          </w:p>
+        </w:tc>
+        <w:tc>
+          <w:tcPr>
+            <w:tcW w:type="dxa" w:w="420"/>
+            <w:tcBorders>
+              <w:top w:val="none" w:color="FFFFFF" w:sz="0"/>
+              <w:left w:val="none" w:color="FFFFFF" w:sz="0"/>
+              <w:bottom w:val="none" w:color="FFFFFF" w:sz="0"/>
+              <w:right w:val="none" w:color="FFFFFF" w:sz="0"/>
+            </w:tcBorders>
+            <w:shd w:fill="FFEBEE" w:color="auto" w:val="clear"/>
+            <w:tcMar>
+              <w:top w:type="dxa" w:w="40"/>
+              <w:left w:type="dxa" w:w="80"/>
+              <w:bottom w:type="dxa" w:w="40"/>
+              <w:right w:type="dxa" w:w="80"/>
+            </w:tcMar>
+            <w:vAlign w:val="center"/>
+          </w:tcPr>
+          <w:p>
+            <w:pPr>
+              <w:jc w:val="center"/>
+            </w:pPr>
+            <w:r>
+              <w:rPr>
+                <w:rFonts w:ascii="Arial" w:cs="Arial" w:eastAsia="Arial" w:hAnsi="Arial"/>
+                <w:b/>
+                <w:bCs/>
+                <w:color w:val="E53935"/>
+                <w:sz w:val="13"/>
+                <w:szCs w:val="13"/>
+              </w:rPr>
+              <w:t xml:space="preserve">REPS</w:t>
+            </w:r>
+          </w:p>
+        </w:tc>
+        <w:tc>
+          <w:tcPr>
+            <w:tcW w:type="dxa" w:w="680"/>
+            <w:tcBorders>
+              <w:top w:val="none" w:color="FFFFFF" w:sz="0"/>
+              <w:left w:val="none" w:color="FFFFFF" w:sz="0"/>
+              <w:bottom w:val="none" w:color="FFFFFF" w:sz="0"/>
+              <w:right w:val="none" w:color="FFFFFF" w:sz="0"/>
+            </w:tcBorders>
+            <w:shd w:fill="FFEBEE" w:color="auto" w:val="clear"/>
+            <w:tcMar>
+              <w:top w:type="dxa" w:w="40"/>
+              <w:left w:type="dxa" w:w="80"/>
+              <w:bottom w:type="dxa" w:w="40"/>
+              <w:right w:type="dxa" w:w="80"/>
+            </w:tcMar>
+            <w:vAlign w:val="center"/>
+          </w:tcPr>
+          <w:p>
+            <w:pPr>
+              <w:jc w:val="center"/>
+            </w:pPr>
+            <w:r>
+              <w:rPr>
+                <w:rFonts w:ascii="Arial" w:cs="Arial" w:eastAsia="Arial" w:hAnsi="Arial"/>
+                <w:b/>
+                <w:bCs/>
+                <w:color w:val="E53935"/>
+                <w:sz w:val="13"/>
+                <w:szCs w:val="13"/>
+              </w:rPr>
+              <w:t xml:space="preserve">LOAD</w:t>
+            </w:r>
+          </w:p>
+        </w:tc>
+        <w:tc>
+          <w:tcPr>
+            <w:tcW w:type="dxa" w:w="540"/>
+            <w:tcBorders>
+              <w:top w:val="none" w:color="FFFFFF" w:sz="0"/>
+              <w:left w:val="none" w:color="FFFFFF" w:sz="0"/>
+              <w:bottom w:val="none" w:color="FFFFFF" w:sz="0"/>
+              <w:right w:val="none" w:color="FFFFFF" w:sz="0"/>
+            </w:tcBorders>
+            <w:shd w:fill="FFEBEE" w:color="auto" w:val="clear"/>
+            <w:tcMar>
+              <w:top w:type="dxa" w:w="40"/>
+              <w:left w:type="dxa" w:w="80"/>
+              <w:bottom w:type="dxa" w:w="40"/>
+              <w:right w:type="dxa" w:w="80"/>
+            </w:tcMar>
+            <w:vAlign w:val="center"/>
+          </w:tcPr>
+          <w:p>
+            <w:pPr>
+              <w:jc w:val="center"/>
+            </w:pPr>
+            <w:r>
+              <w:rPr>
+                <w:rFonts w:ascii="Arial" w:cs="Arial" w:eastAsia="Arial" w:hAnsi="Arial"/>
+                <w:b/>
+                <w:bCs/>
+                <w:color w:val="E53935"/>
+                <w:sz w:val="13"/>
+                <w:szCs w:val="13"/>
+              </w:rPr>
+              <w:t xml:space="preserve">TEMPO</w:t>
+            </w:r>
+          </w:p>
+        </w:tc>
+        <w:tc>
+          <w:tcPr>
+            <w:tcW w:type="dxa" w:w="440"/>
+            <w:tcBorders>
+              <w:top w:val="none" w:color="FFFFFF" w:sz="0"/>
+              <w:left w:val="none" w:color="FFFFFF" w:sz="0"/>
+              <w:bottom w:val="none" w:color="FFFFFF" w:sz="0"/>
+              <w:right w:val="none" w:color="FFFFFF" w:sz="0"/>
+            </w:tcBorders>
+            <w:shd w:fill="FFEBEE" w:color="auto" w:val="clear"/>
+            <w:tcMar>
+              <w:top w:type="dxa" w:w="40"/>
+              <w:left w:type="dxa" w:w="80"/>
+              <w:bottom w:type="dxa" w:w="40"/>
+              <w:right w:type="dxa" w:w="80"/>
+            </w:tcMar>
+            <w:vAlign w:val="center"/>
+          </w:tcPr>
+          <w:p>
+            <w:pPr>
+              <w:jc w:val="center"/>
+            </w:pPr>
+            <w:r>
+              <w:rPr>
+                <w:rFonts w:ascii="Arial" w:cs="Arial" w:eastAsia="Arial" w:hAnsi="Arial"/>
+                <w:b/>
+                <w:bCs/>
+                <w:color w:val="E53935"/>
+                <w:sz w:val="13"/>
+                <w:szCs w:val="13"/>
+              </w:rPr>
+              <w:t xml:space="preserve">REST</w:t>
+            </w:r>
+          </w:p>
+        </w:tc>
+        <w:tc>
+          <w:tcPr>
+            <w:tcW w:type="dxa" w:w="5580"/>
+            <w:tcBorders>
+              <w:top w:val="none" w:color="FFFFFF" w:sz="0"/>
+              <w:left w:val="none" w:color="FFFFFF" w:sz="0"/>
+              <w:bottom w:val="none" w:color="FFFFFF" w:sz="0"/>
+              <w:right w:val="none" w:color="FFFFFF" w:sz="0"/>
+            </w:tcBorders>
+            <w:shd w:fill="FFEBEE" w:color="auto" w:val="clear"/>
+            <w:tcMar>
+              <w:top w:type="dxa" w:w="40"/>
+              <w:left w:type="dxa" w:w="80"/>
+              <w:bottom w:type="dxa" w:w="40"/>
+              <w:right w:type="dxa" w:w="80"/>
+            </w:tcMar>
+            <w:vAlign w:val="center"/>
+          </w:tcPr>
+          <w:p>
+            <w:pPr>
+              <w:jc w:val="left"/>
+            </w:pPr>
+            <w:r>
+              <w:rPr>
+                <w:rFonts w:ascii="Arial" w:cs="Arial" w:eastAsia="Arial" w:hAnsi="Arial"/>
+                <w:b/>
+                <w:bCs/>
+                <w:color w:val="E53935"/>
+                <w:sz w:val="15"/>
+                <w:szCs w:val="15"/>
+              </w:rPr>
+              <w:t xml:space="preserve">COACHING CUE</w:t>
+            </w:r>
+          </w:p>
+        </w:tc>
+      </w:tr>
+      <w:tr>
+        <w:tc>
+          <w:tcPr>
+            <w:tcW w:type="dxa" w:w="2400"/>
+            <w:tcBorders>
+              <w:top w:val="none" w:color="FFFFFF" w:sz="0"/>
+              <w:left w:val="none" w:color="FFFFFF" w:sz="0"/>
+              <w:bottom w:val="none" w:color="FFFFFF" w:sz="0"/>
+              <w:right w:val="none" w:color="FFFFFF" w:sz="0"/>
+            </w:tcBorders>
+            <w:shd w:fill="FFF5F5" w:color="auto" w:val="clear"/>
+            <w:tcMar>
+              <w:top w:type="dxa" w:w="40"/>
+              <w:left w:type="dxa" w:w="80"/>
+              <w:bottom w:type="dxa" w:w="40"/>
+              <w:right w:type="dxa" w:w="80"/>
+            </w:tcMar>
+            <w:vAlign w:val="center"/>
+          </w:tcPr>
+          <w:p>
+            <w:r>
+              <w:rPr>
+                <w:rFonts w:ascii="Arial" w:cs="Arial" w:eastAsia="Arial" w:hAnsi="Arial"/>
+                <w:b/>
+                <w:bCs/>
+                <w:color w:val="2C2C2C"/>
+                <w:sz w:val="18"/>
+                <w:szCs w:val="18"/>
+              </w:rPr>
+              <w:t xml:space="preserve">Right-Hand Isometric Squeeze</w:t>
+            </w:r>
+          </w:p>
+        </w:tc>
+        <w:tc>
+          <w:tcPr>
+            <w:tcW w:type="dxa" w:w="380"/>
+            <w:tcBorders>
+              <w:top w:val="none" w:color="FFFFFF" w:sz="0"/>
+              <w:left w:val="none" w:color="FFFFFF" w:sz="0"/>
+              <w:bottom w:val="none" w:color="FFFFFF" w:sz="0"/>
+              <w:right w:val="none" w:color="FFFFFF" w:sz="0"/>
+            </w:tcBorders>
+            <w:shd w:fill="FFF5F5" w:color="auto" w:val="clear"/>
+            <w:tcMar>
+              <w:top w:type="dxa" w:w="40"/>
+              <w:left w:type="dxa" w:w="80"/>
+              <w:bottom w:type="dxa" w:w="40"/>
+              <w:right w:type="dxa" w:w="80"/>
+            </w:tcMar>
+            <w:vAlign w:val="center"/>
+          </w:tcPr>
+          <w:p>
+            <w:pPr>
+              <w:jc w:val="center"/>
+            </w:pPr>
+            <w:r>
+              <w:rPr>
+                <w:rFonts w:ascii="Arial" w:cs="Arial" w:eastAsia="Arial" w:hAnsi="Arial"/>
+                <w:color w:val="6B6B6B"/>
+                <w:sz w:val="15"/>
+                <w:szCs w:val="15"/>
+              </w:rPr>
+              <w:t xml:space="preserve">3</w:t>
+            </w:r>
+          </w:p>
+        </w:tc>
+        <w:tc>
+          <w:tcPr>
+            <w:tcW w:type="dxa" w:w="420"/>
+            <w:tcBorders>
+              <w:top w:val="none" w:color="FFFFFF" w:sz="0"/>
+              <w:left w:val="none" w:color="FFFFFF" w:sz="0"/>
+              <w:bottom w:val="none" w:color="FFFFFF" w:sz="0"/>
+              <w:right w:val="none" w:color="FFFFFF" w:sz="0"/>
+            </w:tcBorders>
+            <w:shd w:fill="FFF5F5" w:color="auto" w:val="clear"/>
+            <w:tcMar>
+              <w:top w:type="dxa" w:w="40"/>
+              <w:left w:type="dxa" w:w="80"/>
+              <w:bottom w:type="dxa" w:w="40"/>
+              <w:right w:type="dxa" w:w="80"/>
+            </w:tcMar>
+            <w:vAlign w:val="center"/>
+          </w:tcPr>
+          <w:p>
+            <w:pPr>
+              <w:jc w:val="center"/>
+            </w:pPr>
+            <w:r>
+              <w:rPr>
+                <w:rFonts w:ascii="Arial" w:cs="Arial" w:eastAsia="Arial" w:hAnsi="Arial"/>
+                <w:color w:val="6B6B6B"/>
+                <w:sz w:val="15"/>
+                <w:szCs w:val="15"/>
+              </w:rPr>
+              <w:t xml:space="preserve">10s hold</w:t>
+            </w:r>
+          </w:p>
+        </w:tc>
+        <w:tc>
+          <w:tcPr>
+            <w:tcW w:type="dxa" w:w="680"/>
+            <w:tcBorders>
+              <w:top w:val="none" w:color="FFFFFF" w:sz="0"/>
+              <w:left w:val="none" w:color="FFFFFF" w:sz="0"/>
+              <w:bottom w:val="none" w:color="FFFFFF" w:sz="0"/>
+              <w:right w:val="none" w:color="FFFFFF" w:sz="0"/>
+            </w:tcBorders>
+            <w:shd w:fill="FFF5F5" w:color="auto" w:val="clear"/>
+            <w:tcMar>
+              <w:top w:type="dxa" w:w="40"/>
+              <w:left w:type="dxa" w:w="80"/>
+              <w:bottom w:type="dxa" w:w="40"/>
+              <w:right w:type="dxa" w:w="80"/>
+            </w:tcMar>
+            <w:vAlign w:val="center"/>
+          </w:tcPr>
+          <w:p>
+            <w:pPr>
+              <w:jc w:val="center"/>
+            </w:pPr>
+            <w:r>
+              <w:rPr>
+                <w:rFonts w:ascii="Arial" w:cs="Arial" w:eastAsia="Arial" w:hAnsi="Arial"/>
+                <w:color w:val="6B6B6B"/>
+                <w:sz w:val="15"/>
+                <w:szCs w:val="15"/>
+              </w:rPr>
+              <w:t xml:space="preserve">Ball or rolled towel — max squeeze</w:t>
+            </w:r>
+          </w:p>
+        </w:tc>
+        <w:tc>
+          <w:tcPr>
+            <w:tcW w:type="dxa" w:w="540"/>
+            <w:tcBorders>
+              <w:top w:val="none" w:color="FFFFFF" w:sz="0"/>
+              <w:left w:val="none" w:color="FFFFFF" w:sz="0"/>
+              <w:bottom w:val="none" w:color="FFFFFF" w:sz="0"/>
+              <w:right w:val="none" w:color="FFFFFF" w:sz="0"/>
+            </w:tcBorders>
+            <w:shd w:fill="FFF5F5" w:color="auto" w:val="clear"/>
+            <w:tcMar>
+              <w:top w:type="dxa" w:w="40"/>
+              <w:left w:type="dxa" w:w="80"/>
+              <w:bottom w:type="dxa" w:w="40"/>
+              <w:right w:type="dxa" w:w="80"/>
+            </w:tcMar>
+            <w:vAlign w:val="center"/>
+          </w:tcPr>
+          <w:p>
+            <w:pPr>
+              <w:jc w:val="center"/>
+            </w:pPr>
+            <w:r>
+              <w:rPr>
+                <w:rFonts w:ascii="Arial" w:cs="Arial" w:eastAsia="Arial" w:hAnsi="Arial"/>
+                <w:color w:val="6B6B6B"/>
+                <w:sz w:val="15"/>
+                <w:szCs w:val="15"/>
+              </w:rPr>
+              <w:t xml:space="preserve">Hold</w:t>
+            </w:r>
+          </w:p>
+        </w:tc>
+        <w:tc>
+          <w:tcPr>
+            <w:tcW w:type="dxa" w:w="440"/>
+            <w:tcBorders>
+              <w:top w:val="none" w:color="FFFFFF" w:sz="0"/>
+              <w:left w:val="none" w:color="FFFFFF" w:sz="0"/>
+              <w:bottom w:val="none" w:color="FFFFFF" w:sz="0"/>
+              <w:right w:val="none" w:color="FFFFFF" w:sz="0"/>
+            </w:tcBorders>
+            <w:shd w:fill="FFF5F5" w:color="auto" w:val="clear"/>
+            <w:tcMar>
+              <w:top w:type="dxa" w:w="40"/>
+              <w:left w:type="dxa" w:w="80"/>
+              <w:bottom w:type="dxa" w:w="40"/>
+              <w:right w:type="dxa" w:w="80"/>
+            </w:tcMar>
+            <w:vAlign w:val="center"/>
+          </w:tcPr>
+          <w:p>
+            <w:pPr>
+              <w:jc w:val="center"/>
+            </w:pPr>
+            <w:r>
+              <w:rPr>
+                <w:rFonts w:ascii="Arial" w:cs="Arial" w:eastAsia="Arial" w:hAnsi="Arial"/>
+                <w:color w:val="6B6B6B"/>
+                <w:sz w:val="15"/>
+                <w:szCs w:val="15"/>
+              </w:rPr>
+              <w:t xml:space="preserve">30s</w:t>
+            </w:r>
+          </w:p>
+        </w:tc>
+        <w:tc>
+          <w:tcPr>
+            <w:tcW w:type="dxa" w:w="5580"/>
+            <w:tcBorders>
+              <w:top w:val="none" w:color="FFFFFF" w:sz="0"/>
+              <w:left w:val="none" w:color="FFFFFF" w:sz="0"/>
+              <w:bottom w:val="none" w:color="FFFFFF" w:sz="0"/>
+              <w:right w:val="none" w:color="FFFFFF" w:sz="0"/>
+            </w:tcBorders>
+            <w:shd w:fill="FFF5F5" w:color="auto" w:val="clear"/>
+            <w:tcMar>
+              <w:top w:type="dxa" w:w="40"/>
+              <w:left w:type="dxa" w:w="80"/>
+              <w:bottom w:type="dxa" w:w="40"/>
+              <w:right w:type="dxa" w:w="80"/>
+            </w:tcMar>
+            <w:vAlign w:val="center"/>
+          </w:tcPr>
+          <w:p>
+            <w:r>
+              <w:rPr>
+                <w:rFonts w:ascii="Arial" w:cs="Arial" w:eastAsia="Arial" w:hAnsi="Arial"/>
+                <w:color w:val="6B6B6B"/>
+                <w:sz w:val="17"/>
+                <w:szCs w:val="17"/>
+              </w:rPr>
+              <w:t xml:space="preserve">Right hand only. Squeeze hard for 10 seconds, full rest between — wake the pathway, not fatigue it.</w:t>
+            </w:r>
+          </w:p>
+        </w:tc>
+      </w:tr>
+      <w:tr>
+        <w:tc>
+          <w:tcPr>
+            <w:tcW w:type="dxa" w:w="2400"/>
+            <w:tcBorders>
+              <w:top w:val="none" w:color="FFFFFF" w:sz="0"/>
+              <w:left w:val="none" w:color="FFFFFF" w:sz="0"/>
+              <w:bottom w:val="none" w:color="FFFFFF" w:sz="0"/>
+              <w:right w:val="none" w:color="FFFFFF" w:sz="0"/>
+            </w:tcBorders>
+            <w:shd w:fill="FFFFFF" w:color="auto" w:val="clear"/>
+            <w:tcMar>
+              <w:top w:type="dxa" w:w="40"/>
+              <w:left w:type="dxa" w:w="80"/>
+              <w:bottom w:type="dxa" w:w="40"/>
+              <w:right w:type="dxa" w:w="80"/>
+            </w:tcMar>
+            <w:vAlign w:val="center"/>
+          </w:tcPr>
+          <w:p>
+            <w:r>
+              <w:rPr>
+                <w:rFonts w:ascii="Arial" w:cs="Arial" w:eastAsia="Arial" w:hAnsi="Arial"/>
+                <w:b/>
+                <w:bCs/>
+                <w:color w:val="2C2C2C"/>
+                <w:sz w:val="18"/>
+                <w:szCs w:val="18"/>
+              </w:rPr>
+              <w:t xml:space="preserve">KB Dead-Hinge (Light Ramp)</w:t>
+            </w:r>
+          </w:p>
+        </w:tc>
+        <w:tc>
+          <w:tcPr>
+            <w:tcW w:type="dxa" w:w="380"/>
+            <w:tcBorders>
+              <w:top w:val="none" w:color="FFFFFF" w:sz="0"/>
+              <w:left w:val="none" w:color="FFFFFF" w:sz="0"/>
+              <w:bottom w:val="none" w:color="FFFFFF" w:sz="0"/>
+              <w:right w:val="none" w:color="FFFFFF" w:sz="0"/>
+            </w:tcBorders>
+            <w:shd w:fill="FFFFFF" w:color="auto" w:val="clear"/>
+            <w:tcMar>
+              <w:top w:type="dxa" w:w="40"/>
+              <w:left w:type="dxa" w:w="80"/>
+              <w:bottom w:type="dxa" w:w="40"/>
+              <w:right w:type="dxa" w:w="80"/>
+            </w:tcMar>
+            <w:vAlign w:val="center"/>
+          </w:tcPr>
+          <w:p>
+            <w:pPr>
+              <w:jc w:val="center"/>
+            </w:pPr>
+            <w:r>
+              <w:rPr>
+                <w:rFonts w:ascii="Arial" w:cs="Arial" w:eastAsia="Arial" w:hAnsi="Arial"/>
+                <w:color w:val="6B6B6B"/>
+                <w:sz w:val="15"/>
+                <w:szCs w:val="15"/>
+              </w:rPr>
+              <w:t xml:space="preserve">2</w:t>
+            </w:r>
+          </w:p>
+        </w:tc>
+        <w:tc>
+          <w:tcPr>
+            <w:tcW w:type="dxa" w:w="420"/>
+            <w:tcBorders>
+              <w:top w:val="none" w:color="FFFFFF" w:sz="0"/>
+              <w:left w:val="none" w:color="FFFFFF" w:sz="0"/>
+              <w:bottom w:val="none" w:color="FFFFFF" w:sz="0"/>
+              <w:right w:val="none" w:color="FFFFFF" w:sz="0"/>
+            </w:tcBorders>
+            <w:shd w:fill="FFFFFF" w:color="auto" w:val="clear"/>
+            <w:tcMar>
+              <w:top w:type="dxa" w:w="40"/>
+              <w:left w:type="dxa" w:w="80"/>
+              <w:bottom w:type="dxa" w:w="40"/>
+              <w:right w:type="dxa" w:w="80"/>
+            </w:tcMar>
+            <w:vAlign w:val="center"/>
+          </w:tcPr>
+          <w:p>
+            <w:pPr>
+              <w:jc w:val="center"/>
+            </w:pPr>
+            <w:r>
+              <w:rPr>
+                <w:rFonts w:ascii="Arial" w:cs="Arial" w:eastAsia="Arial" w:hAnsi="Arial"/>
+                <w:color w:val="6B6B6B"/>
+                <w:sz w:val="15"/>
+                <w:szCs w:val="15"/>
+              </w:rPr>
+              <w:t xml:space="preserve">10</w:t>
+            </w:r>
+          </w:p>
+        </w:tc>
+        <w:tc>
+          <w:tcPr>
+            <w:tcW w:type="dxa" w:w="680"/>
+            <w:tcBorders>
+              <w:top w:val="none" w:color="FFFFFF" w:sz="0"/>
+              <w:left w:val="none" w:color="FFFFFF" w:sz="0"/>
+              <w:bottom w:val="none" w:color="FFFFFF" w:sz="0"/>
+              <w:right w:val="none" w:color="FFFFFF" w:sz="0"/>
+            </w:tcBorders>
+            <w:shd w:fill="FFFFFF" w:color="auto" w:val="clear"/>
+            <w:tcMar>
+              <w:top w:type="dxa" w:w="40"/>
+              <w:left w:type="dxa" w:w="80"/>
+              <w:bottom w:type="dxa" w:w="40"/>
+              <w:right w:type="dxa" w:w="80"/>
+            </w:tcMar>
+            <w:vAlign w:val="center"/>
+          </w:tcPr>
+          <w:p>
+            <w:pPr>
+              <w:jc w:val="center"/>
+            </w:pPr>
+            <w:r>
+              <w:rPr>
+                <w:rFonts w:ascii="Arial" w:cs="Arial" w:eastAsia="Arial" w:hAnsi="Arial"/>
+                <w:color w:val="6B6B6B"/>
+                <w:sz w:val="15"/>
+                <w:szCs w:val="15"/>
+              </w:rPr>
+              <w:t xml:space="preserve">Light KB</w:t>
+            </w:r>
+          </w:p>
+        </w:tc>
+        <w:tc>
+          <w:tcPr>
+            <w:tcW w:type="dxa" w:w="540"/>
+            <w:tcBorders>
+              <w:top w:val="none" w:color="FFFFFF" w:sz="0"/>
+              <w:left w:val="none" w:color="FFFFFF" w:sz="0"/>
+              <w:bottom w:val="none" w:color="FFFFFF" w:sz="0"/>
+              <w:right w:val="none" w:color="FFFFFF" w:sz="0"/>
+            </w:tcBorders>
+            <w:shd w:fill="FFFFFF" w:color="auto" w:val="clear"/>
+            <w:tcMar>
+              <w:top w:type="dxa" w:w="40"/>
+              <w:left w:type="dxa" w:w="80"/>
+              <w:bottom w:type="dxa" w:w="40"/>
+              <w:right w:type="dxa" w:w="80"/>
+            </w:tcMar>
+            <w:vAlign w:val="center"/>
+          </w:tcPr>
+          <w:p>
+            <w:pPr>
+              <w:jc w:val="center"/>
+            </w:pPr>
+            <w:r>
+              <w:rPr>
+                <w:rFonts w:ascii="Arial" w:cs="Arial" w:eastAsia="Arial" w:hAnsi="Arial"/>
+                <w:color w:val="6B6B6B"/>
+                <w:sz w:val="15"/>
+                <w:szCs w:val="15"/>
+              </w:rPr>
+              <w:t xml:space="preserve">2-1-1</w:t>
+            </w:r>
+          </w:p>
+        </w:tc>
+        <w:tc>
+          <w:tcPr>
+            <w:tcW w:type="dxa" w:w="440"/>
+            <w:tcBorders>
+              <w:top w:val="none" w:color="FFFFFF" w:sz="0"/>
+              <w:left w:val="none" w:color="FFFFFF" w:sz="0"/>
+              <w:bottom w:val="none" w:color="FFFFFF" w:sz="0"/>
+              <w:right w:val="none" w:color="FFFFFF" w:sz="0"/>
+            </w:tcBorders>
+            <w:shd w:fill="FFFFFF" w:color="auto" w:val="clear"/>
+            <w:tcMar>
+              <w:top w:type="dxa" w:w="40"/>
+              <w:left w:type="dxa" w:w="80"/>
+              <w:bottom w:type="dxa" w:w="40"/>
+              <w:right w:type="dxa" w:w="80"/>
+            </w:tcMar>
+            <w:vAlign w:val="center"/>
+          </w:tcPr>
+          <w:p>
+            <w:pPr>
+              <w:jc w:val="center"/>
+            </w:pPr>
+            <w:r>
+              <w:rPr>
+                <w:rFonts w:ascii="Arial" w:cs="Arial" w:eastAsia="Arial" w:hAnsi="Arial"/>
+                <w:color w:val="6B6B6B"/>
+                <w:sz w:val="15"/>
+                <w:szCs w:val="15"/>
+              </w:rPr>
+              <w:t xml:space="preserve">30s</w:t>
+            </w:r>
+          </w:p>
+        </w:tc>
+        <w:tc>
+          <w:tcPr>
+            <w:tcW w:type="dxa" w:w="5580"/>
+            <w:tcBorders>
+              <w:top w:val="none" w:color="FFFFFF" w:sz="0"/>
+              <w:left w:val="none" w:color="FFFFFF" w:sz="0"/>
+              <w:bottom w:val="none" w:color="FFFFFF" w:sz="0"/>
+              <w:right w:val="none" w:color="FFFFFF" w:sz="0"/>
+            </w:tcBorders>
+            <w:shd w:fill="FFFFFF" w:color="auto" w:val="clear"/>
+            <w:tcMar>
+              <w:top w:type="dxa" w:w="40"/>
+              <w:left w:type="dxa" w:w="80"/>
+              <w:bottom w:type="dxa" w:w="40"/>
+              <w:right w:type="dxa" w:w="80"/>
+            </w:tcMar>
+            <w:vAlign w:val="center"/>
+          </w:tcPr>
+          <w:p>
+            <w:r>
+              <w:rPr>
+                <w:rFonts w:ascii="Arial" w:cs="Arial" w:eastAsia="Arial" w:hAnsi="Arial"/>
+                <w:color w:val="6B6B6B"/>
+                <w:sz w:val="17"/>
+                <w:szCs w:val="17"/>
+              </w:rPr>
+              <w:t xml:space="preserve">Crisp hinge rehearsal, KB stays close — prime the swing pattern, no grind.</w:t>
+            </w:r>
+            <w:r>
+              <w:rPr>
+                <w:rFonts w:ascii="Arial" w:cs="Arial" w:eastAsia="Arial" w:hAnsi="Arial"/>
+                <w:i/>
+                <w:iCs/>
+                <w:color w:val="00695C"/>
+                <w:sz w:val="14"/>
+                <w:szCs w:val="14"/>
+              </w:rPr>
+              <w:t xml:space="preserve">  3+ RIR — technique/submaximal</w:t>
+            </w:r>
+          </w:p>
+        </w:tc>
+      </w:tr>
+      <w:tr>
+        <w:tc>
+          <w:tcPr>
+            <w:tcW w:type="dxa" w:w="2400"/>
+            <w:tcBorders>
+              <w:top w:val="none" w:color="FFFFFF" w:sz="0"/>
+              <w:left w:val="none" w:color="FFFFFF" w:sz="0"/>
+              <w:bottom w:val="none" w:color="FFFFFF" w:sz="0"/>
+              <w:right w:val="none" w:color="FFFFFF" w:sz="0"/>
+            </w:tcBorders>
+            <w:shd w:fill="FFF5F5" w:color="auto" w:val="clear"/>
+            <w:tcMar>
+              <w:top w:type="dxa" w:w="40"/>
+              <w:left w:type="dxa" w:w="80"/>
+              <w:bottom w:type="dxa" w:w="40"/>
+              <w:right w:type="dxa" w:w="80"/>
+            </w:tcMar>
+            <w:vAlign w:val="center"/>
+          </w:tcPr>
+          <w:p>
+            <w:r>
+              <w:rPr>
+                <w:rFonts w:ascii="Arial" w:cs="Arial" w:eastAsia="Arial" w:hAnsi="Arial"/>
+                <w:b/>
+                <w:bCs/>
+                <w:color w:val="2C2C2C"/>
+                <w:sz w:val="18"/>
+                <w:szCs w:val="18"/>
+              </w:rPr>
+              <w:t xml:space="preserve">Single-Leg Glute Bridge (Left Side)</w:t>
+            </w:r>
+          </w:p>
+        </w:tc>
+        <w:tc>
+          <w:tcPr>
+            <w:tcW w:type="dxa" w:w="380"/>
+            <w:tcBorders>
+              <w:top w:val="none" w:color="FFFFFF" w:sz="0"/>
+              <w:left w:val="none" w:color="FFFFFF" w:sz="0"/>
+              <w:bottom w:val="none" w:color="FFFFFF" w:sz="0"/>
+              <w:right w:val="none" w:color="FFFFFF" w:sz="0"/>
+            </w:tcBorders>
+            <w:shd w:fill="FFF5F5" w:color="auto" w:val="clear"/>
+            <w:tcMar>
+              <w:top w:type="dxa" w:w="40"/>
+              <w:left w:type="dxa" w:w="80"/>
+              <w:bottom w:type="dxa" w:w="40"/>
+              <w:right w:type="dxa" w:w="80"/>
+            </w:tcMar>
+            <w:vAlign w:val="center"/>
+          </w:tcPr>
+          <w:p>
+            <w:pPr>
+              <w:jc w:val="center"/>
+            </w:pPr>
+            <w:r>
+              <w:rPr>
+                <w:rFonts w:ascii="Arial" w:cs="Arial" w:eastAsia="Arial" w:hAnsi="Arial"/>
+                <w:color w:val="6B6B6B"/>
+                <w:sz w:val="15"/>
+                <w:szCs w:val="15"/>
+              </w:rPr>
+              <w:t xml:space="preserve">2</w:t>
+            </w:r>
+          </w:p>
+        </w:tc>
+        <w:tc>
+          <w:tcPr>
+            <w:tcW w:type="dxa" w:w="420"/>
+            <w:tcBorders>
+              <w:top w:val="none" w:color="FFFFFF" w:sz="0"/>
+              <w:left w:val="none" w:color="FFFFFF" w:sz="0"/>
+              <w:bottom w:val="none" w:color="FFFFFF" w:sz="0"/>
+              <w:right w:val="none" w:color="FFFFFF" w:sz="0"/>
+            </w:tcBorders>
+            <w:shd w:fill="FFF5F5" w:color="auto" w:val="clear"/>
+            <w:tcMar>
+              <w:top w:type="dxa" w:w="40"/>
+              <w:left w:type="dxa" w:w="80"/>
+              <w:bottom w:type="dxa" w:w="40"/>
+              <w:right w:type="dxa" w:w="80"/>
+            </w:tcMar>
+            <w:vAlign w:val="center"/>
+          </w:tcPr>
+          <w:p>
+            <w:pPr>
+              <w:jc w:val="center"/>
+            </w:pPr>
+            <w:r>
+              <w:rPr>
+                <w:rFonts w:ascii="Arial" w:cs="Arial" w:eastAsia="Arial" w:hAnsi="Arial"/>
+                <w:color w:val="6B6B6B"/>
+                <w:sz w:val="15"/>
+                <w:szCs w:val="15"/>
+              </w:rPr>
+              <w:t xml:space="preserve">12</w:t>
+            </w:r>
+          </w:p>
+        </w:tc>
+        <w:tc>
+          <w:tcPr>
+            <w:tcW w:type="dxa" w:w="680"/>
+            <w:tcBorders>
+              <w:top w:val="none" w:color="FFFFFF" w:sz="0"/>
+              <w:left w:val="none" w:color="FFFFFF" w:sz="0"/>
+              <w:bottom w:val="none" w:color="FFFFFF" w:sz="0"/>
+              <w:right w:val="none" w:color="FFFFFF" w:sz="0"/>
+            </w:tcBorders>
+            <w:shd w:fill="FFF5F5" w:color="auto" w:val="clear"/>
+            <w:tcMar>
+              <w:top w:type="dxa" w:w="40"/>
+              <w:left w:type="dxa" w:w="80"/>
+              <w:bottom w:type="dxa" w:w="40"/>
+              <w:right w:type="dxa" w:w="80"/>
+            </w:tcMar>
+            <w:vAlign w:val="center"/>
+          </w:tcPr>
+          <w:p>
+            <w:pPr>
+              <w:jc w:val="center"/>
+            </w:pPr>
+            <w:r>
+              <w:rPr>
+                <w:rFonts w:ascii="Arial" w:cs="Arial" w:eastAsia="Arial" w:hAnsi="Arial"/>
+                <w:color w:val="6B6B6B"/>
+                <w:sz w:val="15"/>
+                <w:szCs w:val="15"/>
+              </w:rPr>
+              <w:t xml:space="preserve">Bodyweight</w:t>
+            </w:r>
+          </w:p>
+        </w:tc>
+        <w:tc>
+          <w:tcPr>
+            <w:tcW w:type="dxa" w:w="540"/>
+            <w:tcBorders>
+              <w:top w:val="none" w:color="FFFFFF" w:sz="0"/>
+              <w:left w:val="none" w:color="FFFFFF" w:sz="0"/>
+              <w:bottom w:val="none" w:color="FFFFFF" w:sz="0"/>
+              <w:right w:val="none" w:color="FFFFFF" w:sz="0"/>
+            </w:tcBorders>
+            <w:shd w:fill="FFF5F5" w:color="auto" w:val="clear"/>
+            <w:tcMar>
+              <w:top w:type="dxa" w:w="40"/>
+              <w:left w:type="dxa" w:w="80"/>
+              <w:bottom w:type="dxa" w:w="40"/>
+              <w:right w:type="dxa" w:w="80"/>
+            </w:tcMar>
+            <w:vAlign w:val="center"/>
+          </w:tcPr>
+          <w:p>
+            <w:pPr>
+              <w:jc w:val="center"/>
+            </w:pPr>
+            <w:r>
+              <w:rPr>
+                <w:rFonts w:ascii="Arial" w:cs="Arial" w:eastAsia="Arial" w:hAnsi="Arial"/>
+                <w:color w:val="6B6B6B"/>
+                <w:sz w:val="15"/>
+                <w:szCs w:val="15"/>
+              </w:rPr>
+              <w:t xml:space="preserve">2-1-1</w:t>
+            </w:r>
+          </w:p>
+        </w:tc>
+        <w:tc>
+          <w:tcPr>
+            <w:tcW w:type="dxa" w:w="440"/>
+            <w:tcBorders>
+              <w:top w:val="none" w:color="FFFFFF" w:sz="0"/>
+              <w:left w:val="none" w:color="FFFFFF" w:sz="0"/>
+              <w:bottom w:val="none" w:color="FFFFFF" w:sz="0"/>
+              <w:right w:val="none" w:color="FFFFFF" w:sz="0"/>
+            </w:tcBorders>
+            <w:shd w:fill="FFF5F5" w:color="auto" w:val="clear"/>
+            <w:tcMar>
+              <w:top w:type="dxa" w:w="40"/>
+              <w:left w:type="dxa" w:w="80"/>
+              <w:bottom w:type="dxa" w:w="40"/>
+              <w:right w:type="dxa" w:w="80"/>
+            </w:tcMar>
+            <w:vAlign w:val="center"/>
+          </w:tcPr>
+          <w:p>
+            <w:pPr>
+              <w:jc w:val="center"/>
+            </w:pPr>
+            <w:r>
+              <w:rPr>
+                <w:rFonts w:ascii="Arial" w:cs="Arial" w:eastAsia="Arial" w:hAnsi="Arial"/>
+                <w:color w:val="6B6B6B"/>
+                <w:sz w:val="15"/>
+                <w:szCs w:val="15"/>
+              </w:rPr>
+              <w:t xml:space="preserve">30s</w:t>
+            </w:r>
+          </w:p>
+        </w:tc>
+        <w:tc>
+          <w:tcPr>
+            <w:tcW w:type="dxa" w:w="5580"/>
+            <w:tcBorders>
+              <w:top w:val="none" w:color="FFFFFF" w:sz="0"/>
+              <w:left w:val="none" w:color="FFFFFF" w:sz="0"/>
+              <w:bottom w:val="none" w:color="FFFFFF" w:sz="0"/>
+              <w:right w:val="none" w:color="FFFFFF" w:sz="0"/>
+            </w:tcBorders>
+            <w:shd w:fill="FFF5F5" w:color="auto" w:val="clear"/>
+            <w:tcMar>
+              <w:top w:type="dxa" w:w="40"/>
+              <w:left w:type="dxa" w:w="80"/>
+              <w:bottom w:type="dxa" w:w="40"/>
+              <w:right w:type="dxa" w:w="80"/>
+            </w:tcMar>
+            <w:vAlign w:val="center"/>
+          </w:tcPr>
+          <w:p>
+            <w:r>
+              <w:rPr>
+                <w:rFonts w:ascii="Arial" w:cs="Arial" w:eastAsia="Arial" w:hAnsi="Arial"/>
+                <w:color w:val="6B6B6B"/>
+                <w:sz w:val="17"/>
+                <w:szCs w:val="17"/>
+              </w:rPr>
+              <w:t xml:space="preserve">Left glute drives, hips level — the priority side per the force assessment.</w:t>
+            </w:r>
+          </w:p>
+        </w:tc>
+      </w:tr>
+    </w:tbl>
+    <w:p>
+      <w:pPr>
+        <w:spacing w:after="100"/>
+      </w:pPr>
+    </w:p>
+    <w:p>
+      <w:pPr>
+        <w:spacing w:after="60" w:before="120"/>
+      </w:pPr>
+      <w:r>
+        <w:rPr>
+          <w:rFonts w:ascii="Arial" w:cs="Arial" w:eastAsia="Arial" w:hAnsi="Arial"/>
+          <w:b/>
+          <w:bCs/>
+          <w:color w:val="E53935"/>
+          <w:sz w:val="17"/>
+          <w:szCs w:val="17"/>
+        </w:rPr>
+        <w:t xml:space="preserve">B — PRIMARY POWER — KB BLOCK</w:t>
       </w:r>
     </w:p>
     <w:p>
@@ -10419,7 +13694,7 @@
           <w:sz w:val="17"/>
           <w:szCs w:val="17"/>
         </w:rPr>
-        <w:t xml:space="preserve">Use a KB you can swing explosively — not so heavy that the hinge pattern breaks. Swings are a hip hinge power movement, not a squat. Hike the KB back between the legs, then snap the hips forward. Arms are passive — the hip drives everything.</w:t>
+        <w:t xml:space="preserve">The day's primary work runs first while the nervous system is freshest — this is a power day, and power leads it. Use a KB you can swing explosively — not so heavy that the hinge pattern breaks. Swings are a hip hinge power movement, not a squat. Hike the KB back between the legs, then snap the hips forward. Arms are passive — the hip drives everything. If the day calls for a variation, rotate between: a dead-stop swing (reset the KB on the floor each rep — sharper technique focus) or a lighter-bell speed swing. The two-hand swing stays the movement we track.</w:t>
       </w:r>
     </w:p>
     <w:tbl>
@@ -11625,7 +14900,7 @@
           <w:sz w:val="17"/>
           <w:szCs w:val="17"/>
         </w:rPr>
-        <w:t xml:space="preserve">B — MEDICINE BALL POWER BLOCK</w:t>
+        <w:t xml:space="preserve">C — ACCESSORY POWER — MEDICINE BALL BLOCK</w:t>
       </w:r>
     </w:p>
     <w:p>
@@ -12856,7 +16131,7 @@
           <w:sz w:val="17"/>
           <w:szCs w:val="17"/>
         </w:rPr>
-        <w:t xml:space="preserve">C — COMPOUND STRENGTH CLUSTERS</w:t>
+        <w:t xml:space="preserve">D — FULL-BODY INTEGRATION — COMPOUND STRENGTH CLUSTERS</w:t>
       </w:r>
     </w:p>
     <w:p>
@@ -12881,7 +16156,7 @@
           <w:sz w:val="17"/>
           <w:szCs w:val="17"/>
         </w:rPr>
-        <w:t xml:space="preserve">A ‘cluster’ is two exercises performed back-to-back with 15 seconds rest between them, then full rest after the pair. C1+C2 together, 15s, then 90s rest. This allows heavier loads with better quality reps than straight supersets.</w:t>
+        <w:t xml:space="preserve">The session's compound strength work and its integrated close in one: each cluster pair is a full-body complex — a hinge flowing into a press, a squat flowing into a press — pulling the day's patterns together under fatigue. A ‘cluster’ is two exercises performed back-to-back with 15 seconds rest between them, then full rest after the pair. C1+C2 together, 15s, then 90s rest. This allows heavier loads with better quality reps than straight supersets. If a variation suits the day, a B-stance DB deadlift can stand in for C1 on a day the low back is tired, and a goblet squat for D1 — the listed cluster lifts stay the loads we track.</w:t>
       </w:r>
     </w:p>
     <w:tbl>
@@ -14087,7 +17362,7 @@
           <w:sz w:val="17"/>
           <w:szCs w:val="17"/>
         </w:rPr>
-        <w:t xml:space="preserve">D — CONDITIONING FINISHER + CORE</w:t>
+        <w:t xml:space="preserve">E — CONDITIONING FINISHER + CORE</w:t>
       </w:r>
     </w:p>
     <w:p>
@@ -15996,7 +19271,7 @@
           <w:sz w:val="17"/>
           <w:szCs w:val="17"/>
         </w:rPr>
-        <w:t xml:space="preserve">Virtual Training Best Practices: record each session or keep camera live; send clips of primary lifts (deadlift, OHP, Bulgarian split squat) after each session for async coach review; log load, reps, and how each set felt (easy / hard / form broke) every session. Strength &amp; Muscle Protocol: primary lifts run 5–6 reps heavy and close to failure on the final set (1–2 RIR) while accessory work runs 8–12 reps moderate (hypertrophy-focused) — both strength and hypertrophy trained simultaneously. Week 4 targets: Hex Deadlift 105 lbs ×5, Bulgarian Split Squat 25 lbs/hand ×8, Single-Leg RDL 27.5 lbs/hand ×8, Bench/OHP 20 lbs/hand ×10, DB Single-Arm Row 37.5 lbs, Farmer Carry 55 lbs/hand, Elbow Plank 1:15, Push-Up 10–12 full reps. Day 3 test week: compare max AMRAP rounds vs Week 1.</w:t>
+        <w:t xml:space="preserve">Virtual Training Best Practices: record each session or keep camera live; send clips of primary lifts (deadlift, OHP, Bulgarian split squat) after each session for async coach review; log load, reps, and how each set felt (easy / hard / form broke) every session. Strength &amp; Muscle Protocol: primary lifts run 5–6 reps heavy at 2 reps in reserve, while accessory work runs 8–12 reps moderate (hypertrophy-focused, up to 1 rep in reserve) — both strength and hypertrophy trained simultaneously. Week 4 targets: Hex Deadlift 105 lbs ×5, Bulgarian Split Squat 25 lbs/hand ×8, Single-Leg RDL 27.5 lbs/hand ×8, Bench/OHP 20 lbs/hand ×10, DB Single-Arm Row 37.5 lbs, Farmer Carry 55 lbs/hand, Elbow Plank 1:15, Push-Up 10–12 full reps. Day 3 test week: compare max AMRAP rounds vs Week 1. Week 4 closes with the strength check; Week 5 that follows is the planned deload week — same exercises, reduced sets, loads held (see the deload note above) — before Weeks 6-8 rebuild.</w:t>
       </w:r>
     </w:p>
     <w:p>
@@ -16021,7 +19296,7 @@
           <w:sz w:val="17"/>
           <w:szCs w:val="17"/>
         </w:rPr>
-        <w:t xml:space="preserve">8-week targets: Hex Deadlift 140–150 lbs ×5, Bench Press 27.5–30 lbs/hand ×8, Overhead Press 27.5 lbs/hand ×8, DB Single-Arm Row 50+ lbs ×8, Farmer Carry 70 lbs/hand, Bulgarian Split Squat 35 lbs/hand ×8, Elbow Plank 1:30+, Push-Up 15+ full reps unassisted. Re-test the Week 1 force assessment protocol (grip squeeze, floor pull, hip extension) around this window to confirm whether the left-grip/right-hip asymmetry pattern is closing — current gaps: grip 29.5% left, floor pull 23.8% left, hip extension (projected) 43.9% right.</w:t>
+        <w:t xml:space="preserve">8-week targets (reached through the Wk4 check, the planned Week 5 deload, and the Weeks 6-8 rebuild): Hex Deadlift 140–150 lbs ×5, Bench Press 27.5–30 lbs/hand ×8, Overhead Press 27.5 lbs/hand ×8, DB Single-Arm Row 50+ lbs ×8, Farmer Carry 70 lbs/hand, Bulgarian Split Squat 35 lbs/hand ×8, Elbow Plank 1:30+, Push-Up 15+ full reps unassisted. Re-test the Week 1 force assessment protocol (grip squeeze, floor pull, hip extension) around this window to confirm whether the left-grip/right-hip asymmetry pattern is closing — current gaps: grip 29.5% left, floor pull 23.8% left, hip extension (projected) 43.9% right.</w:t>
       </w:r>
     </w:p>
     <w:p>

</xml_diff>